<commit_message>
Classify Tier 1 cases by type; show full Tier 1 load
Every Tier 1 action is a case, so Tier 1 load and productivity are shown
in full. Add case types (customer-reported, follow-up, proactive
monitoring, remote install) so follow-ups do not count as repeat issues
and planned work does not inflate quality or hospital load metrics.
Mockup: Tier 1 work by case type panel, rounder axis ticks.

Co-Authored-By: Claude Opus 5.5 <noreply@anthropic.com>
Claude-Session: https://claude.ai/code/session_01YcEMp91cmPuH2YbvGBFx73
</commit_message>
<xml_diff>
--- a/docs/MVP-Support-Control-Tower.docx
+++ b/docs/MVP-Support-Control-Tower.docx
@@ -1219,7 +1219,16 @@
           <w:rFonts w:ascii="Arial" w:cs="Arial" w:eastAsia="Arial" w:hAnsi="Arial"/>
           <w:rtl/>
         </w:rPr>
-        <w:t xml:space="preserve"> כ-50 תומכים בארה"ב, 24/7. מספר טלפון אחד לכל העולם, תמיכה באנגלית. לקוחות פונים רק לטיר 1. מעבר לפניות נכנסות, טיר 1 עושה אבחון ראשוני וניסיון פתרון, מעקבים, ניטור יזום והתקנות מרחוק.</w:t>
+        <w:t xml:space="preserve"> כ-50 תומכים בארה"ב, 24/7. מספר טלפון אחד לכל העולם, תמיכה באנגלית. לקוחות פונים רק לטיר 1. מעבר לפניות נכנסות, טיר 1 עושה אבחון ראשוני וניסיון פתרון, מעקבים, ניטור יזום והתקנות מרחוק. </w:t>
+      </w:r>
+      <w:r>
+        <w:rPr>
+          <w:rFonts w:ascii="Arial" w:cs="Arial" w:eastAsia="Arial" w:hAnsi="Arial"/>
+          <w:b/>
+          <w:bCs/>
+          <w:rtl/>
+        </w:rPr>
+        <w:t xml:space="preserve">כל פעולה של טיר 1 היא קייס ומתועדת ב-Salesforce.</w:t>
       </w:r>
     </w:p>
     <w:p>
@@ -11680,7 +11689,27 @@
                 <w:szCs w:val="19"/>
                 <w:rtl/>
               </w:rPr>
-              <w:t xml:space="preserve">אחוז הקייסים שנסגרו בלי Request ובלי פתיחה מחדש תוך 14 יום</w:t>
+              <w:t xml:space="preserve">אחוז הקייסים </w:t>
+            </w:r>
+            <w:r>
+              <w:rPr>
+                <w:rFonts w:ascii="Arial" w:cs="Arial" w:eastAsia="Arial" w:hAnsi="Arial"/>
+                <w:b/>
+                <w:bCs/>
+                <w:sz w:val="19"/>
+                <w:szCs w:val="19"/>
+                <w:rtl/>
+              </w:rPr>
+              <w:t xml:space="preserve">מסוג תקלה</w:t>
+            </w:r>
+            <w:r>
+              <w:rPr>
+                <w:rFonts w:ascii="Arial" w:cs="Arial" w:eastAsia="Arial" w:hAnsi="Arial"/>
+                <w:sz w:val="19"/>
+                <w:szCs w:val="19"/>
+                <w:rtl/>
+              </w:rPr>
+              <w:t xml:space="preserve"> שנסגרו בלי Request ובלי פתיחה מחדש תוך 14 יום</w:t>
             </w:r>
           </w:p>
         </w:tc>
@@ -12239,7 +12268,27 @@
                 <w:szCs w:val="19"/>
                 <w:rtl/>
               </w:rPr>
-              <w:t xml:space="preserve">קייסים ב-90 יום, חלקי 100 Assets פעילים באותה גרסה. </w:t>
+              <w:t xml:space="preserve">קייסים </w:t>
+            </w:r>
+            <w:r>
+              <w:rPr>
+                <w:rFonts w:ascii="Arial" w:cs="Arial" w:eastAsia="Arial" w:hAnsi="Arial"/>
+                <w:b/>
+                <w:bCs/>
+                <w:sz w:val="19"/>
+                <w:szCs w:val="19"/>
+                <w:rtl/>
+              </w:rPr>
+              <w:t xml:space="preserve">מסוג תקלה</w:t>
+            </w:r>
+            <w:r>
+              <w:rPr>
+                <w:rFonts w:ascii="Arial" w:cs="Arial" w:eastAsia="Arial" w:hAnsi="Arial"/>
+                <w:sz w:val="19"/>
+                <w:szCs w:val="19"/>
+                <w:rtl/>
+              </w:rPr>
+              <w:t xml:space="preserve"> ב-90 יום, חלקי 100 Assets פעילים באותה גרסה. </w:t>
             </w:r>
             <w:r>
               <w:rPr>
@@ -12828,7 +12877,27 @@
                 <w:szCs w:val="19"/>
                 <w:rtl/>
               </w:rPr>
-              <w:t xml:space="preserve">אותו חשבון + אותו Asset + אותה תת-קטגוריה, תוך 30 יום מסגירת הקייס הקודם</w:t>
+              <w:t xml:space="preserve">קייס </w:t>
+            </w:r>
+            <w:r>
+              <w:rPr>
+                <w:rFonts w:ascii="Arial" w:cs="Arial" w:eastAsia="Arial" w:hAnsi="Arial"/>
+                <w:b/>
+                <w:bCs/>
+                <w:sz w:val="19"/>
+                <w:szCs w:val="19"/>
+                <w:rtl/>
+              </w:rPr>
+              <w:t xml:space="preserve">מסוג תקלה</w:t>
+            </w:r>
+            <w:r>
+              <w:rPr>
+                <w:rFonts w:ascii="Arial" w:cs="Arial" w:eastAsia="Arial" w:hAnsi="Arial"/>
+                <w:sz w:val="19"/>
+                <w:szCs w:val="19"/>
+                <w:rtl/>
+              </w:rPr>
+              <w:t xml:space="preserve"> באותו חשבון + אותו Asset + אותה תת-קטגוריה, תוך 30 יום מסגירת הקייס הקודם. קייסי מעקב לא נספרים כחזרה</w:t>
             </w:r>
           </w:p>
         </w:tc>
@@ -13105,7 +13174,27 @@
                 <w:szCs w:val="19"/>
                 <w:rtl/>
               </w:rPr>
-              <w:t xml:space="preserve">Σ w(Priority) של הקייסים שנפתחו ב-90 יום, ועוד שעות elapsed של Requests בטירים 2-4</w:t>
+              <w:t xml:space="preserve">Σ w(Priority) של קייסי </w:t>
+            </w:r>
+            <w:r>
+              <w:rPr>
+                <w:rFonts w:ascii="Arial" w:cs="Arial" w:eastAsia="Arial" w:hAnsi="Arial"/>
+                <w:b/>
+                <w:bCs/>
+                <w:sz w:val="19"/>
+                <w:szCs w:val="19"/>
+                <w:rtl/>
+              </w:rPr>
+              <w:t xml:space="preserve">תקלה</w:t>
+            </w:r>
+            <w:r>
+              <w:rPr>
+                <w:rFonts w:ascii="Arial" w:cs="Arial" w:eastAsia="Arial" w:hAnsi="Arial"/>
+                <w:sz w:val="19"/>
+                <w:szCs w:val="19"/>
+                <w:rtl/>
+              </w:rPr>
+              <w:t xml:space="preserve"> שנפתחו ב-90 יום, ועוד שעות elapsed של Requests בטירים 2-4. עבודה מתוכננת (ניטור יזום, התקנות) מוצגת בנפרד</w:t>
             </w:r>
           </w:p>
         </w:tc>
@@ -13864,7 +13953,7 @@
           <w:szCs w:val="20"/>
           <w:rtl/>
         </w:rPr>
-        <w:t xml:space="preserve">מגבלה בטיר 1:</w:t>
+        <w:t xml:space="preserve">כל העבודה של טיר 1 מתועדת כקייסים</w:t>
       </w:r>
       <w:r>
         <w:rPr>
@@ -13873,7 +13962,7 @@
           <w:szCs w:val="20"/>
           <w:rtl/>
         </w:rPr>
-        <w:t xml:space="preserve"> חלק גדול מהעבודה של טיר 1 הוא מעקבים, ניטור יזום והתקנות מרחוק. אם העבודה הזו לא מתועדת ב-Salesforce (למשל כ-Activities או כקייסים יזומים), היא לא תופיע בדשבורד, וההספק של טיר 1 ייראה נמוך מהמציאות. בכ-100 שיחות ו-50 מיילים ביום לכ-12 תומכים במשמרת, הפניות הנכנסות הן רק חלק קטן מהיום. </w:t>
+        <w:t xml:space="preserve">, ולכן ההספק והעומס של טיר 1 מוצגים במלואם. אבל ספירה אחת של "קייסים שנסגרו" תשווה בין מעקב של 5 דקות להתקנה מרחוק של שלוש שעות. לכן תפוקה מוצגת תמיד </w:t>
       </w:r>
       <w:r>
         <w:rPr>
@@ -13884,7 +13973,7 @@
           <w:szCs w:val="20"/>
           <w:rtl/>
         </w:rPr>
-        <w:t xml:space="preserve">לכן מדדי ההספק של טיר 1 לא יוצגו להנהלה עד שיוחלט איך מתעדים את העבודה הזו</w:t>
+        <w:t xml:space="preserve">לפי סוג קייס</w:t>
       </w:r>
       <w:r>
         <w:rPr>
@@ -13893,7 +13982,7 @@
           <w:szCs w:val="20"/>
           <w:rtl/>
         </w:rPr>
-        <w:t xml:space="preserve"> (17).</w:t>
+        <w:t xml:space="preserve"> (8.11), ולא כמספר אחד.</w:t>
       </w:r>
     </w:p>
     <w:p>
@@ -17518,6 +17607,1159 @@
       <w:pPr>
         <w:spacing w:after="120"/>
       </w:pPr>
+    </w:p>
+    <w:p>
+      <w:pPr>
+        <w:pStyle w:val="Heading2"/>
+        <w:bidi/>
+      </w:pPr>
+      <w:r>
+        <w:rPr>
+          <w:rFonts w:ascii="Arial" w:cs="Arial" w:eastAsia="Arial" w:hAnsi="Arial"/>
+          <w:rtl/>
+        </w:rPr>
+        <w:t xml:space="preserve">8.11 סוגי קייסים</w:t>
+      </w:r>
+    </w:p>
+    <w:p>
+      <w:pPr>
+        <w:bidi/>
+        <w:spacing w:after="120" w:line="276"/>
+        <w:jc w:val="start"/>
+      </w:pPr>
+      <w:r>
+        <w:rPr>
+          <w:rFonts w:ascii="Arial" w:cs="Arial" w:eastAsia="Arial" w:hAnsi="Arial"/>
+          <w:rtl/>
+        </w:rPr>
+        <w:t xml:space="preserve">כל פעולה של טיר 1 היא קייס, ולכן יש ב-Salesforce גם קייסים שאינם תקלה של לקוח. כל קייס מסווג לאחד מארבעה סוגים (לפי שדה Type, Origin או שדה אחר, לאישור ב-SUP-4):</w:t>
+      </w:r>
+    </w:p>
+    <w:tbl>
+      <w:tblPr>
+        <w:bidiVisual/>
+        <w:tblW w:type="dxa" w:w="9638"/>
+        <w:tblBorders>
+          <w:top w:val="single" w:color="auto" w:sz="4"/>
+          <w:left w:val="single" w:color="auto" w:sz="4"/>
+          <w:bottom w:val="single" w:color="auto" w:sz="4"/>
+          <w:right w:val="single" w:color="auto" w:sz="4"/>
+          <w:insideH w:val="single" w:color="auto" w:sz="4"/>
+          <w:insideV w:val="single" w:color="auto" w:sz="4"/>
+        </w:tblBorders>
+        <w:tblLayout w:type="fixed"/>
+      </w:tblPr>
+      <w:tblGrid>
+        <w:gridCol w:w="1347"/>
+        <w:gridCol w:w="1954"/>
+        <w:gridCol w:w="1550"/>
+        <w:gridCol w:w="2025"/>
+        <w:gridCol w:w="1145"/>
+        <w:gridCol w:w="1617"/>
+      </w:tblGrid>
+      <w:tr>
+        <w:trPr>
+          <w:tblHeader/>
+        </w:trPr>
+        <w:tc>
+          <w:tcPr>
+            <w:tcW w:type="dxa" w:w="1347"/>
+            <w:tcBorders>
+              <w:top w:val="single" w:color="BFBFBF" w:sz="4"/>
+              <w:left w:val="single" w:color="BFBFBF" w:sz="4"/>
+              <w:bottom w:val="single" w:color="BFBFBF" w:sz="4"/>
+              <w:right w:val="single" w:color="BFBFBF" w:sz="4"/>
+            </w:tcBorders>
+            <w:shd w:fill="DCE6F1" w:color="auto" w:val="clear"/>
+            <w:tcMar>
+              <w:top w:type="dxa" w:w="60"/>
+              <w:left w:type="dxa" w:w="100"/>
+              <w:bottom w:type="dxa" w:w="60"/>
+              <w:right w:type="dxa" w:w="100"/>
+            </w:tcMar>
+          </w:tcPr>
+          <w:p>
+            <w:pPr>
+              <w:bidi/>
+              <w:spacing w:after="0"/>
+            </w:pPr>
+            <w:r>
+              <w:rPr>
+                <w:rFonts w:ascii="Arial" w:cs="Arial" w:eastAsia="Arial" w:hAnsi="Arial"/>
+                <w:b/>
+                <w:bCs/>
+                <w:sz w:val="19"/>
+                <w:szCs w:val="19"/>
+                <w:rtl/>
+              </w:rPr>
+              <w:t xml:space="preserve">סוג</w:t>
+            </w:r>
+          </w:p>
+        </w:tc>
+        <w:tc>
+          <w:tcPr>
+            <w:tcW w:type="dxa" w:w="1954"/>
+            <w:tcBorders>
+              <w:top w:val="single" w:color="BFBFBF" w:sz="4"/>
+              <w:left w:val="single" w:color="BFBFBF" w:sz="4"/>
+              <w:bottom w:val="single" w:color="BFBFBF" w:sz="4"/>
+              <w:right w:val="single" w:color="BFBFBF" w:sz="4"/>
+            </w:tcBorders>
+            <w:shd w:fill="DCE6F1" w:color="auto" w:val="clear"/>
+            <w:tcMar>
+              <w:top w:type="dxa" w:w="60"/>
+              <w:left w:type="dxa" w:w="100"/>
+              <w:bottom w:type="dxa" w:w="60"/>
+              <w:right w:type="dxa" w:w="100"/>
+            </w:tcMar>
+          </w:tcPr>
+          <w:p>
+            <w:pPr>
+              <w:bidi/>
+              <w:spacing w:after="0"/>
+            </w:pPr>
+            <w:r>
+              <w:rPr>
+                <w:rFonts w:ascii="Arial" w:cs="Arial" w:eastAsia="Arial" w:hAnsi="Arial"/>
+                <w:b/>
+                <w:bCs/>
+                <w:sz w:val="19"/>
+                <w:szCs w:val="19"/>
+                <w:rtl/>
+              </w:rPr>
+              <w:t xml:space="preserve">דוגמה</w:t>
+            </w:r>
+          </w:p>
+        </w:tc>
+        <w:tc>
+          <w:tcPr>
+            <w:tcW w:type="dxa" w:w="1550"/>
+            <w:tcBorders>
+              <w:top w:val="single" w:color="BFBFBF" w:sz="4"/>
+              <w:left w:val="single" w:color="BFBFBF" w:sz="4"/>
+              <w:bottom w:val="single" w:color="BFBFBF" w:sz="4"/>
+              <w:right w:val="single" w:color="BFBFBF" w:sz="4"/>
+            </w:tcBorders>
+            <w:shd w:fill="DCE6F1" w:color="auto" w:val="clear"/>
+            <w:tcMar>
+              <w:top w:type="dxa" w:w="60"/>
+              <w:left w:type="dxa" w:w="100"/>
+              <w:bottom w:type="dxa" w:w="60"/>
+              <w:right w:type="dxa" w:w="100"/>
+            </w:tcMar>
+          </w:tcPr>
+          <w:p>
+            <w:pPr>
+              <w:bidi/>
+              <w:spacing w:after="0"/>
+            </w:pPr>
+            <w:r>
+              <w:rPr>
+                <w:rFonts w:ascii="Arial" w:cs="Arial" w:eastAsia="Arial" w:hAnsi="Arial"/>
+                <w:b/>
+                <w:bCs/>
+                <w:sz w:val="19"/>
+                <w:szCs w:val="19"/>
+                <w:rtl/>
+              </w:rPr>
+              <w:t xml:space="preserve">עומס והספק (8.3, 8.6)</w:t>
+            </w:r>
+          </w:p>
+        </w:tc>
+        <w:tc>
+          <w:tcPr>
+            <w:tcW w:type="dxa" w:w="2025"/>
+            <w:tcBorders>
+              <w:top w:val="single" w:color="BFBFBF" w:sz="4"/>
+              <w:left w:val="single" w:color="BFBFBF" w:sz="4"/>
+              <w:bottom w:val="single" w:color="BFBFBF" w:sz="4"/>
+              <w:right w:val="single" w:color="BFBFBF" w:sz="4"/>
+            </w:tcBorders>
+            <w:shd w:fill="DCE6F1" w:color="auto" w:val="clear"/>
+            <w:tcMar>
+              <w:top w:type="dxa" w:w="60"/>
+              <w:left w:type="dxa" w:w="100"/>
+              <w:bottom w:type="dxa" w:w="60"/>
+              <w:right w:type="dxa" w:w="100"/>
+            </w:tcMar>
+          </w:tcPr>
+          <w:p>
+            <w:pPr>
+              <w:bidi/>
+              <w:spacing w:after="0"/>
+            </w:pPr>
+            <w:r>
+              <w:rPr>
+                <w:rFonts w:ascii="Arial" w:cs="Arial" w:eastAsia="Arial" w:hAnsi="Arial"/>
+                <w:b/>
+                <w:bCs/>
+                <w:sz w:val="19"/>
+                <w:szCs w:val="19"/>
+                <w:rtl/>
+              </w:rPr>
+              <w:t xml:space="preserve">איכות מוצר (8.4)</w:t>
+            </w:r>
+          </w:p>
+        </w:tc>
+        <w:tc>
+          <w:tcPr>
+            <w:tcW w:type="dxa" w:w="1145"/>
+            <w:tcBorders>
+              <w:top w:val="single" w:color="BFBFBF" w:sz="4"/>
+              <w:left w:val="single" w:color="BFBFBF" w:sz="4"/>
+              <w:bottom w:val="single" w:color="BFBFBF" w:sz="4"/>
+              <w:right w:val="single" w:color="BFBFBF" w:sz="4"/>
+            </w:tcBorders>
+            <w:shd w:fill="DCE6F1" w:color="auto" w:val="clear"/>
+            <w:tcMar>
+              <w:top w:type="dxa" w:w="60"/>
+              <w:left w:type="dxa" w:w="100"/>
+              <w:bottom w:type="dxa" w:w="60"/>
+              <w:right w:type="dxa" w:w="100"/>
+            </w:tcMar>
+          </w:tcPr>
+          <w:p>
+            <w:pPr>
+              <w:bidi/>
+              <w:spacing w:after="0"/>
+            </w:pPr>
+            <w:r>
+              <w:rPr>
+                <w:rFonts w:ascii="Arial" w:cs="Arial" w:eastAsia="Arial" w:hAnsi="Arial"/>
+                <w:b/>
+                <w:bCs/>
+                <w:sz w:val="19"/>
+                <w:szCs w:val="19"/>
+                <w:rtl/>
+              </w:rPr>
+              <w:t xml:space="preserve">FCR ותקלה חוזרת</w:t>
+            </w:r>
+          </w:p>
+        </w:tc>
+        <w:tc>
+          <w:tcPr>
+            <w:tcW w:type="dxa" w:w="1617"/>
+            <w:tcBorders>
+              <w:top w:val="single" w:color="BFBFBF" w:sz="4"/>
+              <w:left w:val="single" w:color="BFBFBF" w:sz="4"/>
+              <w:bottom w:val="single" w:color="BFBFBF" w:sz="4"/>
+              <w:right w:val="single" w:color="BFBFBF" w:sz="4"/>
+            </w:tcBorders>
+            <w:shd w:fill="DCE6F1" w:color="auto" w:val="clear"/>
+            <w:tcMar>
+              <w:top w:type="dxa" w:w="60"/>
+              <w:left w:type="dxa" w:w="100"/>
+              <w:bottom w:type="dxa" w:w="60"/>
+              <w:right w:type="dxa" w:w="100"/>
+            </w:tcMar>
+          </w:tcPr>
+          <w:p>
+            <w:pPr>
+              <w:bidi/>
+              <w:spacing w:after="0"/>
+            </w:pPr>
+            <w:r>
+              <w:rPr>
+                <w:rFonts w:ascii="Arial" w:cs="Arial" w:eastAsia="Arial" w:hAnsi="Arial"/>
+                <w:b/>
+                <w:bCs/>
+                <w:sz w:val="19"/>
+                <w:szCs w:val="19"/>
+                <w:rtl/>
+              </w:rPr>
+              <w:t xml:space="preserve">עומס לקוח (8.5)</w:t>
+            </w:r>
+          </w:p>
+        </w:tc>
+      </w:tr>
+      <w:tr>
+        <w:trPr>
+          <w:tblHeader w:val="false"/>
+        </w:trPr>
+        <w:tc>
+          <w:tcPr>
+            <w:tcW w:type="dxa" w:w="1347"/>
+            <w:tcBorders>
+              <w:top w:val="single" w:color="BFBFBF" w:sz="4"/>
+              <w:left w:val="single" w:color="BFBFBF" w:sz="4"/>
+              <w:bottom w:val="single" w:color="BFBFBF" w:sz="4"/>
+              <w:right w:val="single" w:color="BFBFBF" w:sz="4"/>
+            </w:tcBorders>
+            <w:tcMar>
+              <w:top w:type="dxa" w:w="60"/>
+              <w:left w:type="dxa" w:w="100"/>
+              <w:bottom w:type="dxa" w:w="60"/>
+              <w:right w:type="dxa" w:w="100"/>
+            </w:tcMar>
+          </w:tcPr>
+          <w:p>
+            <w:pPr>
+              <w:bidi/>
+              <w:spacing w:after="0"/>
+            </w:pPr>
+            <w:r>
+              <w:rPr>
+                <w:rFonts w:ascii="Arial" w:cs="Arial" w:eastAsia="Arial" w:hAnsi="Arial"/>
+                <w:sz w:val="19"/>
+                <w:szCs w:val="19"/>
+                <w:rtl/>
+              </w:rPr>
+              <w:t xml:space="preserve">תקלה (פנייה של לקוח)</w:t>
+            </w:r>
+          </w:p>
+        </w:tc>
+        <w:tc>
+          <w:tcPr>
+            <w:tcW w:type="dxa" w:w="1954"/>
+            <w:tcBorders>
+              <w:top w:val="single" w:color="BFBFBF" w:sz="4"/>
+              <w:left w:val="single" w:color="BFBFBF" w:sz="4"/>
+              <w:bottom w:val="single" w:color="BFBFBF" w:sz="4"/>
+              <w:right w:val="single" w:color="BFBFBF" w:sz="4"/>
+            </w:tcBorders>
+            <w:tcMar>
+              <w:top w:type="dxa" w:w="60"/>
+              <w:left w:type="dxa" w:w="100"/>
+              <w:bottom w:type="dxa" w:w="60"/>
+              <w:right w:type="dxa" w:w="100"/>
+            </w:tcMar>
+          </w:tcPr>
+          <w:p>
+            <w:pPr>
+              <w:bidi/>
+              <w:spacing w:after="0"/>
+            </w:pPr>
+            <w:r>
+              <w:rPr>
+                <w:rFonts w:ascii="Arial" w:cs="Arial" w:eastAsia="Arial" w:hAnsi="Arial"/>
+                <w:sz w:val="19"/>
+                <w:szCs w:val="19"/>
+                <w:rtl/>
+              </w:rPr>
+              <w:t xml:space="preserve">לקוח מתקשר, המערכת לא עולה</w:t>
+            </w:r>
+          </w:p>
+        </w:tc>
+        <w:tc>
+          <w:tcPr>
+            <w:tcW w:type="dxa" w:w="1550"/>
+            <w:tcBorders>
+              <w:top w:val="single" w:color="BFBFBF" w:sz="4"/>
+              <w:left w:val="single" w:color="BFBFBF" w:sz="4"/>
+              <w:bottom w:val="single" w:color="BFBFBF" w:sz="4"/>
+              <w:right w:val="single" w:color="BFBFBF" w:sz="4"/>
+            </w:tcBorders>
+            <w:tcMar>
+              <w:top w:type="dxa" w:w="60"/>
+              <w:left w:type="dxa" w:w="100"/>
+              <w:bottom w:type="dxa" w:w="60"/>
+              <w:right w:type="dxa" w:w="100"/>
+            </w:tcMar>
+          </w:tcPr>
+          <w:p>
+            <w:pPr>
+              <w:bidi/>
+              <w:spacing w:after="0"/>
+            </w:pPr>
+            <w:r>
+              <w:rPr>
+                <w:rFonts w:ascii="Arial" w:cs="Arial" w:eastAsia="Arial" w:hAnsi="Arial"/>
+                <w:sz w:val="19"/>
+                <w:szCs w:val="19"/>
+                <w:rtl/>
+              </w:rPr>
+              <w:t xml:space="preserve">כן</w:t>
+            </w:r>
+          </w:p>
+        </w:tc>
+        <w:tc>
+          <w:tcPr>
+            <w:tcW w:type="dxa" w:w="2025"/>
+            <w:tcBorders>
+              <w:top w:val="single" w:color="BFBFBF" w:sz="4"/>
+              <w:left w:val="single" w:color="BFBFBF" w:sz="4"/>
+              <w:bottom w:val="single" w:color="BFBFBF" w:sz="4"/>
+              <w:right w:val="single" w:color="BFBFBF" w:sz="4"/>
+            </w:tcBorders>
+            <w:tcMar>
+              <w:top w:type="dxa" w:w="60"/>
+              <w:left w:type="dxa" w:w="100"/>
+              <w:bottom w:type="dxa" w:w="60"/>
+              <w:right w:type="dxa" w:w="100"/>
+            </w:tcMar>
+          </w:tcPr>
+          <w:p>
+            <w:pPr>
+              <w:bidi/>
+              <w:spacing w:after="0"/>
+            </w:pPr>
+            <w:r>
+              <w:rPr>
+                <w:rFonts w:ascii="Arial" w:cs="Arial" w:eastAsia="Arial" w:hAnsi="Arial"/>
+                <w:sz w:val="19"/>
+                <w:szCs w:val="19"/>
+                <w:rtl/>
+              </w:rPr>
+              <w:t xml:space="preserve">כן</w:t>
+            </w:r>
+          </w:p>
+        </w:tc>
+        <w:tc>
+          <w:tcPr>
+            <w:tcW w:type="dxa" w:w="1145"/>
+            <w:tcBorders>
+              <w:top w:val="single" w:color="BFBFBF" w:sz="4"/>
+              <w:left w:val="single" w:color="BFBFBF" w:sz="4"/>
+              <w:bottom w:val="single" w:color="BFBFBF" w:sz="4"/>
+              <w:right w:val="single" w:color="BFBFBF" w:sz="4"/>
+            </w:tcBorders>
+            <w:tcMar>
+              <w:top w:type="dxa" w:w="60"/>
+              <w:left w:type="dxa" w:w="100"/>
+              <w:bottom w:type="dxa" w:w="60"/>
+              <w:right w:type="dxa" w:w="100"/>
+            </w:tcMar>
+          </w:tcPr>
+          <w:p>
+            <w:pPr>
+              <w:bidi/>
+              <w:spacing w:after="0"/>
+            </w:pPr>
+            <w:r>
+              <w:rPr>
+                <w:rFonts w:ascii="Arial" w:cs="Arial" w:eastAsia="Arial" w:hAnsi="Arial"/>
+                <w:sz w:val="19"/>
+                <w:szCs w:val="19"/>
+                <w:rtl/>
+              </w:rPr>
+              <w:t xml:space="preserve">כן</w:t>
+            </w:r>
+          </w:p>
+        </w:tc>
+        <w:tc>
+          <w:tcPr>
+            <w:tcW w:type="dxa" w:w="1617"/>
+            <w:tcBorders>
+              <w:top w:val="single" w:color="BFBFBF" w:sz="4"/>
+              <w:left w:val="single" w:color="BFBFBF" w:sz="4"/>
+              <w:bottom w:val="single" w:color="BFBFBF" w:sz="4"/>
+              <w:right w:val="single" w:color="BFBFBF" w:sz="4"/>
+            </w:tcBorders>
+            <w:tcMar>
+              <w:top w:type="dxa" w:w="60"/>
+              <w:left w:type="dxa" w:w="100"/>
+              <w:bottom w:type="dxa" w:w="60"/>
+              <w:right w:type="dxa" w:w="100"/>
+            </w:tcMar>
+          </w:tcPr>
+          <w:p>
+            <w:pPr>
+              <w:bidi/>
+              <w:spacing w:after="0"/>
+            </w:pPr>
+            <w:r>
+              <w:rPr>
+                <w:rFonts w:ascii="Arial" w:cs="Arial" w:eastAsia="Arial" w:hAnsi="Arial"/>
+                <w:sz w:val="19"/>
+                <w:szCs w:val="19"/>
+                <w:rtl/>
+              </w:rPr>
+              <w:t xml:space="preserve">כן</w:t>
+            </w:r>
+          </w:p>
+        </w:tc>
+      </w:tr>
+      <w:tr>
+        <w:trPr>
+          <w:tblHeader w:val="false"/>
+        </w:trPr>
+        <w:tc>
+          <w:tcPr>
+            <w:tcW w:type="dxa" w:w="1347"/>
+            <w:tcBorders>
+              <w:top w:val="single" w:color="BFBFBF" w:sz="4"/>
+              <w:left w:val="single" w:color="BFBFBF" w:sz="4"/>
+              <w:bottom w:val="single" w:color="BFBFBF" w:sz="4"/>
+              <w:right w:val="single" w:color="BFBFBF" w:sz="4"/>
+            </w:tcBorders>
+            <w:tcMar>
+              <w:top w:type="dxa" w:w="60"/>
+              <w:left w:type="dxa" w:w="100"/>
+              <w:bottom w:type="dxa" w:w="60"/>
+              <w:right w:type="dxa" w:w="100"/>
+            </w:tcMar>
+          </w:tcPr>
+          <w:p>
+            <w:pPr>
+              <w:bidi/>
+              <w:spacing w:after="0"/>
+            </w:pPr>
+            <w:r>
+              <w:rPr>
+                <w:rFonts w:ascii="Arial" w:cs="Arial" w:eastAsia="Arial" w:hAnsi="Arial"/>
+                <w:sz w:val="19"/>
+                <w:szCs w:val="19"/>
+                <w:rtl/>
+              </w:rPr>
+              <w:t xml:space="preserve">מעקב</w:t>
+            </w:r>
+          </w:p>
+        </w:tc>
+        <w:tc>
+          <w:tcPr>
+            <w:tcW w:type="dxa" w:w="1954"/>
+            <w:tcBorders>
+              <w:top w:val="single" w:color="BFBFBF" w:sz="4"/>
+              <w:left w:val="single" w:color="BFBFBF" w:sz="4"/>
+              <w:bottom w:val="single" w:color="BFBFBF" w:sz="4"/>
+              <w:right w:val="single" w:color="BFBFBF" w:sz="4"/>
+            </w:tcBorders>
+            <w:tcMar>
+              <w:top w:type="dxa" w:w="60"/>
+              <w:left w:type="dxa" w:w="100"/>
+              <w:bottom w:type="dxa" w:w="60"/>
+              <w:right w:type="dxa" w:w="100"/>
+            </w:tcMar>
+          </w:tcPr>
+          <w:p>
+            <w:pPr>
+              <w:bidi/>
+              <w:spacing w:after="0"/>
+            </w:pPr>
+            <w:r>
+              <w:rPr>
+                <w:rFonts w:ascii="Arial" w:cs="Arial" w:eastAsia="Arial" w:hAnsi="Arial"/>
+                <w:sz w:val="19"/>
+                <w:szCs w:val="19"/>
+                <w:rtl/>
+              </w:rPr>
+              <w:t xml:space="preserve">בדיקה אחרי פתרון, חזרה ללקוח</w:t>
+            </w:r>
+          </w:p>
+        </w:tc>
+        <w:tc>
+          <w:tcPr>
+            <w:tcW w:type="dxa" w:w="1550"/>
+            <w:tcBorders>
+              <w:top w:val="single" w:color="BFBFBF" w:sz="4"/>
+              <w:left w:val="single" w:color="BFBFBF" w:sz="4"/>
+              <w:bottom w:val="single" w:color="BFBFBF" w:sz="4"/>
+              <w:right w:val="single" w:color="BFBFBF" w:sz="4"/>
+            </w:tcBorders>
+            <w:tcMar>
+              <w:top w:type="dxa" w:w="60"/>
+              <w:left w:type="dxa" w:w="100"/>
+              <w:bottom w:type="dxa" w:w="60"/>
+              <w:right w:type="dxa" w:w="100"/>
+            </w:tcMar>
+          </w:tcPr>
+          <w:p>
+            <w:pPr>
+              <w:bidi/>
+              <w:spacing w:after="0"/>
+            </w:pPr>
+            <w:r>
+              <w:rPr>
+                <w:rFonts w:ascii="Arial" w:cs="Arial" w:eastAsia="Arial" w:hAnsi="Arial"/>
+                <w:sz w:val="19"/>
+                <w:szCs w:val="19"/>
+                <w:rtl/>
+              </w:rPr>
+              <w:t xml:space="preserve">כן</w:t>
+            </w:r>
+          </w:p>
+        </w:tc>
+        <w:tc>
+          <w:tcPr>
+            <w:tcW w:type="dxa" w:w="2025"/>
+            <w:tcBorders>
+              <w:top w:val="single" w:color="BFBFBF" w:sz="4"/>
+              <w:left w:val="single" w:color="BFBFBF" w:sz="4"/>
+              <w:bottom w:val="single" w:color="BFBFBF" w:sz="4"/>
+              <w:right w:val="single" w:color="BFBFBF" w:sz="4"/>
+            </w:tcBorders>
+            <w:tcMar>
+              <w:top w:type="dxa" w:w="60"/>
+              <w:left w:type="dxa" w:w="100"/>
+              <w:bottom w:type="dxa" w:w="60"/>
+              <w:right w:type="dxa" w:w="100"/>
+            </w:tcMar>
+          </w:tcPr>
+          <w:p>
+            <w:pPr>
+              <w:bidi/>
+              <w:spacing w:after="0"/>
+            </w:pPr>
+            <w:r>
+              <w:rPr>
+                <w:rFonts w:ascii="Arial" w:cs="Arial" w:eastAsia="Arial" w:hAnsi="Arial"/>
+                <w:sz w:val="19"/>
+                <w:szCs w:val="19"/>
+                <w:rtl/>
+              </w:rPr>
+              <w:t xml:space="preserve">לא</w:t>
+            </w:r>
+          </w:p>
+        </w:tc>
+        <w:tc>
+          <w:tcPr>
+            <w:tcW w:type="dxa" w:w="1145"/>
+            <w:tcBorders>
+              <w:top w:val="single" w:color="BFBFBF" w:sz="4"/>
+              <w:left w:val="single" w:color="BFBFBF" w:sz="4"/>
+              <w:bottom w:val="single" w:color="BFBFBF" w:sz="4"/>
+              <w:right w:val="single" w:color="BFBFBF" w:sz="4"/>
+            </w:tcBorders>
+            <w:tcMar>
+              <w:top w:type="dxa" w:w="60"/>
+              <w:left w:type="dxa" w:w="100"/>
+              <w:bottom w:type="dxa" w:w="60"/>
+              <w:right w:type="dxa" w:w="100"/>
+            </w:tcMar>
+          </w:tcPr>
+          <w:p>
+            <w:pPr>
+              <w:bidi/>
+              <w:spacing w:after="0"/>
+            </w:pPr>
+            <w:r>
+              <w:rPr>
+                <w:rFonts w:ascii="Arial" w:cs="Arial" w:eastAsia="Arial" w:hAnsi="Arial"/>
+                <w:sz w:val="19"/>
+                <w:szCs w:val="19"/>
+                <w:rtl/>
+              </w:rPr>
+              <w:t xml:space="preserve">לא (לא נחשב חזרה)</w:t>
+            </w:r>
+          </w:p>
+        </w:tc>
+        <w:tc>
+          <w:tcPr>
+            <w:tcW w:type="dxa" w:w="1617"/>
+            <w:tcBorders>
+              <w:top w:val="single" w:color="BFBFBF" w:sz="4"/>
+              <w:left w:val="single" w:color="BFBFBF" w:sz="4"/>
+              <w:bottom w:val="single" w:color="BFBFBF" w:sz="4"/>
+              <w:right w:val="single" w:color="BFBFBF" w:sz="4"/>
+            </w:tcBorders>
+            <w:tcMar>
+              <w:top w:type="dxa" w:w="60"/>
+              <w:left w:type="dxa" w:w="100"/>
+              <w:bottom w:type="dxa" w:w="60"/>
+              <w:right w:type="dxa" w:w="100"/>
+            </w:tcMar>
+          </w:tcPr>
+          <w:p>
+            <w:pPr>
+              <w:bidi/>
+              <w:spacing w:after="0"/>
+            </w:pPr>
+            <w:r>
+              <w:rPr>
+                <w:rFonts w:ascii="Arial" w:cs="Arial" w:eastAsia="Arial" w:hAnsi="Arial"/>
+                <w:sz w:val="19"/>
+                <w:szCs w:val="19"/>
+                <w:rtl/>
+              </w:rPr>
+              <w:t xml:space="preserve">לא</w:t>
+            </w:r>
+          </w:p>
+        </w:tc>
+      </w:tr>
+      <w:tr>
+        <w:trPr>
+          <w:tblHeader w:val="false"/>
+        </w:trPr>
+        <w:tc>
+          <w:tcPr>
+            <w:tcW w:type="dxa" w:w="1347"/>
+            <w:tcBorders>
+              <w:top w:val="single" w:color="BFBFBF" w:sz="4"/>
+              <w:left w:val="single" w:color="BFBFBF" w:sz="4"/>
+              <w:bottom w:val="single" w:color="BFBFBF" w:sz="4"/>
+              <w:right w:val="single" w:color="BFBFBF" w:sz="4"/>
+            </w:tcBorders>
+            <w:tcMar>
+              <w:top w:type="dxa" w:w="60"/>
+              <w:left w:type="dxa" w:w="100"/>
+              <w:bottom w:type="dxa" w:w="60"/>
+              <w:right w:type="dxa" w:w="100"/>
+            </w:tcMar>
+          </w:tcPr>
+          <w:p>
+            <w:pPr>
+              <w:bidi/>
+              <w:spacing w:after="0"/>
+            </w:pPr>
+            <w:r>
+              <w:rPr>
+                <w:rFonts w:ascii="Arial" w:cs="Arial" w:eastAsia="Arial" w:hAnsi="Arial"/>
+                <w:sz w:val="19"/>
+                <w:szCs w:val="19"/>
+                <w:rtl/>
+              </w:rPr>
+              <w:t xml:space="preserve">ניטור יזום</w:t>
+            </w:r>
+          </w:p>
+        </w:tc>
+        <w:tc>
+          <w:tcPr>
+            <w:tcW w:type="dxa" w:w="1954"/>
+            <w:tcBorders>
+              <w:top w:val="single" w:color="BFBFBF" w:sz="4"/>
+              <w:left w:val="single" w:color="BFBFBF" w:sz="4"/>
+              <w:bottom w:val="single" w:color="BFBFBF" w:sz="4"/>
+              <w:right w:val="single" w:color="BFBFBF" w:sz="4"/>
+            </w:tcBorders>
+            <w:tcMar>
+              <w:top w:type="dxa" w:w="60"/>
+              <w:left w:type="dxa" w:w="100"/>
+              <w:bottom w:type="dxa" w:w="60"/>
+              <w:right w:type="dxa" w:w="100"/>
+            </w:tcMar>
+          </w:tcPr>
+          <w:p>
+            <w:pPr>
+              <w:bidi/>
+              <w:spacing w:after="0"/>
+            </w:pPr>
+            <w:r>
+              <w:rPr>
+                <w:rFonts w:ascii="Arial" w:cs="Arial" w:eastAsia="Arial" w:hAnsi="Arial"/>
+                <w:sz w:val="19"/>
+                <w:szCs w:val="19"/>
+                <w:rtl/>
+              </w:rPr>
+              <w:t xml:space="preserve">התראה ממערכת ניטור שטיר 1 פתח</w:t>
+            </w:r>
+          </w:p>
+        </w:tc>
+        <w:tc>
+          <w:tcPr>
+            <w:tcW w:type="dxa" w:w="1550"/>
+            <w:tcBorders>
+              <w:top w:val="single" w:color="BFBFBF" w:sz="4"/>
+              <w:left w:val="single" w:color="BFBFBF" w:sz="4"/>
+              <w:bottom w:val="single" w:color="BFBFBF" w:sz="4"/>
+              <w:right w:val="single" w:color="BFBFBF" w:sz="4"/>
+            </w:tcBorders>
+            <w:tcMar>
+              <w:top w:type="dxa" w:w="60"/>
+              <w:left w:type="dxa" w:w="100"/>
+              <w:bottom w:type="dxa" w:w="60"/>
+              <w:right w:type="dxa" w:w="100"/>
+            </w:tcMar>
+          </w:tcPr>
+          <w:p>
+            <w:pPr>
+              <w:bidi/>
+              <w:spacing w:after="0"/>
+            </w:pPr>
+            <w:r>
+              <w:rPr>
+                <w:rFonts w:ascii="Arial" w:cs="Arial" w:eastAsia="Arial" w:hAnsi="Arial"/>
+                <w:sz w:val="19"/>
+                <w:szCs w:val="19"/>
+                <w:rtl/>
+              </w:rPr>
+              <w:t xml:space="preserve">כן</w:t>
+            </w:r>
+          </w:p>
+        </w:tc>
+        <w:tc>
+          <w:tcPr>
+            <w:tcW w:type="dxa" w:w="2025"/>
+            <w:tcBorders>
+              <w:top w:val="single" w:color="BFBFBF" w:sz="4"/>
+              <w:left w:val="single" w:color="BFBFBF" w:sz="4"/>
+              <w:bottom w:val="single" w:color="BFBFBF" w:sz="4"/>
+              <w:right w:val="single" w:color="BFBFBF" w:sz="4"/>
+            </w:tcBorders>
+            <w:tcMar>
+              <w:top w:type="dxa" w:w="60"/>
+              <w:left w:type="dxa" w:w="100"/>
+              <w:bottom w:type="dxa" w:w="60"/>
+              <w:right w:type="dxa" w:w="100"/>
+            </w:tcMar>
+          </w:tcPr>
+          <w:p>
+            <w:pPr>
+              <w:bidi/>
+              <w:spacing w:after="0"/>
+            </w:pPr>
+            <w:r>
+              <w:rPr>
+                <w:rFonts w:ascii="Arial" w:cs="Arial" w:eastAsia="Arial" w:hAnsi="Arial"/>
+                <w:b/>
+                <w:bCs/>
+                <w:sz w:val="19"/>
+                <w:szCs w:val="19"/>
+                <w:rtl/>
+              </w:rPr>
+              <w:t xml:space="preserve">בנפרד</w:t>
+            </w:r>
+            <w:r>
+              <w:rPr>
+                <w:rFonts w:ascii="Arial" w:cs="Arial" w:eastAsia="Arial" w:hAnsi="Arial"/>
+                <w:sz w:val="19"/>
+                <w:szCs w:val="19"/>
+                <w:rtl/>
+              </w:rPr>
+              <w:t xml:space="preserve"> (תקלה שנתפסה לפני הלקוח)</w:t>
+            </w:r>
+          </w:p>
+        </w:tc>
+        <w:tc>
+          <w:tcPr>
+            <w:tcW w:type="dxa" w:w="1145"/>
+            <w:tcBorders>
+              <w:top w:val="single" w:color="BFBFBF" w:sz="4"/>
+              <w:left w:val="single" w:color="BFBFBF" w:sz="4"/>
+              <w:bottom w:val="single" w:color="BFBFBF" w:sz="4"/>
+              <w:right w:val="single" w:color="BFBFBF" w:sz="4"/>
+            </w:tcBorders>
+            <w:tcMar>
+              <w:top w:type="dxa" w:w="60"/>
+              <w:left w:type="dxa" w:w="100"/>
+              <w:bottom w:type="dxa" w:w="60"/>
+              <w:right w:type="dxa" w:w="100"/>
+            </w:tcMar>
+          </w:tcPr>
+          <w:p>
+            <w:pPr>
+              <w:bidi/>
+              <w:spacing w:after="0"/>
+            </w:pPr>
+            <w:r>
+              <w:rPr>
+                <w:rFonts w:ascii="Arial" w:cs="Arial" w:eastAsia="Arial" w:hAnsi="Arial"/>
+                <w:sz w:val="19"/>
+                <w:szCs w:val="19"/>
+                <w:rtl/>
+              </w:rPr>
+              <w:t xml:space="preserve">לא</w:t>
+            </w:r>
+          </w:p>
+        </w:tc>
+        <w:tc>
+          <w:tcPr>
+            <w:tcW w:type="dxa" w:w="1617"/>
+            <w:tcBorders>
+              <w:top w:val="single" w:color="BFBFBF" w:sz="4"/>
+              <w:left w:val="single" w:color="BFBFBF" w:sz="4"/>
+              <w:bottom w:val="single" w:color="BFBFBF" w:sz="4"/>
+              <w:right w:val="single" w:color="BFBFBF" w:sz="4"/>
+            </w:tcBorders>
+            <w:tcMar>
+              <w:top w:type="dxa" w:w="60"/>
+              <w:left w:type="dxa" w:w="100"/>
+              <w:bottom w:type="dxa" w:w="60"/>
+              <w:right w:type="dxa" w:w="100"/>
+            </w:tcMar>
+          </w:tcPr>
+          <w:p>
+            <w:pPr>
+              <w:bidi/>
+              <w:spacing w:after="0"/>
+            </w:pPr>
+            <w:r>
+              <w:rPr>
+                <w:rFonts w:ascii="Arial" w:cs="Arial" w:eastAsia="Arial" w:hAnsi="Arial"/>
+                <w:sz w:val="19"/>
+                <w:szCs w:val="19"/>
+                <w:rtl/>
+              </w:rPr>
+              <w:t xml:space="preserve">לא</w:t>
+            </w:r>
+          </w:p>
+        </w:tc>
+      </w:tr>
+      <w:tr>
+        <w:trPr>
+          <w:tblHeader w:val="false"/>
+        </w:trPr>
+        <w:tc>
+          <w:tcPr>
+            <w:tcW w:type="dxa" w:w="1347"/>
+            <w:tcBorders>
+              <w:top w:val="single" w:color="BFBFBF" w:sz="4"/>
+              <w:left w:val="single" w:color="BFBFBF" w:sz="4"/>
+              <w:bottom w:val="single" w:color="BFBFBF" w:sz="4"/>
+              <w:right w:val="single" w:color="BFBFBF" w:sz="4"/>
+            </w:tcBorders>
+            <w:tcMar>
+              <w:top w:type="dxa" w:w="60"/>
+              <w:left w:type="dxa" w:w="100"/>
+              <w:bottom w:type="dxa" w:w="60"/>
+              <w:right w:type="dxa" w:w="100"/>
+            </w:tcMar>
+          </w:tcPr>
+          <w:p>
+            <w:pPr>
+              <w:bidi/>
+              <w:spacing w:after="0"/>
+            </w:pPr>
+            <w:r>
+              <w:rPr>
+                <w:rFonts w:ascii="Arial" w:cs="Arial" w:eastAsia="Arial" w:hAnsi="Arial"/>
+                <w:sz w:val="19"/>
+                <w:szCs w:val="19"/>
+                <w:rtl/>
+              </w:rPr>
+              <w:t xml:space="preserve">התקנה מרחוק</w:t>
+            </w:r>
+          </w:p>
+        </w:tc>
+        <w:tc>
+          <w:tcPr>
+            <w:tcW w:type="dxa" w:w="1954"/>
+            <w:tcBorders>
+              <w:top w:val="single" w:color="BFBFBF" w:sz="4"/>
+              <w:left w:val="single" w:color="BFBFBF" w:sz="4"/>
+              <w:bottom w:val="single" w:color="BFBFBF" w:sz="4"/>
+              <w:right w:val="single" w:color="BFBFBF" w:sz="4"/>
+            </w:tcBorders>
+            <w:tcMar>
+              <w:top w:type="dxa" w:w="60"/>
+              <w:left w:type="dxa" w:w="100"/>
+              <w:bottom w:type="dxa" w:w="60"/>
+              <w:right w:type="dxa" w:w="100"/>
+            </w:tcMar>
+          </w:tcPr>
+          <w:p>
+            <w:pPr>
+              <w:bidi/>
+              <w:spacing w:after="0"/>
+            </w:pPr>
+            <w:r>
+              <w:rPr>
+                <w:rFonts w:ascii="Arial" w:cs="Arial" w:eastAsia="Arial" w:hAnsi="Arial"/>
+                <w:sz w:val="19"/>
+                <w:szCs w:val="19"/>
+                <w:rtl/>
+              </w:rPr>
+              <w:t xml:space="preserve">התקנה או שדרוג מתוכננים</w:t>
+            </w:r>
+          </w:p>
+        </w:tc>
+        <w:tc>
+          <w:tcPr>
+            <w:tcW w:type="dxa" w:w="1550"/>
+            <w:tcBorders>
+              <w:top w:val="single" w:color="BFBFBF" w:sz="4"/>
+              <w:left w:val="single" w:color="BFBFBF" w:sz="4"/>
+              <w:bottom w:val="single" w:color="BFBFBF" w:sz="4"/>
+              <w:right w:val="single" w:color="BFBFBF" w:sz="4"/>
+            </w:tcBorders>
+            <w:tcMar>
+              <w:top w:type="dxa" w:w="60"/>
+              <w:left w:type="dxa" w:w="100"/>
+              <w:bottom w:type="dxa" w:w="60"/>
+              <w:right w:type="dxa" w:w="100"/>
+            </w:tcMar>
+          </w:tcPr>
+          <w:p>
+            <w:pPr>
+              <w:bidi/>
+              <w:spacing w:after="0"/>
+            </w:pPr>
+            <w:r>
+              <w:rPr>
+                <w:rFonts w:ascii="Arial" w:cs="Arial" w:eastAsia="Arial" w:hAnsi="Arial"/>
+                <w:sz w:val="19"/>
+                <w:szCs w:val="19"/>
+                <w:rtl/>
+              </w:rPr>
+              <w:t xml:space="preserve">כן</w:t>
+            </w:r>
+          </w:p>
+        </w:tc>
+        <w:tc>
+          <w:tcPr>
+            <w:tcW w:type="dxa" w:w="2025"/>
+            <w:tcBorders>
+              <w:top w:val="single" w:color="BFBFBF" w:sz="4"/>
+              <w:left w:val="single" w:color="BFBFBF" w:sz="4"/>
+              <w:bottom w:val="single" w:color="BFBFBF" w:sz="4"/>
+              <w:right w:val="single" w:color="BFBFBF" w:sz="4"/>
+            </w:tcBorders>
+            <w:tcMar>
+              <w:top w:type="dxa" w:w="60"/>
+              <w:left w:type="dxa" w:w="100"/>
+              <w:bottom w:type="dxa" w:w="60"/>
+              <w:right w:type="dxa" w:w="100"/>
+            </w:tcMar>
+          </w:tcPr>
+          <w:p>
+            <w:pPr>
+              <w:bidi/>
+              <w:spacing w:after="0"/>
+            </w:pPr>
+            <w:r>
+              <w:rPr>
+                <w:rFonts w:ascii="Arial" w:cs="Arial" w:eastAsia="Arial" w:hAnsi="Arial"/>
+                <w:sz w:val="19"/>
+                <w:szCs w:val="19"/>
+                <w:rtl/>
+              </w:rPr>
+              <w:t xml:space="preserve">לא</w:t>
+            </w:r>
+          </w:p>
+        </w:tc>
+        <w:tc>
+          <w:tcPr>
+            <w:tcW w:type="dxa" w:w="1145"/>
+            <w:tcBorders>
+              <w:top w:val="single" w:color="BFBFBF" w:sz="4"/>
+              <w:left w:val="single" w:color="BFBFBF" w:sz="4"/>
+              <w:bottom w:val="single" w:color="BFBFBF" w:sz="4"/>
+              <w:right w:val="single" w:color="BFBFBF" w:sz="4"/>
+            </w:tcBorders>
+            <w:tcMar>
+              <w:top w:type="dxa" w:w="60"/>
+              <w:left w:type="dxa" w:w="100"/>
+              <w:bottom w:type="dxa" w:w="60"/>
+              <w:right w:type="dxa" w:w="100"/>
+            </w:tcMar>
+          </w:tcPr>
+          <w:p>
+            <w:pPr>
+              <w:bidi/>
+              <w:spacing w:after="0"/>
+            </w:pPr>
+            <w:r>
+              <w:rPr>
+                <w:rFonts w:ascii="Arial" w:cs="Arial" w:eastAsia="Arial" w:hAnsi="Arial"/>
+                <w:sz w:val="19"/>
+                <w:szCs w:val="19"/>
+                <w:rtl/>
+              </w:rPr>
+              <w:t xml:space="preserve">לא</w:t>
+            </w:r>
+          </w:p>
+        </w:tc>
+        <w:tc>
+          <w:tcPr>
+            <w:tcW w:type="dxa" w:w="1617"/>
+            <w:tcBorders>
+              <w:top w:val="single" w:color="BFBFBF" w:sz="4"/>
+              <w:left w:val="single" w:color="BFBFBF" w:sz="4"/>
+              <w:bottom w:val="single" w:color="BFBFBF" w:sz="4"/>
+              <w:right w:val="single" w:color="BFBFBF" w:sz="4"/>
+            </w:tcBorders>
+            <w:tcMar>
+              <w:top w:type="dxa" w:w="60"/>
+              <w:left w:type="dxa" w:w="100"/>
+              <w:bottom w:type="dxa" w:w="60"/>
+              <w:right w:type="dxa" w:w="100"/>
+            </w:tcMar>
+          </w:tcPr>
+          <w:p>
+            <w:pPr>
+              <w:bidi/>
+              <w:spacing w:after="0"/>
+            </w:pPr>
+            <w:r>
+              <w:rPr>
+                <w:rFonts w:ascii="Arial" w:cs="Arial" w:eastAsia="Arial" w:hAnsi="Arial"/>
+                <w:sz w:val="19"/>
+                <w:szCs w:val="19"/>
+                <w:rtl/>
+              </w:rPr>
+              <w:t xml:space="preserve">לא (מוצג כעבודה מתוכננת)</w:t>
+            </w:r>
+          </w:p>
+        </w:tc>
+      </w:tr>
+    </w:tbl>
+    <w:p>
+      <w:pPr>
+        <w:spacing w:after="120"/>
+      </w:pPr>
+    </w:p>
+    <w:p>
+      <w:pPr>
+        <w:pStyle w:val="ListParagraph"/>
+        <w:numPr>
+          <w:ilvl w:val="0"/>
+          <w:numId w:val="5"/>
+        </w:numPr>
+        <w:bidi/>
+        <w:spacing w:after="60"/>
+        <w:jc w:val="start"/>
+      </w:pPr>
+      <w:r>
+        <w:rPr>
+          <w:rFonts w:ascii="Arial" w:cs="Arial" w:eastAsia="Arial" w:hAnsi="Arial"/>
+          <w:b/>
+          <w:bCs/>
+          <w:rtl/>
+        </w:rPr>
+        <w:t xml:space="preserve">למה זה חשוב:</w:t>
+      </w:r>
+      <w:r>
+        <w:rPr>
+          <w:rFonts w:ascii="Arial" w:cs="Arial" w:eastAsia="Arial" w:hAnsi="Arial"/>
+          <w:rtl/>
+        </w:rPr>
+        <w:t xml:space="preserve"> בלי ההפרדה, קייס מעקב ייספר כ"תקלה חוזרת" אצל אותו לקוח, ניטור יזום ינפח את העומס של בית החולים, והתקנות ינפחו את שיעור התקלות של גרסה חדשה.</w:t>
+      </w:r>
+    </w:p>
+    <w:p>
+      <w:pPr>
+        <w:pStyle w:val="ListParagraph"/>
+        <w:numPr>
+          <w:ilvl w:val="0"/>
+          <w:numId w:val="5"/>
+        </w:numPr>
+        <w:bidi/>
+        <w:spacing w:after="60"/>
+        <w:jc w:val="start"/>
+      </w:pPr>
+      <w:r>
+        <w:rPr>
+          <w:rFonts w:ascii="Arial" w:cs="Arial" w:eastAsia="Arial" w:hAnsi="Arial"/>
+          <w:b/>
+          <w:bCs/>
+          <w:rtl/>
+        </w:rPr>
+        <w:t xml:space="preserve">קייס ניטור יזום שמגלה תקלה</w:t>
+      </w:r>
+      <w:r>
+        <w:rPr>
+          <w:rFonts w:ascii="Arial" w:cs="Arial" w:eastAsia="Arial" w:hAnsi="Arial"/>
+          <w:rtl/>
+        </w:rPr>
+        <w:t xml:space="preserve"> נספר באיכות מוצר בנפרד, כי הוא מידע חשוב: הוא מראה תקלות שנתפסו לפני שהלקוח הרגיש בהן.</w:t>
+      </w:r>
+    </w:p>
+    <w:p>
+      <w:pPr>
+        <w:pStyle w:val="ListParagraph"/>
+        <w:numPr>
+          <w:ilvl w:val="0"/>
+          <w:numId w:val="5"/>
+        </w:numPr>
+        <w:bidi/>
+        <w:spacing w:after="60"/>
+        <w:jc w:val="start"/>
+      </w:pPr>
+      <w:r>
+        <w:rPr>
+          <w:rFonts w:ascii="Arial" w:cs="Arial" w:eastAsia="Arial" w:hAnsi="Arial"/>
+          <w:b/>
+          <w:bCs/>
+          <w:rtl/>
+        </w:rPr>
+        <w:t xml:space="preserve">תפוקה לפי סוג:</w:t>
+      </w:r>
+      <w:r>
+        <w:rPr>
+          <w:rFonts w:ascii="Arial" w:cs="Arial" w:eastAsia="Arial" w:hAnsi="Arial"/>
+          <w:rtl/>
+        </w:rPr>
+        <w:t xml:space="preserve"> בדשבורד ההספק מוצגת עבודת טיר 1 בחלוקה לסוגים, ולצידה משך טיפול חציוני לכל סוג.</w:t>
+      </w:r>
     </w:p>
     <w:p>
       <w:pPr>
@@ -17764,7 +19006,7 @@
           <w:rFonts w:ascii="Arial" w:cs="Arial" w:eastAsia="Arial" w:hAnsi="Arial"/>
           <w:rtl/>
         </w:rPr>
-        <w:t xml:space="preserve">מפת חום של קייסים חדשים לפי שעה ויום בשבוע (לתכנון משמרות); Load Index לכל סוכן ביחס לחציון הטיר; FCR ושיעור אסקלציה; יחס תיעוד; שיעור שינוי עדיפות.</w:t>
+        <w:t xml:space="preserve">מפת חום של קייסים חדשים לפי שעה ויום בשבוע (לתכנון משמרות); Load Index לכל סוכן ביחס לחציון הטיר; עבודת טיר 1 לפי סוג קייס; FCR ושיעור אסקלציה; יחס תיעוד; שיעור שינוי עדיפות.</w:t>
       </w:r>
     </w:p>
     <w:p>
@@ -21548,7 +22790,7 @@
                 <w:szCs w:val="19"/>
                 <w:rtl/>
               </w:rPr>
-              <w:t xml:space="preserve">לתעד את אובייקט ה-Request: שדות, קשר לקייס, דגל הבאג, מזהה ה-TFS; ואיך מתועדות היום פעילויות יזומות של טיר 1</w:t>
+              <w:t xml:space="preserve">לתעד את אובייקט ה-Request: שדות, קשר לקייס, דגל הבאג, מזהה ה-TFS</w:t>
             </w:r>
           </w:p>
         </w:tc>
@@ -21713,7 +22955,7 @@
                 <w:szCs w:val="19"/>
                 <w:rtl/>
               </w:rPr>
-              <w:t xml:space="preserve">לייצא את רשימות הערכים: סטטוסים (קייס ו-Request), קטגוריות ותתי-קטגוריות, Root Cause, מוצרים, גרסאות</w:t>
+              <w:t xml:space="preserve">לייצא את רשימות הערכים: סטטוסים (קייס ו-Request), סוג קייס / Origin, קטגוריות ותתי-קטגוריות, Root Cause, מוצרים, גרסאות</w:t>
             </w:r>
           </w:p>
         </w:tc>
@@ -28534,7 +29776,7 @@
                 <w:szCs w:val="19"/>
                 <w:rtl/>
               </w:rPr>
-              <w:t xml:space="preserve">להחליט איך מתעדים ב-Salesforce מעקבים, ניטור יזום והתקנות מרחוק של טיר 1 (8.6)</w:t>
+              <w:t xml:space="preserve">לאשר את מיפוי סוגי הקייסים (8.11): איזה שדה מזהה אותם, ואילו ערכים שייכים לכל סוג</w:t>
             </w:r>
           </w:p>
         </w:tc>
@@ -28566,7 +29808,7 @@
                 <w:szCs w:val="19"/>
                 <w:rtl/>
               </w:rPr>
-              <w:t xml:space="preserve">הנחיה לצוות</w:t>
+              <w:t xml:space="preserve">מיפוי מאושר</w:t>
             </w:r>
           </w:p>
         </w:tc>
@@ -28598,7 +29840,7 @@
                 <w:szCs w:val="19"/>
                 <w:rtl/>
               </w:rPr>
-              <w:t xml:space="preserve">SF-4</w:t>
+              <w:t xml:space="preserve">SF-5</w:t>
             </w:r>
           </w:p>
         </w:tc>
@@ -30987,10 +32229,10 @@
         <w:tblLayout w:type="fixed"/>
       </w:tblPr>
       <w:tblGrid>
-        <w:gridCol w:w="3894"/>
-        <w:gridCol w:w="990"/>
+        <w:gridCol w:w="3647"/>
+        <w:gridCol w:w="1212"/>
         <w:gridCol w:w="950"/>
-        <w:gridCol w:w="3804"/>
+        <w:gridCol w:w="3829"/>
       </w:tblGrid>
       <w:tr>
         <w:trPr>
@@ -30998,7 +32240,7 @@
         </w:trPr>
         <w:tc>
           <w:tcPr>
-            <w:tcW w:type="dxa" w:w="3894"/>
+            <w:tcW w:type="dxa" w:w="3647"/>
             <w:tcBorders>
               <w:top w:val="single" w:color="BFBFBF" w:sz="4"/>
               <w:left w:val="single" w:color="BFBFBF" w:sz="4"/>
@@ -31033,7 +32275,7 @@
         </w:tc>
         <w:tc>
           <w:tcPr>
-            <w:tcW w:type="dxa" w:w="990"/>
+            <w:tcW w:type="dxa" w:w="1212"/>
             <w:tcBorders>
               <w:top w:val="single" w:color="BFBFBF" w:sz="4"/>
               <w:left w:val="single" w:color="BFBFBF" w:sz="4"/>
@@ -31103,7 +32345,7 @@
         </w:tc>
         <w:tc>
           <w:tcPr>
-            <w:tcW w:type="dxa" w:w="3804"/>
+            <w:tcW w:type="dxa" w:w="3829"/>
             <w:tcBorders>
               <w:top w:val="single" w:color="BFBFBF" w:sz="4"/>
               <w:left w:val="single" w:color="BFBFBF" w:sz="4"/>
@@ -31143,7 +32385,7 @@
         </w:trPr>
         <w:tc>
           <w:tcPr>
-            <w:tcW w:type="dxa" w:w="3894"/>
+            <w:tcW w:type="dxa" w:w="3647"/>
             <w:tcBorders>
               <w:top w:val="single" w:color="BFBFBF" w:sz="4"/>
               <w:left w:val="single" w:color="BFBFBF" w:sz="4"/>
@@ -31175,7 +32417,7 @@
         </w:tc>
         <w:tc>
           <w:tcPr>
-            <w:tcW w:type="dxa" w:w="990"/>
+            <w:tcW w:type="dxa" w:w="1212"/>
             <w:tcBorders>
               <w:top w:val="single" w:color="BFBFBF" w:sz="4"/>
               <w:left w:val="single" w:color="BFBFBF" w:sz="4"/>
@@ -31239,7 +32481,7 @@
         </w:tc>
         <w:tc>
           <w:tcPr>
-            <w:tcW w:type="dxa" w:w="3804"/>
+            <w:tcW w:type="dxa" w:w="3829"/>
             <w:tcBorders>
               <w:top w:val="single" w:color="BFBFBF" w:sz="4"/>
               <w:left w:val="single" w:color="BFBFBF" w:sz="4"/>
@@ -31276,39 +32518,71 @@
         </w:trPr>
         <w:tc>
           <w:tcPr>
-            <w:tcW w:type="dxa" w:w="3894"/>
-            <w:tcBorders>
-              <w:top w:val="single" w:color="BFBFBF" w:sz="4"/>
-              <w:left w:val="single" w:color="BFBFBF" w:sz="4"/>
-              <w:bottom w:val="single" w:color="BFBFBF" w:sz="4"/>
-              <w:right w:val="single" w:color="BFBFBF" w:sz="4"/>
-            </w:tcBorders>
-            <w:tcMar>
-              <w:top w:type="dxa" w:w="60"/>
-              <w:left w:type="dxa" w:w="100"/>
-              <w:bottom w:type="dxa" w:w="60"/>
-              <w:right w:type="dxa" w:w="100"/>
-            </w:tcMar>
-          </w:tcPr>
-          <w:p>
-            <w:pPr>
-              <w:bidi/>
-              <w:spacing w:after="0"/>
-            </w:pPr>
-            <w:r>
-              <w:rPr>
-                <w:rFonts w:ascii="Arial" w:cs="Arial" w:eastAsia="Arial" w:hAnsi="Arial"/>
-                <w:sz w:val="19"/>
-                <w:szCs w:val="19"/>
-                <w:rtl/>
-              </w:rPr>
-              <w:t xml:space="preserve">הספק של טיר 1 נראה נמוך כי רוב העבודה לא מתועדת</w:t>
-            </w:r>
-          </w:p>
-        </w:tc>
-        <w:tc>
-          <w:tcPr>
-            <w:tcW w:type="dxa" w:w="990"/>
+            <w:tcW w:type="dxa" w:w="3647"/>
+            <w:tcBorders>
+              <w:top w:val="single" w:color="BFBFBF" w:sz="4"/>
+              <w:left w:val="single" w:color="BFBFBF" w:sz="4"/>
+              <w:bottom w:val="single" w:color="BFBFBF" w:sz="4"/>
+              <w:right w:val="single" w:color="BFBFBF" w:sz="4"/>
+            </w:tcBorders>
+            <w:tcMar>
+              <w:top w:type="dxa" w:w="60"/>
+              <w:left w:type="dxa" w:w="100"/>
+              <w:bottom w:type="dxa" w:w="60"/>
+              <w:right w:type="dxa" w:w="100"/>
+            </w:tcMar>
+          </w:tcPr>
+          <w:p>
+            <w:pPr>
+              <w:bidi/>
+              <w:spacing w:after="0"/>
+            </w:pPr>
+            <w:r>
+              <w:rPr>
+                <w:rFonts w:ascii="Arial" w:cs="Arial" w:eastAsia="Arial" w:hAnsi="Arial"/>
+                <w:sz w:val="19"/>
+                <w:szCs w:val="19"/>
+                <w:rtl/>
+              </w:rPr>
+              <w:t xml:space="preserve">סוגי קייסים מעורבבים במדדי איכות (מעקבים נספרים כתקלות חוזרות, ניטור יזום מנפח עומס לקוח)</w:t>
+            </w:r>
+          </w:p>
+        </w:tc>
+        <w:tc>
+          <w:tcPr>
+            <w:tcW w:type="dxa" w:w="1212"/>
+            <w:tcBorders>
+              <w:top w:val="single" w:color="BFBFBF" w:sz="4"/>
+              <w:left w:val="single" w:color="BFBFBF" w:sz="4"/>
+              <w:bottom w:val="single" w:color="BFBFBF" w:sz="4"/>
+              <w:right w:val="single" w:color="BFBFBF" w:sz="4"/>
+            </w:tcBorders>
+            <w:tcMar>
+              <w:top w:type="dxa" w:w="60"/>
+              <w:left w:type="dxa" w:w="100"/>
+              <w:bottom w:type="dxa" w:w="60"/>
+              <w:right w:type="dxa" w:w="100"/>
+            </w:tcMar>
+          </w:tcPr>
+          <w:p>
+            <w:pPr>
+              <w:bidi/>
+              <w:spacing w:after="0"/>
+            </w:pPr>
+            <w:r>
+              <w:rPr>
+                <w:rFonts w:ascii="Arial" w:cs="Arial" w:eastAsia="Arial" w:hAnsi="Arial"/>
+                <w:sz w:val="19"/>
+                <w:szCs w:val="19"/>
+                <w:rtl/>
+              </w:rPr>
+              <w:t xml:space="preserve">גבוהה אם לא מפרידים</w:t>
+            </w:r>
+          </w:p>
+        </w:tc>
+        <w:tc>
+          <w:tcPr>
+            <w:tcW w:type="dxa" w:w="950"/>
             <w:tcBorders>
               <w:top w:val="single" w:color="BFBFBF" w:sz="4"/>
               <w:left w:val="single" w:color="BFBFBF" w:sz="4"/>
@@ -31340,65 +32614,33 @@
         </w:tc>
         <w:tc>
           <w:tcPr>
-            <w:tcW w:type="dxa" w:w="950"/>
-            <w:tcBorders>
-              <w:top w:val="single" w:color="BFBFBF" w:sz="4"/>
-              <w:left w:val="single" w:color="BFBFBF" w:sz="4"/>
-              <w:bottom w:val="single" w:color="BFBFBF" w:sz="4"/>
-              <w:right w:val="single" w:color="BFBFBF" w:sz="4"/>
-            </w:tcBorders>
-            <w:tcMar>
-              <w:top w:type="dxa" w:w="60"/>
-              <w:left w:type="dxa" w:w="100"/>
-              <w:bottom w:type="dxa" w:w="60"/>
-              <w:right w:type="dxa" w:w="100"/>
-            </w:tcMar>
-          </w:tcPr>
-          <w:p>
-            <w:pPr>
-              <w:bidi/>
-              <w:spacing w:after="0"/>
-            </w:pPr>
-            <w:r>
-              <w:rPr>
-                <w:rFonts w:ascii="Arial" w:cs="Arial" w:eastAsia="Arial" w:hAnsi="Arial"/>
-                <w:sz w:val="19"/>
-                <w:szCs w:val="19"/>
-                <w:rtl/>
-              </w:rPr>
-              <w:t xml:space="preserve">גבוהה</w:t>
-            </w:r>
-          </w:p>
-        </w:tc>
-        <w:tc>
-          <w:tcPr>
-            <w:tcW w:type="dxa" w:w="3804"/>
-            <w:tcBorders>
-              <w:top w:val="single" w:color="BFBFBF" w:sz="4"/>
-              <w:left w:val="single" w:color="BFBFBF" w:sz="4"/>
-              <w:bottom w:val="single" w:color="BFBFBF" w:sz="4"/>
-              <w:right w:val="single" w:color="BFBFBF" w:sz="4"/>
-            </w:tcBorders>
-            <w:tcMar>
-              <w:top w:type="dxa" w:w="60"/>
-              <w:left w:type="dxa" w:w="100"/>
-              <w:bottom w:type="dxa" w:w="60"/>
-              <w:right w:type="dxa" w:w="100"/>
-            </w:tcMar>
-          </w:tcPr>
-          <w:p>
-            <w:pPr>
-              <w:bidi/>
-              <w:spacing w:after="0"/>
-            </w:pPr>
-            <w:r>
-              <w:rPr>
-                <w:rFonts w:ascii="Arial" w:cs="Arial" w:eastAsia="Arial" w:hAnsi="Arial"/>
-                <w:sz w:val="19"/>
-                <w:szCs w:val="19"/>
-                <w:rtl/>
-              </w:rPr>
-              <w:t xml:space="preserve">SUP-4, ולא להציג הספק טיר 1 להנהלה לפני כן</w:t>
+            <w:tcW w:type="dxa" w:w="3829"/>
+            <w:tcBorders>
+              <w:top w:val="single" w:color="BFBFBF" w:sz="4"/>
+              <w:left w:val="single" w:color="BFBFBF" w:sz="4"/>
+              <w:bottom w:val="single" w:color="BFBFBF" w:sz="4"/>
+              <w:right w:val="single" w:color="BFBFBF" w:sz="4"/>
+            </w:tcBorders>
+            <w:tcMar>
+              <w:top w:type="dxa" w:w="60"/>
+              <w:left w:type="dxa" w:w="100"/>
+              <w:bottom w:type="dxa" w:w="60"/>
+              <w:right w:type="dxa" w:w="100"/>
+            </w:tcMar>
+          </w:tcPr>
+          <w:p>
+            <w:pPr>
+              <w:bidi/>
+              <w:spacing w:after="0"/>
+            </w:pPr>
+            <w:r>
+              <w:rPr>
+                <w:rFonts w:ascii="Arial" w:cs="Arial" w:eastAsia="Arial" w:hAnsi="Arial"/>
+                <w:sz w:val="19"/>
+                <w:szCs w:val="19"/>
+                <w:rtl/>
+              </w:rPr>
+              <w:t xml:space="preserve">סיווג לפי 8.11 (SUP-4)</w:t>
             </w:r>
           </w:p>
         </w:tc>
@@ -31409,7 +32651,7 @@
         </w:trPr>
         <w:tc>
           <w:tcPr>
-            <w:tcW w:type="dxa" w:w="3894"/>
+            <w:tcW w:type="dxa" w:w="3647"/>
             <w:tcBorders>
               <w:top w:val="single" w:color="BFBFBF" w:sz="4"/>
               <w:left w:val="single" w:color="BFBFBF" w:sz="4"/>
@@ -31441,7 +32683,7 @@
         </w:tc>
         <w:tc>
           <w:tcPr>
-            <w:tcW w:type="dxa" w:w="990"/>
+            <w:tcW w:type="dxa" w:w="1212"/>
             <w:tcBorders>
               <w:top w:val="single" w:color="BFBFBF" w:sz="4"/>
               <w:left w:val="single" w:color="BFBFBF" w:sz="4"/>
@@ -31505,7 +32747,7 @@
         </w:tc>
         <w:tc>
           <w:tcPr>
-            <w:tcW w:type="dxa" w:w="3804"/>
+            <w:tcW w:type="dxa" w:w="3829"/>
             <w:tcBorders>
               <w:top w:val="single" w:color="BFBFBF" w:sz="4"/>
               <w:left w:val="single" w:color="BFBFBF" w:sz="4"/>
@@ -31542,7 +32784,7 @@
         </w:trPr>
         <w:tc>
           <w:tcPr>
-            <w:tcW w:type="dxa" w:w="3894"/>
+            <w:tcW w:type="dxa" w:w="3647"/>
             <w:tcBorders>
               <w:top w:val="single" w:color="BFBFBF" w:sz="4"/>
               <w:left w:val="single" w:color="BFBFBF" w:sz="4"/>
@@ -31574,7 +32816,7 @@
         </w:tc>
         <w:tc>
           <w:tcPr>
-            <w:tcW w:type="dxa" w:w="990"/>
+            <w:tcW w:type="dxa" w:w="1212"/>
             <w:tcBorders>
               <w:top w:val="single" w:color="BFBFBF" w:sz="4"/>
               <w:left w:val="single" w:color="BFBFBF" w:sz="4"/>
@@ -31638,7 +32880,7 @@
         </w:tc>
         <w:tc>
           <w:tcPr>
-            <w:tcW w:type="dxa" w:w="3804"/>
+            <w:tcW w:type="dxa" w:w="3829"/>
             <w:tcBorders>
               <w:top w:val="single" w:color="BFBFBF" w:sz="4"/>
               <w:left w:val="single" w:color="BFBFBF" w:sz="4"/>
@@ -31675,7 +32917,7 @@
         </w:trPr>
         <w:tc>
           <w:tcPr>
-            <w:tcW w:type="dxa" w:w="3894"/>
+            <w:tcW w:type="dxa" w:w="3647"/>
             <w:tcBorders>
               <w:top w:val="single" w:color="BFBFBF" w:sz="4"/>
               <w:left w:val="single" w:color="BFBFBF" w:sz="4"/>
@@ -31707,7 +32949,7 @@
         </w:tc>
         <w:tc>
           <w:tcPr>
-            <w:tcW w:type="dxa" w:w="990"/>
+            <w:tcW w:type="dxa" w:w="1212"/>
             <w:tcBorders>
               <w:top w:val="single" w:color="BFBFBF" w:sz="4"/>
               <w:left w:val="single" w:color="BFBFBF" w:sz="4"/>
@@ -31771,7 +33013,7 @@
         </w:tc>
         <w:tc>
           <w:tcPr>
-            <w:tcW w:type="dxa" w:w="3804"/>
+            <w:tcW w:type="dxa" w:w="3829"/>
             <w:tcBorders>
               <w:top w:val="single" w:color="BFBFBF" w:sz="4"/>
               <w:left w:val="single" w:color="BFBFBF" w:sz="4"/>
@@ -31808,7 +33050,7 @@
         </w:trPr>
         <w:tc>
           <w:tcPr>
-            <w:tcW w:type="dxa" w:w="3894"/>
+            <w:tcW w:type="dxa" w:w="3647"/>
             <w:tcBorders>
               <w:top w:val="single" w:color="BFBFBF" w:sz="4"/>
               <w:left w:val="single" w:color="BFBFBF" w:sz="4"/>
@@ -31840,7 +33082,7 @@
         </w:tc>
         <w:tc>
           <w:tcPr>
-            <w:tcW w:type="dxa" w:w="990"/>
+            <w:tcW w:type="dxa" w:w="1212"/>
             <w:tcBorders>
               <w:top w:val="single" w:color="BFBFBF" w:sz="4"/>
               <w:left w:val="single" w:color="BFBFBF" w:sz="4"/>
@@ -31904,7 +33146,7 @@
         </w:tc>
         <w:tc>
           <w:tcPr>
-            <w:tcW w:type="dxa" w:w="3804"/>
+            <w:tcW w:type="dxa" w:w="3829"/>
             <w:tcBorders>
               <w:top w:val="single" w:color="BFBFBF" w:sz="4"/>
               <w:left w:val="single" w:color="BFBFBF" w:sz="4"/>
@@ -31941,7 +33183,7 @@
         </w:trPr>
         <w:tc>
           <w:tcPr>
-            <w:tcW w:type="dxa" w:w="3894"/>
+            <w:tcW w:type="dxa" w:w="3647"/>
             <w:tcBorders>
               <w:top w:val="single" w:color="BFBFBF" w:sz="4"/>
               <w:left w:val="single" w:color="BFBFBF" w:sz="4"/>
@@ -31973,7 +33215,7 @@
         </w:tc>
         <w:tc>
           <w:tcPr>
-            <w:tcW w:type="dxa" w:w="990"/>
+            <w:tcW w:type="dxa" w:w="1212"/>
             <w:tcBorders>
               <w:top w:val="single" w:color="BFBFBF" w:sz="4"/>
               <w:left w:val="single" w:color="BFBFBF" w:sz="4"/>
@@ -32037,7 +33279,7 @@
         </w:tc>
         <w:tc>
           <w:tcPr>
-            <w:tcW w:type="dxa" w:w="3804"/>
+            <w:tcW w:type="dxa" w:w="3829"/>
             <w:tcBorders>
               <w:top w:val="single" w:color="BFBFBF" w:sz="4"/>
               <w:left w:val="single" w:color="BFBFBF" w:sz="4"/>
@@ -32074,7 +33316,7 @@
         </w:trPr>
         <w:tc>
           <w:tcPr>
-            <w:tcW w:type="dxa" w:w="3894"/>
+            <w:tcW w:type="dxa" w:w="3647"/>
             <w:tcBorders>
               <w:top w:val="single" w:color="BFBFBF" w:sz="4"/>
               <w:left w:val="single" w:color="BFBFBF" w:sz="4"/>
@@ -32106,7 +33348,7 @@
         </w:tc>
         <w:tc>
           <w:tcPr>
-            <w:tcW w:type="dxa" w:w="990"/>
+            <w:tcW w:type="dxa" w:w="1212"/>
             <w:tcBorders>
               <w:top w:val="single" w:color="BFBFBF" w:sz="4"/>
               <w:left w:val="single" w:color="BFBFBF" w:sz="4"/>
@@ -32170,7 +33412,7 @@
         </w:tc>
         <w:tc>
           <w:tcPr>
-            <w:tcW w:type="dxa" w:w="3804"/>
+            <w:tcW w:type="dxa" w:w="3829"/>
             <w:tcBorders>
               <w:top w:val="single" w:color="BFBFBF" w:sz="4"/>
               <w:left w:val="single" w:color="BFBFBF" w:sz="4"/>
@@ -32207,7 +33449,7 @@
         </w:trPr>
         <w:tc>
           <w:tcPr>
-            <w:tcW w:type="dxa" w:w="3894"/>
+            <w:tcW w:type="dxa" w:w="3647"/>
             <w:tcBorders>
               <w:top w:val="single" w:color="BFBFBF" w:sz="4"/>
               <w:left w:val="single" w:color="BFBFBF" w:sz="4"/>
@@ -32239,7 +33481,7 @@
         </w:tc>
         <w:tc>
           <w:tcPr>
-            <w:tcW w:type="dxa" w:w="990"/>
+            <w:tcW w:type="dxa" w:w="1212"/>
             <w:tcBorders>
               <w:top w:val="single" w:color="BFBFBF" w:sz="4"/>
               <w:left w:val="single" w:color="BFBFBF" w:sz="4"/>
@@ -32303,7 +33545,7 @@
         </w:tc>
         <w:tc>
           <w:tcPr>
-            <w:tcW w:type="dxa" w:w="3804"/>
+            <w:tcW w:type="dxa" w:w="3829"/>
             <w:tcBorders>
               <w:top w:val="single" w:color="BFBFBF" w:sz="4"/>
               <w:left w:val="single" w:color="BFBFBF" w:sz="4"/>
@@ -32340,7 +33582,7 @@
         </w:trPr>
         <w:tc>
           <w:tcPr>
-            <w:tcW w:type="dxa" w:w="3894"/>
+            <w:tcW w:type="dxa" w:w="3647"/>
             <w:tcBorders>
               <w:top w:val="single" w:color="BFBFBF" w:sz="4"/>
               <w:left w:val="single" w:color="BFBFBF" w:sz="4"/>
@@ -32372,7 +33614,7 @@
         </w:tc>
         <w:tc>
           <w:tcPr>
-            <w:tcW w:type="dxa" w:w="990"/>
+            <w:tcW w:type="dxa" w:w="1212"/>
             <w:tcBorders>
               <w:top w:val="single" w:color="BFBFBF" w:sz="4"/>
               <w:left w:val="single" w:color="BFBFBF" w:sz="4"/>
@@ -32436,7 +33678,7 @@
         </w:tc>
         <w:tc>
           <w:tcPr>
-            <w:tcW w:type="dxa" w:w="3804"/>
+            <w:tcW w:type="dxa" w:w="3829"/>
             <w:tcBorders>
               <w:top w:val="single" w:color="BFBFBF" w:sz="4"/>
               <w:left w:val="single" w:color="BFBFBF" w:sz="4"/>
@@ -32473,7 +33715,7 @@
         </w:trPr>
         <w:tc>
           <w:tcPr>
-            <w:tcW w:type="dxa" w:w="3894"/>
+            <w:tcW w:type="dxa" w:w="3647"/>
             <w:tcBorders>
               <w:top w:val="single" w:color="BFBFBF" w:sz="4"/>
               <w:left w:val="single" w:color="BFBFBF" w:sz="4"/>
@@ -32505,7 +33747,7 @@
         </w:tc>
         <w:tc>
           <w:tcPr>
-            <w:tcW w:type="dxa" w:w="990"/>
+            <w:tcW w:type="dxa" w:w="1212"/>
             <w:tcBorders>
               <w:top w:val="single" w:color="BFBFBF" w:sz="4"/>
               <w:left w:val="single" w:color="BFBFBF" w:sz="4"/>
@@ -32569,7 +33811,7 @@
         </w:tc>
         <w:tc>
           <w:tcPr>
-            <w:tcW w:type="dxa" w:w="3804"/>
+            <w:tcW w:type="dxa" w:w="3829"/>
             <w:tcBorders>
               <w:top w:val="single" w:color="BFBFBF" w:sz="4"/>
               <w:left w:val="single" w:color="BFBFBF" w:sz="4"/>
@@ -32606,7 +33848,7 @@
         </w:trPr>
         <w:tc>
           <w:tcPr>
-            <w:tcW w:type="dxa" w:w="3894"/>
+            <w:tcW w:type="dxa" w:w="3647"/>
             <w:tcBorders>
               <w:top w:val="single" w:color="BFBFBF" w:sz="4"/>
               <w:left w:val="single" w:color="BFBFBF" w:sz="4"/>
@@ -32638,7 +33880,7 @@
         </w:tc>
         <w:tc>
           <w:tcPr>
-            <w:tcW w:type="dxa" w:w="990"/>
+            <w:tcW w:type="dxa" w:w="1212"/>
             <w:tcBorders>
               <w:top w:val="single" w:color="BFBFBF" w:sz="4"/>
               <w:left w:val="single" w:color="BFBFBF" w:sz="4"/>
@@ -32702,7 +33944,7 @@
         </w:tc>
         <w:tc>
           <w:tcPr>
-            <w:tcW w:type="dxa" w:w="3804"/>
+            <w:tcW w:type="dxa" w:w="3829"/>
             <w:tcBorders>
               <w:top w:val="single" w:color="BFBFBF" w:sz="4"/>
               <w:left w:val="single" w:color="BFBFBF" w:sz="4"/>
@@ -32739,7 +33981,7 @@
         </w:trPr>
         <w:tc>
           <w:tcPr>
-            <w:tcW w:type="dxa" w:w="3894"/>
+            <w:tcW w:type="dxa" w:w="3647"/>
             <w:tcBorders>
               <w:top w:val="single" w:color="BFBFBF" w:sz="4"/>
               <w:left w:val="single" w:color="BFBFBF" w:sz="4"/>
@@ -32771,7 +34013,7 @@
         </w:tc>
         <w:tc>
           <w:tcPr>
-            <w:tcW w:type="dxa" w:w="990"/>
+            <w:tcW w:type="dxa" w:w="1212"/>
             <w:tcBorders>
               <w:top w:val="single" w:color="BFBFBF" w:sz="4"/>
               <w:left w:val="single" w:color="BFBFBF" w:sz="4"/>
@@ -32835,7 +34077,7 @@
         </w:tc>
         <w:tc>
           <w:tcPr>
-            <w:tcW w:type="dxa" w:w="3804"/>
+            <w:tcW w:type="dxa" w:w="3829"/>
             <w:tcBorders>
               <w:top w:val="single" w:color="BFBFBF" w:sz="4"/>
               <w:left w:val="single" w:color="BFBFBF" w:sz="4"/>
@@ -32872,7 +34114,7 @@
         </w:trPr>
         <w:tc>
           <w:tcPr>
-            <w:tcW w:type="dxa" w:w="3894"/>
+            <w:tcW w:type="dxa" w:w="3647"/>
             <w:tcBorders>
               <w:top w:val="single" w:color="BFBFBF" w:sz="4"/>
               <w:left w:val="single" w:color="BFBFBF" w:sz="4"/>
@@ -32904,7 +34146,7 @@
         </w:tc>
         <w:tc>
           <w:tcPr>
-            <w:tcW w:type="dxa" w:w="990"/>
+            <w:tcW w:type="dxa" w:w="1212"/>
             <w:tcBorders>
               <w:top w:val="single" w:color="BFBFBF" w:sz="4"/>
               <w:left w:val="single" w:color="BFBFBF" w:sz="4"/>
@@ -32968,7 +34210,7 @@
         </w:tc>
         <w:tc>
           <w:tcPr>
-            <w:tcW w:type="dxa" w:w="3804"/>
+            <w:tcW w:type="dxa" w:w="3829"/>
             <w:tcBorders>
               <w:top w:val="single" w:color="BFBFBF" w:sz="4"/>
               <w:left w:val="single" w:color="BFBFBF" w:sz="4"/>
@@ -33048,9 +34290,9 @@
       </w:tblPr>
       <w:tblGrid>
         <w:gridCol w:w="950"/>
-        <w:gridCol w:w="4817"/>
-        <w:gridCol w:w="2409"/>
-        <w:gridCol w:w="1462"/>
+        <w:gridCol w:w="4715"/>
+        <w:gridCol w:w="2536"/>
+        <w:gridCol w:w="1437"/>
       </w:tblGrid>
       <w:tr>
         <w:trPr>
@@ -33093,7 +34335,7 @@
         </w:tc>
         <w:tc>
           <w:tcPr>
-            <w:tcW w:type="dxa" w:w="4817"/>
+            <w:tcW w:type="dxa" w:w="4715"/>
             <w:tcBorders>
               <w:top w:val="single" w:color="BFBFBF" w:sz="4"/>
               <w:left w:val="single" w:color="BFBFBF" w:sz="4"/>
@@ -33128,7 +34370,7 @@
         </w:tc>
         <w:tc>
           <w:tcPr>
-            <w:tcW w:type="dxa" w:w="2409"/>
+            <w:tcW w:type="dxa" w:w="2536"/>
             <w:tcBorders>
               <w:top w:val="single" w:color="BFBFBF" w:sz="4"/>
               <w:left w:val="single" w:color="BFBFBF" w:sz="4"/>
@@ -33163,7 +34405,7 @@
         </w:tc>
         <w:tc>
           <w:tcPr>
-            <w:tcW w:type="dxa" w:w="1462"/>
+            <w:tcW w:type="dxa" w:w="1437"/>
             <w:tcBorders>
               <w:top w:val="single" w:color="BFBFBF" w:sz="4"/>
               <w:left w:val="single" w:color="BFBFBF" w:sz="4"/>
@@ -33235,7 +34477,7 @@
         </w:tc>
         <w:tc>
           <w:tcPr>
-            <w:tcW w:type="dxa" w:w="4817"/>
+            <w:tcW w:type="dxa" w:w="4715"/>
             <w:tcBorders>
               <w:top w:val="single" w:color="BFBFBF" w:sz="4"/>
               <w:left w:val="single" w:color="BFBFBF" w:sz="4"/>
@@ -33267,7 +34509,7 @@
         </w:tc>
         <w:tc>
           <w:tcPr>
-            <w:tcW w:type="dxa" w:w="2409"/>
+            <w:tcW w:type="dxa" w:w="2536"/>
             <w:tcBorders>
               <w:top w:val="single" w:color="BFBFBF" w:sz="4"/>
               <w:left w:val="single" w:color="BFBFBF" w:sz="4"/>
@@ -33299,7 +34541,7 @@
         </w:tc>
         <w:tc>
           <w:tcPr>
-            <w:tcW w:type="dxa" w:w="1462"/>
+            <w:tcW w:type="dxa" w:w="1437"/>
             <w:tcBorders>
               <w:top w:val="single" w:color="BFBFBF" w:sz="4"/>
               <w:left w:val="single" w:color="BFBFBF" w:sz="4"/>
@@ -33368,7 +34610,7 @@
         </w:tc>
         <w:tc>
           <w:tcPr>
-            <w:tcW w:type="dxa" w:w="4817"/>
+            <w:tcW w:type="dxa" w:w="4715"/>
             <w:tcBorders>
               <w:top w:val="single" w:color="BFBFBF" w:sz="4"/>
               <w:left w:val="single" w:color="BFBFBF" w:sz="4"/>
@@ -33400,7 +34642,7 @@
         </w:tc>
         <w:tc>
           <w:tcPr>
-            <w:tcW w:type="dxa" w:w="2409"/>
+            <w:tcW w:type="dxa" w:w="2536"/>
             <w:tcBorders>
               <w:top w:val="single" w:color="BFBFBF" w:sz="4"/>
               <w:left w:val="single" w:color="BFBFBF" w:sz="4"/>
@@ -33432,7 +34674,7 @@
         </w:tc>
         <w:tc>
           <w:tcPr>
-            <w:tcW w:type="dxa" w:w="1462"/>
+            <w:tcW w:type="dxa" w:w="1437"/>
             <w:tcBorders>
               <w:top w:val="single" w:color="BFBFBF" w:sz="4"/>
               <w:left w:val="single" w:color="BFBFBF" w:sz="4"/>
@@ -33501,7 +34743,7 @@
         </w:tc>
         <w:tc>
           <w:tcPr>
-            <w:tcW w:type="dxa" w:w="4817"/>
+            <w:tcW w:type="dxa" w:w="4715"/>
             <w:tcBorders>
               <w:top w:val="single" w:color="BFBFBF" w:sz="4"/>
               <w:left w:val="single" w:color="BFBFBF" w:sz="4"/>
@@ -33533,7 +34775,7 @@
         </w:tc>
         <w:tc>
           <w:tcPr>
-            <w:tcW w:type="dxa" w:w="2409"/>
+            <w:tcW w:type="dxa" w:w="2536"/>
             <w:tcBorders>
               <w:top w:val="single" w:color="BFBFBF" w:sz="4"/>
               <w:left w:val="single" w:color="BFBFBF" w:sz="4"/>
@@ -33565,7 +34807,7 @@
         </w:tc>
         <w:tc>
           <w:tcPr>
-            <w:tcW w:type="dxa" w:w="1462"/>
+            <w:tcW w:type="dxa" w:w="1437"/>
             <w:tcBorders>
               <w:top w:val="single" w:color="BFBFBF" w:sz="4"/>
               <w:left w:val="single" w:color="BFBFBF" w:sz="4"/>
@@ -33634,7 +34876,7 @@
         </w:tc>
         <w:tc>
           <w:tcPr>
-            <w:tcW w:type="dxa" w:w="4817"/>
+            <w:tcW w:type="dxa" w:w="4715"/>
             <w:tcBorders>
               <w:top w:val="single" w:color="BFBFBF" w:sz="4"/>
               <w:left w:val="single" w:color="BFBFBF" w:sz="4"/>
@@ -33666,7 +34908,7 @@
         </w:tc>
         <w:tc>
           <w:tcPr>
-            <w:tcW w:type="dxa" w:w="2409"/>
+            <w:tcW w:type="dxa" w:w="2536"/>
             <w:tcBorders>
               <w:top w:val="single" w:color="BFBFBF" w:sz="4"/>
               <w:left w:val="single" w:color="BFBFBF" w:sz="4"/>
@@ -33698,7 +34940,7 @@
         </w:tc>
         <w:tc>
           <w:tcPr>
-            <w:tcW w:type="dxa" w:w="1462"/>
+            <w:tcW w:type="dxa" w:w="1437"/>
             <w:tcBorders>
               <w:top w:val="single" w:color="BFBFBF" w:sz="4"/>
               <w:left w:val="single" w:color="BFBFBF" w:sz="4"/>
@@ -33767,7 +35009,7 @@
         </w:tc>
         <w:tc>
           <w:tcPr>
-            <w:tcW w:type="dxa" w:w="4817"/>
+            <w:tcW w:type="dxa" w:w="4715"/>
             <w:tcBorders>
               <w:top w:val="single" w:color="BFBFBF" w:sz="4"/>
               <w:left w:val="single" w:color="BFBFBF" w:sz="4"/>
@@ -33799,7 +35041,7 @@
         </w:tc>
         <w:tc>
           <w:tcPr>
-            <w:tcW w:type="dxa" w:w="2409"/>
+            <w:tcW w:type="dxa" w:w="2536"/>
             <w:tcBorders>
               <w:top w:val="single" w:color="BFBFBF" w:sz="4"/>
               <w:left w:val="single" w:color="BFBFBF" w:sz="4"/>
@@ -33831,7 +35073,7 @@
         </w:tc>
         <w:tc>
           <w:tcPr>
-            <w:tcW w:type="dxa" w:w="1462"/>
+            <w:tcW w:type="dxa" w:w="1437"/>
             <w:tcBorders>
               <w:top w:val="single" w:color="BFBFBF" w:sz="4"/>
               <w:left w:val="single" w:color="BFBFBF" w:sz="4"/>
@@ -33900,7 +35142,7 @@
         </w:tc>
         <w:tc>
           <w:tcPr>
-            <w:tcW w:type="dxa" w:w="4817"/>
+            <w:tcW w:type="dxa" w:w="4715"/>
             <w:tcBorders>
               <w:top w:val="single" w:color="BFBFBF" w:sz="4"/>
               <w:left w:val="single" w:color="BFBFBF" w:sz="4"/>
@@ -33932,7 +35174,7 @@
         </w:tc>
         <w:tc>
           <w:tcPr>
-            <w:tcW w:type="dxa" w:w="2409"/>
+            <w:tcW w:type="dxa" w:w="2536"/>
             <w:tcBorders>
               <w:top w:val="single" w:color="BFBFBF" w:sz="4"/>
               <w:left w:val="single" w:color="BFBFBF" w:sz="4"/>
@@ -33964,7 +35206,7 @@
         </w:tc>
         <w:tc>
           <w:tcPr>
-            <w:tcW w:type="dxa" w:w="1462"/>
+            <w:tcW w:type="dxa" w:w="1437"/>
             <w:tcBorders>
               <w:top w:val="single" w:color="BFBFBF" w:sz="4"/>
               <w:left w:val="single" w:color="BFBFBF" w:sz="4"/>
@@ -34033,7 +35275,7 @@
         </w:tc>
         <w:tc>
           <w:tcPr>
-            <w:tcW w:type="dxa" w:w="4817"/>
+            <w:tcW w:type="dxa" w:w="4715"/>
             <w:tcBorders>
               <w:top w:val="single" w:color="BFBFBF" w:sz="4"/>
               <w:left w:val="single" w:color="BFBFBF" w:sz="4"/>
@@ -34065,7 +35307,7 @@
         </w:tc>
         <w:tc>
           <w:tcPr>
-            <w:tcW w:type="dxa" w:w="2409"/>
+            <w:tcW w:type="dxa" w:w="2536"/>
             <w:tcBorders>
               <w:top w:val="single" w:color="BFBFBF" w:sz="4"/>
               <w:left w:val="single" w:color="BFBFBF" w:sz="4"/>
@@ -34097,7 +35339,7 @@
         </w:tc>
         <w:tc>
           <w:tcPr>
-            <w:tcW w:type="dxa" w:w="1462"/>
+            <w:tcW w:type="dxa" w:w="1437"/>
             <w:tcBorders>
               <w:top w:val="single" w:color="BFBFBF" w:sz="4"/>
               <w:left w:val="single" w:color="BFBFBF" w:sz="4"/>
@@ -34166,71 +35408,71 @@
         </w:tc>
         <w:tc>
           <w:tcPr>
-            <w:tcW w:type="dxa" w:w="4817"/>
-            <w:tcBorders>
-              <w:top w:val="single" w:color="BFBFBF" w:sz="4"/>
-              <w:left w:val="single" w:color="BFBFBF" w:sz="4"/>
-              <w:bottom w:val="single" w:color="BFBFBF" w:sz="4"/>
-              <w:right w:val="single" w:color="BFBFBF" w:sz="4"/>
-            </w:tcBorders>
-            <w:tcMar>
-              <w:top w:type="dxa" w:w="60"/>
-              <w:left w:type="dxa" w:w="100"/>
-              <w:bottom w:type="dxa" w:w="60"/>
-              <w:right w:type="dxa" w:w="100"/>
-            </w:tcMar>
-          </w:tcPr>
-          <w:p>
-            <w:pPr>
-              <w:bidi/>
-              <w:spacing w:after="0"/>
-            </w:pPr>
-            <w:r>
-              <w:rPr>
-                <w:rFonts w:ascii="Arial" w:cs="Arial" w:eastAsia="Arial" w:hAnsi="Arial"/>
-                <w:sz w:val="19"/>
-                <w:szCs w:val="19"/>
-                <w:rtl/>
-              </w:rPr>
-              <w:t xml:space="preserve">איך מתועדות העבודות היזומות של טיר 1</w:t>
-            </w:r>
-          </w:p>
-        </w:tc>
-        <w:tc>
-          <w:tcPr>
-            <w:tcW w:type="dxa" w:w="2409"/>
-            <w:tcBorders>
-              <w:top w:val="single" w:color="BFBFBF" w:sz="4"/>
-              <w:left w:val="single" w:color="BFBFBF" w:sz="4"/>
-              <w:bottom w:val="single" w:color="BFBFBF" w:sz="4"/>
-              <w:right w:val="single" w:color="BFBFBF" w:sz="4"/>
-            </w:tcBorders>
-            <w:tcMar>
-              <w:top w:type="dxa" w:w="60"/>
-              <w:left w:type="dxa" w:w="100"/>
-              <w:bottom w:type="dxa" w:w="60"/>
-              <w:right w:type="dxa" w:w="100"/>
-            </w:tcMar>
-          </w:tcPr>
-          <w:p>
-            <w:pPr>
-              <w:bidi/>
-              <w:spacing w:after="0"/>
-            </w:pPr>
-            <w:r>
-              <w:rPr>
-                <w:rFonts w:ascii="Arial" w:cs="Arial" w:eastAsia="Arial" w:hAnsi="Arial"/>
-                <w:sz w:val="19"/>
-                <w:szCs w:val="19"/>
-                <w:rtl/>
-              </w:rPr>
-              <w:t xml:space="preserve">מנהל התמיכה</w:t>
-            </w:r>
-          </w:p>
-        </w:tc>
-        <w:tc>
-          <w:tcPr>
-            <w:tcW w:type="dxa" w:w="1462"/>
+            <w:tcW w:type="dxa" w:w="4715"/>
+            <w:tcBorders>
+              <w:top w:val="single" w:color="BFBFBF" w:sz="4"/>
+              <w:left w:val="single" w:color="BFBFBF" w:sz="4"/>
+              <w:bottom w:val="single" w:color="BFBFBF" w:sz="4"/>
+              <w:right w:val="single" w:color="BFBFBF" w:sz="4"/>
+            </w:tcBorders>
+            <w:tcMar>
+              <w:top w:type="dxa" w:w="60"/>
+              <w:left w:type="dxa" w:w="100"/>
+              <w:bottom w:type="dxa" w:w="60"/>
+              <w:right w:type="dxa" w:w="100"/>
+            </w:tcMar>
+          </w:tcPr>
+          <w:p>
+            <w:pPr>
+              <w:bidi/>
+              <w:spacing w:after="0"/>
+            </w:pPr>
+            <w:r>
+              <w:rPr>
+                <w:rFonts w:ascii="Arial" w:cs="Arial" w:eastAsia="Arial" w:hAnsi="Arial"/>
+                <w:sz w:val="19"/>
+                <w:szCs w:val="19"/>
+                <w:rtl/>
+              </w:rPr>
+              <w:t xml:space="preserve">איזה שדה בקייס מזהה את סוג העבודה (תקלה, מעקב, ניטור יזום, התקנה מרחוק)</w:t>
+            </w:r>
+          </w:p>
+        </w:tc>
+        <w:tc>
+          <w:tcPr>
+            <w:tcW w:type="dxa" w:w="2536"/>
+            <w:tcBorders>
+              <w:top w:val="single" w:color="BFBFBF" w:sz="4"/>
+              <w:left w:val="single" w:color="BFBFBF" w:sz="4"/>
+              <w:bottom w:val="single" w:color="BFBFBF" w:sz="4"/>
+              <w:right w:val="single" w:color="BFBFBF" w:sz="4"/>
+            </w:tcBorders>
+            <w:tcMar>
+              <w:top w:type="dxa" w:w="60"/>
+              <w:left w:type="dxa" w:w="100"/>
+              <w:bottom w:type="dxa" w:w="60"/>
+              <w:right w:type="dxa" w:w="100"/>
+            </w:tcMar>
+          </w:tcPr>
+          <w:p>
+            <w:pPr>
+              <w:bidi/>
+              <w:spacing w:after="0"/>
+            </w:pPr>
+            <w:r>
+              <w:rPr>
+                <w:rFonts w:ascii="Arial" w:cs="Arial" w:eastAsia="Arial" w:hAnsi="Arial"/>
+                <w:sz w:val="19"/>
+                <w:szCs w:val="19"/>
+                <w:rtl/>
+              </w:rPr>
+              <w:t xml:space="preserve">Salesforce Admin / מנהל התמיכה</w:t>
+            </w:r>
+          </w:p>
+        </w:tc>
+        <w:tc>
+          <w:tcPr>
+            <w:tcW w:type="dxa" w:w="1437"/>
             <w:tcBorders>
               <w:top w:val="single" w:color="BFBFBF" w:sz="4"/>
               <w:left w:val="single" w:color="BFBFBF" w:sz="4"/>
@@ -34299,7 +35541,7 @@
         </w:tc>
         <w:tc>
           <w:tcPr>
-            <w:tcW w:type="dxa" w:w="4817"/>
+            <w:tcW w:type="dxa" w:w="4715"/>
             <w:tcBorders>
               <w:top w:val="single" w:color="BFBFBF" w:sz="4"/>
               <w:left w:val="single" w:color="BFBFBF" w:sz="4"/>
@@ -34331,7 +35573,7 @@
         </w:tc>
         <w:tc>
           <w:tcPr>
-            <w:tcW w:type="dxa" w:w="2409"/>
+            <w:tcW w:type="dxa" w:w="2536"/>
             <w:tcBorders>
               <w:top w:val="single" w:color="BFBFBF" w:sz="4"/>
               <w:left w:val="single" w:color="BFBFBF" w:sz="4"/>
@@ -34363,7 +35605,7 @@
         </w:tc>
         <w:tc>
           <w:tcPr>
-            <w:tcW w:type="dxa" w:w="1462"/>
+            <w:tcW w:type="dxa" w:w="1437"/>
             <w:tcBorders>
               <w:top w:val="single" w:color="BFBFBF" w:sz="4"/>
               <w:left w:val="single" w:color="BFBFBF" w:sz="4"/>
@@ -34432,7 +35674,7 @@
         </w:tc>
         <w:tc>
           <w:tcPr>
-            <w:tcW w:type="dxa" w:w="4817"/>
+            <w:tcW w:type="dxa" w:w="4715"/>
             <w:tcBorders>
               <w:top w:val="single" w:color="BFBFBF" w:sz="4"/>
               <w:left w:val="single" w:color="BFBFBF" w:sz="4"/>
@@ -34464,7 +35706,7 @@
         </w:tc>
         <w:tc>
           <w:tcPr>
-            <w:tcW w:type="dxa" w:w="2409"/>
+            <w:tcW w:type="dxa" w:w="2536"/>
             <w:tcBorders>
               <w:top w:val="single" w:color="BFBFBF" w:sz="4"/>
               <w:left w:val="single" w:color="BFBFBF" w:sz="4"/>
@@ -34496,7 +35738,7 @@
         </w:tc>
         <w:tc>
           <w:tcPr>
-            <w:tcW w:type="dxa" w:w="1462"/>
+            <w:tcW w:type="dxa" w:w="1437"/>
             <w:tcBorders>
               <w:top w:val="single" w:color="BFBFBF" w:sz="4"/>
               <w:left w:val="single" w:color="BFBFBF" w:sz="4"/>

</xml_diff>

<commit_message>
Use real case volume (~10,000/month) and Case Type field
- Spec: volumes, sizing and noise rationale updated for ~10,000 cases a
  month across all case types; Case Type is the classification field
- Mockup: data rescaled to the real volume; quality and hospital views
  labeled as customer-reported cases only

Co-Authored-By: Claude Opus 5.5 <noreply@anthropic.com>
Claude-Session: https://claude.ai/code/session_01YcEMp91cmPuH2YbvGBFx73
</commit_message>
<xml_diff>
--- a/docs/MVP-Support-Control-Tower.docx
+++ b/docs/MVP-Support-Control-Tower.docx
@@ -1001,14 +1001,14 @@
           <w:bCs/>
           <w:rtl/>
         </w:rPr>
-        <w:t xml:space="preserve">הנתונים קטנים:</w:t>
+        <w:t xml:space="preserve">הנתונים בגודל בינוני:</w:t>
       </w:r>
       <w:r>
         <w:rPr>
           <w:rFonts w:ascii="Arial" w:cs="Arial" w:eastAsia="Arial" w:hAnsi="Arial"/>
           <w:rtl/>
         </w:rPr>
-        <w:t xml:space="preserve"> כ-25,000 קייסים ובקשות ב-24 חודשים. הכול נכנס לזיכרון של Spotfire.</w:t>
+        <w:t xml:space="preserve"> כ-240,000 קייסים ב-24 חודשים, ועוד הבקשות והשיחות. זה עדיין נכנס בנוחות לזיכרון של Spotfire.</w:t>
       </w:r>
     </w:p>
     <w:p>
@@ -1191,7 +1191,7 @@
           <w:rFonts w:ascii="Arial" w:cs="Arial" w:eastAsia="Arial" w:hAnsi="Arial"/>
           <w:rtl/>
         </w:rPr>
-        <w:t xml:space="preserve"> כ-100 שיחות ביום, כ-50 מיילים ביום, וכ-1,000 קייסים חדשים בחודש בטיר 1.</w:t>
+        <w:t xml:space="preserve"> כ-100 שיחות נכנסות ביום, כ-50 מיילים ביום, וכ-10,000 קייסים בחודש מכל הסוגים (תקלות, מעקבים, ניטור יזום והתקנות מרחוק). זה בערך 10 קייסים לתומך טיר 1 במשמרת.</w:t>
       </w:r>
     </w:p>
     <w:p>
@@ -6610,7 +6610,7 @@
           <w:rFonts w:ascii="Arial" w:cs="Arial" w:eastAsia="Arial" w:hAnsi="Arial"/>
           <w:rtl/>
         </w:rPr>
-        <w:t xml:space="preserve"> בכ-1,000 קייסים בחודש, השאיבה האינקרמנטלית זניחה.</w:t>
+        <w:t xml:space="preserve"> בכ-10,000 קייסים בחודש (כ-330 ביום), שאיבה אינקרמנטלית כל 5-15 דקות מעבירה כמה קייסים בכל ריצה. הצריכה זניחה ביחס למגבלות ה-API.</w:t>
       </w:r>
     </w:p>
     <w:p>
@@ -7928,7 +7928,7 @@
           <w:rFonts w:ascii="Arial" w:cs="Arial" w:eastAsia="Arial" w:hAnsi="Arial"/>
           <w:rtl/>
         </w:rPr>
-        <w:t xml:space="preserve"> 24 חודשים הם כ-25,000 קייסים ובקשות, ועוד כ-75,000 שיחות. לכן עדיף מצב imported עם רענון מתוזמן, ולא שאילתות חיות למסד. זה פשוט יותר, מהיר יותר ופחות תלוי ברשת.</w:t>
+        <w:t xml:space="preserve"> 24 חודשים הם כ-240,000 קייסים, עשרות אלפי בקשות וכ-75,000 שיחות. בטבלאות העובדה הגדולות (היסטוריית סטטוסים) יהיו כמה מיליוני שורות, ולכן כדאי לטעון ל-Spotfire טבלאות מסוכמות מה-DW, ואת הפירוט המלא רק לפי דרישה (on-demand). לכן עדיף מצב imported עם רענון מתוזמן, ולא שאילתות חיות למסד. זה פשוט יותר, מהיר יותר ופחות תלוי ברשת.</w:t>
       </w:r>
     </w:p>
     <w:p>
@@ -12937,7 +12937,7 @@
           <w:szCs w:val="20"/>
           <w:rtl/>
         </w:rPr>
-        <w:t xml:space="preserve"> בכ-1,000 קייסים בחודש שמתחלקים בין מוצרים, גרסאות וכ-150 תתי-קטגוריות, חלון של 30 יום נותן לרוב הגרסאות מספרים חד-ספרתיים, ואז הדירוג משתנה מחודש לחודש בלי סיבה אמיתית.</w:t>
+        <w:t xml:space="preserve"> רק חלק מ-10,000 הקייסים החודשיים הם תקלות. כשהתקלות מתחלקות בין מוצרים, גרסאות וכ-150 תתי-קטגוריות, חלון של 30 יום נותן לרוב הגרסאות מספרים חד-ספרתיים, ואז הדירוג משתנה מחודש לחודש בלי סיבה אמיתית.</w:t>
       </w:r>
     </w:p>
     <w:p>
@@ -13441,7 +13441,7 @@
           <w:szCs w:val="20"/>
           <w:rtl/>
         </w:rPr>
-        <w:t xml:space="preserve">בממוצע יש כ-2 קייסים לבית חולים בחודש. לכן הדירוג מחושב על 90 יום ומוצג תמיד בשתי תצוגות, מוחלט ומנורמל.</w:t>
+        <w:t xml:space="preserve">בממוצע יש כ-20 קייסים לבית חולים בחודש מכל הסוגים, ורק חלק מהם תקלות. הדירוג מחושב על תקלות בלבד, על 90 יום, ומוצג תמיד בשתי תצוגות, מוחלט ומנורמל.</w:t>
       </w:r>
     </w:p>
     <w:p>
@@ -17632,7 +17632,23 @@
           <w:rFonts w:ascii="Arial" w:cs="Arial" w:eastAsia="Arial" w:hAnsi="Arial"/>
           <w:rtl/>
         </w:rPr>
-        <w:t xml:space="preserve">כל פעולה של טיר 1 היא קייס, ולכן יש ב-Salesforce גם קייסים שאינם תקלה של לקוח. כל קייס מסווג לאחד מארבעה סוגים (לפי שדה Type, Origin או שדה אחר, לאישור ב-SUP-4):</w:t>
+        <w:t xml:space="preserve">כל פעולה של טיר 1 היא קייס, ולכן יש ב-Salesforce גם קייסים שאינם תקלה של לקוח. כל קייס מסווג לאחד מארבעה סוגים לפי השדה </w:t>
+      </w:r>
+      <w:r>
+        <w:rPr>
+          <w:rFonts w:ascii="Arial" w:cs="Arial" w:eastAsia="Arial" w:hAnsi="Arial"/>
+          <w:b/>
+          <w:bCs/>
+          <w:rtl/>
+        </w:rPr>
+        <w:t xml:space="preserve">Case Type</w:t>
+      </w:r>
+      <w:r>
+        <w:rPr>
+          <w:rFonts w:ascii="Arial" w:cs="Arial" w:eastAsia="Arial" w:hAnsi="Arial"/>
+          <w:rtl/>
+        </w:rPr>
+        <w:t xml:space="preserve">. את הערכים בפועל ממפים לארבעת הסוגים ב-SUP-4:</w:t>
       </w:r>
     </w:p>
     <w:tbl>
@@ -18818,7 +18834,7 @@
           <w:szCs w:val="20"/>
           <w:rtl/>
         </w:rPr>
-        <w:t xml:space="preserve"> הם נועדו להראות את מבנה הדשבורדים ואת סוגי התצוגה, ולא את הנתונים האמיתיים או את העיצוב הסופי ב-Spotfire. המספרים מכוילים לסדרי הגודל שלכם (כ-100 שיחות ביום, כ-1,000 קייסים בחודש, 500 בתי חולים). הגרסה האינטראקטיבית נמצאת בקישור שבראש המסמך.</w:t>
+        <w:t xml:space="preserve"> הם נועדו להראות את מבנה הדשבורדים ואת סוגי התצוגה, ולא את הנתונים האמיתיים או את העיצוב הסופי ב-Spotfire. המספרים מכוילים לסדרי הגודל שלכם (כ-100 שיחות ביום, כ-10,000 קייסים בחודש, 500 בתי חולים). הגרסה האינטראקטיבית נמצאת בקישור שבראש המסמך.</w:t>
       </w:r>
     </w:p>
     <w:p>
@@ -22955,7 +22971,7 @@
                 <w:szCs w:val="19"/>
                 <w:rtl/>
               </w:rPr>
-              <w:t xml:space="preserve">לייצא את רשימות הערכים: סטטוסים (קייס ו-Request), סוג קייס / Origin, קטגוריות ותתי-קטגוריות, Root Cause, מוצרים, גרסאות</w:t>
+              <w:t xml:space="preserve">לייצא את רשימות הערכים: סטטוסים (קייס ו-Request), Case Type, קטגוריות ותתי-קטגוריות, Root Cause, מוצרים, גרסאות</w:t>
             </w:r>
           </w:p>
         </w:tc>
@@ -29023,8 +29039,8 @@
       </w:tblPr>
       <w:tblGrid>
         <w:gridCol w:w="950"/>
-        <w:gridCol w:w="4975"/>
-        <w:gridCol w:w="1813"/>
+        <w:gridCol w:w="4957"/>
+        <w:gridCol w:w="1831"/>
         <w:gridCol w:w="950"/>
         <w:gridCol w:w="950"/>
       </w:tblGrid>
@@ -29069,7 +29085,7 @@
         </w:tc>
         <w:tc>
           <w:tcPr>
-            <w:tcW w:type="dxa" w:w="4975"/>
+            <w:tcW w:type="dxa" w:w="4957"/>
             <w:tcBorders>
               <w:top w:val="single" w:color="BFBFBF" w:sz="4"/>
               <w:left w:val="single" w:color="BFBFBF" w:sz="4"/>
@@ -29104,7 +29120,7 @@
         </w:tc>
         <w:tc>
           <w:tcPr>
-            <w:tcW w:type="dxa" w:w="1813"/>
+            <w:tcW w:type="dxa" w:w="1831"/>
             <w:tcBorders>
               <w:top w:val="single" w:color="BFBFBF" w:sz="4"/>
               <w:left w:val="single" w:color="BFBFBF" w:sz="4"/>
@@ -29246,7 +29262,7 @@
         </w:tc>
         <w:tc>
           <w:tcPr>
-            <w:tcW w:type="dxa" w:w="4975"/>
+            <w:tcW w:type="dxa" w:w="4957"/>
             <w:tcBorders>
               <w:top w:val="single" w:color="BFBFBF" w:sz="4"/>
               <w:left w:val="single" w:color="BFBFBF" w:sz="4"/>
@@ -29278,7 +29294,7 @@
         </w:tc>
         <w:tc>
           <w:tcPr>
-            <w:tcW w:type="dxa" w:w="1813"/>
+            <w:tcW w:type="dxa" w:w="1831"/>
             <w:tcBorders>
               <w:top w:val="single" w:color="BFBFBF" w:sz="4"/>
               <w:left w:val="single" w:color="BFBFBF" w:sz="4"/>
@@ -29411,7 +29427,7 @@
         </w:tc>
         <w:tc>
           <w:tcPr>
-            <w:tcW w:type="dxa" w:w="4975"/>
+            <w:tcW w:type="dxa" w:w="4957"/>
             <w:tcBorders>
               <w:top w:val="single" w:color="BFBFBF" w:sz="4"/>
               <w:left w:val="single" w:color="BFBFBF" w:sz="4"/>
@@ -29443,7 +29459,7 @@
         </w:tc>
         <w:tc>
           <w:tcPr>
-            <w:tcW w:type="dxa" w:w="1813"/>
+            <w:tcW w:type="dxa" w:w="1831"/>
             <w:tcBorders>
               <w:top w:val="single" w:color="BFBFBF" w:sz="4"/>
               <w:left w:val="single" w:color="BFBFBF" w:sz="4"/>
@@ -29585,7 +29601,7 @@
         </w:tc>
         <w:tc>
           <w:tcPr>
-            <w:tcW w:type="dxa" w:w="4975"/>
+            <w:tcW w:type="dxa" w:w="4957"/>
             <w:tcBorders>
               <w:top w:val="single" w:color="BFBFBF" w:sz="4"/>
               <w:left w:val="single" w:color="BFBFBF" w:sz="4"/>
@@ -29617,7 +29633,7 @@
         </w:tc>
         <w:tc>
           <w:tcPr>
-            <w:tcW w:type="dxa" w:w="1813"/>
+            <w:tcW w:type="dxa" w:w="1831"/>
             <w:tcBorders>
               <w:top w:val="single" w:color="BFBFBF" w:sz="4"/>
               <w:left w:val="single" w:color="BFBFBF" w:sz="4"/>
@@ -29750,39 +29766,39 @@
         </w:tc>
         <w:tc>
           <w:tcPr>
-            <w:tcW w:type="dxa" w:w="4975"/>
-            <w:tcBorders>
-              <w:top w:val="single" w:color="BFBFBF" w:sz="4"/>
-              <w:left w:val="single" w:color="BFBFBF" w:sz="4"/>
-              <w:bottom w:val="single" w:color="BFBFBF" w:sz="4"/>
-              <w:right w:val="single" w:color="BFBFBF" w:sz="4"/>
-            </w:tcBorders>
-            <w:tcMar>
-              <w:top w:type="dxa" w:w="60"/>
-              <w:left w:type="dxa" w:w="100"/>
-              <w:bottom w:type="dxa" w:w="60"/>
-              <w:right w:type="dxa" w:w="100"/>
-            </w:tcMar>
-          </w:tcPr>
-          <w:p>
-            <w:pPr>
-              <w:bidi/>
-              <w:spacing w:after="0"/>
-            </w:pPr>
-            <w:r>
-              <w:rPr>
-                <w:rFonts w:ascii="Arial" w:cs="Arial" w:eastAsia="Arial" w:hAnsi="Arial"/>
-                <w:sz w:val="19"/>
-                <w:szCs w:val="19"/>
-                <w:rtl/>
-              </w:rPr>
-              <w:t xml:space="preserve">לאשר את מיפוי סוגי הקייסים (8.11): איזה שדה מזהה אותם, ואילו ערכים שייכים לכל סוג</w:t>
-            </w:r>
-          </w:p>
-        </w:tc>
-        <w:tc>
-          <w:tcPr>
-            <w:tcW w:type="dxa" w:w="1813"/>
+            <w:tcW w:type="dxa" w:w="4957"/>
+            <w:tcBorders>
+              <w:top w:val="single" w:color="BFBFBF" w:sz="4"/>
+              <w:left w:val="single" w:color="BFBFBF" w:sz="4"/>
+              <w:bottom w:val="single" w:color="BFBFBF" w:sz="4"/>
+              <w:right w:val="single" w:color="BFBFBF" w:sz="4"/>
+            </w:tcBorders>
+            <w:tcMar>
+              <w:top w:type="dxa" w:w="60"/>
+              <w:left w:type="dxa" w:w="100"/>
+              <w:bottom w:type="dxa" w:w="60"/>
+              <w:right w:type="dxa" w:w="100"/>
+            </w:tcMar>
+          </w:tcPr>
+          <w:p>
+            <w:pPr>
+              <w:bidi/>
+              <w:spacing w:after="0"/>
+            </w:pPr>
+            <w:r>
+              <w:rPr>
+                <w:rFonts w:ascii="Arial" w:cs="Arial" w:eastAsia="Arial" w:hAnsi="Arial"/>
+                <w:sz w:val="19"/>
+                <w:szCs w:val="19"/>
+                <w:rtl/>
+              </w:rPr>
+              <w:t xml:space="preserve">לאשר את מיפוי ערכי Case Type לארבעת הסוגים (8.11)</w:t>
+            </w:r>
+          </w:p>
+        </w:tc>
+        <w:tc>
+          <w:tcPr>
+            <w:tcW w:type="dxa" w:w="1831"/>
             <w:tcBorders>
               <w:top w:val="single" w:color="BFBFBF" w:sz="4"/>
               <w:left w:val="single" w:color="BFBFBF" w:sz="4"/>
@@ -34290,9 +34306,9 @@
       </w:tblPr>
       <w:tblGrid>
         <w:gridCol w:w="950"/>
-        <w:gridCol w:w="4715"/>
-        <w:gridCol w:w="2536"/>
-        <w:gridCol w:w="1437"/>
+        <w:gridCol w:w="4817"/>
+        <w:gridCol w:w="2409"/>
+        <w:gridCol w:w="1462"/>
       </w:tblGrid>
       <w:tr>
         <w:trPr>
@@ -34335,7 +34351,7 @@
         </w:tc>
         <w:tc>
           <w:tcPr>
-            <w:tcW w:type="dxa" w:w="4715"/>
+            <w:tcW w:type="dxa" w:w="4817"/>
             <w:tcBorders>
               <w:top w:val="single" w:color="BFBFBF" w:sz="4"/>
               <w:left w:val="single" w:color="BFBFBF" w:sz="4"/>
@@ -34370,7 +34386,7 @@
         </w:tc>
         <w:tc>
           <w:tcPr>
-            <w:tcW w:type="dxa" w:w="2536"/>
+            <w:tcW w:type="dxa" w:w="2409"/>
             <w:tcBorders>
               <w:top w:val="single" w:color="BFBFBF" w:sz="4"/>
               <w:left w:val="single" w:color="BFBFBF" w:sz="4"/>
@@ -34405,7 +34421,7 @@
         </w:tc>
         <w:tc>
           <w:tcPr>
-            <w:tcW w:type="dxa" w:w="1437"/>
+            <w:tcW w:type="dxa" w:w="1462"/>
             <w:tcBorders>
               <w:top w:val="single" w:color="BFBFBF" w:sz="4"/>
               <w:left w:val="single" w:color="BFBFBF" w:sz="4"/>
@@ -34477,7 +34493,7 @@
         </w:tc>
         <w:tc>
           <w:tcPr>
-            <w:tcW w:type="dxa" w:w="4715"/>
+            <w:tcW w:type="dxa" w:w="4817"/>
             <w:tcBorders>
               <w:top w:val="single" w:color="BFBFBF" w:sz="4"/>
               <w:left w:val="single" w:color="BFBFBF" w:sz="4"/>
@@ -34509,7 +34525,7 @@
         </w:tc>
         <w:tc>
           <w:tcPr>
-            <w:tcW w:type="dxa" w:w="2536"/>
+            <w:tcW w:type="dxa" w:w="2409"/>
             <w:tcBorders>
               <w:top w:val="single" w:color="BFBFBF" w:sz="4"/>
               <w:left w:val="single" w:color="BFBFBF" w:sz="4"/>
@@ -34541,7 +34557,7 @@
         </w:tc>
         <w:tc>
           <w:tcPr>
-            <w:tcW w:type="dxa" w:w="1437"/>
+            <w:tcW w:type="dxa" w:w="1462"/>
             <w:tcBorders>
               <w:top w:val="single" w:color="BFBFBF" w:sz="4"/>
               <w:left w:val="single" w:color="BFBFBF" w:sz="4"/>
@@ -34610,7 +34626,7 @@
         </w:tc>
         <w:tc>
           <w:tcPr>
-            <w:tcW w:type="dxa" w:w="4715"/>
+            <w:tcW w:type="dxa" w:w="4817"/>
             <w:tcBorders>
               <w:top w:val="single" w:color="BFBFBF" w:sz="4"/>
               <w:left w:val="single" w:color="BFBFBF" w:sz="4"/>
@@ -34642,7 +34658,7 @@
         </w:tc>
         <w:tc>
           <w:tcPr>
-            <w:tcW w:type="dxa" w:w="2536"/>
+            <w:tcW w:type="dxa" w:w="2409"/>
             <w:tcBorders>
               <w:top w:val="single" w:color="BFBFBF" w:sz="4"/>
               <w:left w:val="single" w:color="BFBFBF" w:sz="4"/>
@@ -34674,7 +34690,7 @@
         </w:tc>
         <w:tc>
           <w:tcPr>
-            <w:tcW w:type="dxa" w:w="1437"/>
+            <w:tcW w:type="dxa" w:w="1462"/>
             <w:tcBorders>
               <w:top w:val="single" w:color="BFBFBF" w:sz="4"/>
               <w:left w:val="single" w:color="BFBFBF" w:sz="4"/>
@@ -34743,7 +34759,7 @@
         </w:tc>
         <w:tc>
           <w:tcPr>
-            <w:tcW w:type="dxa" w:w="4715"/>
+            <w:tcW w:type="dxa" w:w="4817"/>
             <w:tcBorders>
               <w:top w:val="single" w:color="BFBFBF" w:sz="4"/>
               <w:left w:val="single" w:color="BFBFBF" w:sz="4"/>
@@ -34775,7 +34791,7 @@
         </w:tc>
         <w:tc>
           <w:tcPr>
-            <w:tcW w:type="dxa" w:w="2536"/>
+            <w:tcW w:type="dxa" w:w="2409"/>
             <w:tcBorders>
               <w:top w:val="single" w:color="BFBFBF" w:sz="4"/>
               <w:left w:val="single" w:color="BFBFBF" w:sz="4"/>
@@ -34807,7 +34823,7 @@
         </w:tc>
         <w:tc>
           <w:tcPr>
-            <w:tcW w:type="dxa" w:w="1437"/>
+            <w:tcW w:type="dxa" w:w="1462"/>
             <w:tcBorders>
               <w:top w:val="single" w:color="BFBFBF" w:sz="4"/>
               <w:left w:val="single" w:color="BFBFBF" w:sz="4"/>
@@ -34876,7 +34892,7 @@
         </w:tc>
         <w:tc>
           <w:tcPr>
-            <w:tcW w:type="dxa" w:w="4715"/>
+            <w:tcW w:type="dxa" w:w="4817"/>
             <w:tcBorders>
               <w:top w:val="single" w:color="BFBFBF" w:sz="4"/>
               <w:left w:val="single" w:color="BFBFBF" w:sz="4"/>
@@ -34908,7 +34924,7 @@
         </w:tc>
         <w:tc>
           <w:tcPr>
-            <w:tcW w:type="dxa" w:w="2536"/>
+            <w:tcW w:type="dxa" w:w="2409"/>
             <w:tcBorders>
               <w:top w:val="single" w:color="BFBFBF" w:sz="4"/>
               <w:left w:val="single" w:color="BFBFBF" w:sz="4"/>
@@ -34940,7 +34956,7 @@
         </w:tc>
         <w:tc>
           <w:tcPr>
-            <w:tcW w:type="dxa" w:w="1437"/>
+            <w:tcW w:type="dxa" w:w="1462"/>
             <w:tcBorders>
               <w:top w:val="single" w:color="BFBFBF" w:sz="4"/>
               <w:left w:val="single" w:color="BFBFBF" w:sz="4"/>
@@ -35009,7 +35025,7 @@
         </w:tc>
         <w:tc>
           <w:tcPr>
-            <w:tcW w:type="dxa" w:w="4715"/>
+            <w:tcW w:type="dxa" w:w="4817"/>
             <w:tcBorders>
               <w:top w:val="single" w:color="BFBFBF" w:sz="4"/>
               <w:left w:val="single" w:color="BFBFBF" w:sz="4"/>
@@ -35041,7 +35057,7 @@
         </w:tc>
         <w:tc>
           <w:tcPr>
-            <w:tcW w:type="dxa" w:w="2536"/>
+            <w:tcW w:type="dxa" w:w="2409"/>
             <w:tcBorders>
               <w:top w:val="single" w:color="BFBFBF" w:sz="4"/>
               <w:left w:val="single" w:color="BFBFBF" w:sz="4"/>
@@ -35073,7 +35089,7 @@
         </w:tc>
         <w:tc>
           <w:tcPr>
-            <w:tcW w:type="dxa" w:w="1437"/>
+            <w:tcW w:type="dxa" w:w="1462"/>
             <w:tcBorders>
               <w:top w:val="single" w:color="BFBFBF" w:sz="4"/>
               <w:left w:val="single" w:color="BFBFBF" w:sz="4"/>
@@ -35142,7 +35158,7 @@
         </w:tc>
         <w:tc>
           <w:tcPr>
-            <w:tcW w:type="dxa" w:w="4715"/>
+            <w:tcW w:type="dxa" w:w="4817"/>
             <w:tcBorders>
               <w:top w:val="single" w:color="BFBFBF" w:sz="4"/>
               <w:left w:val="single" w:color="BFBFBF" w:sz="4"/>
@@ -35174,7 +35190,7 @@
         </w:tc>
         <w:tc>
           <w:tcPr>
-            <w:tcW w:type="dxa" w:w="2536"/>
+            <w:tcW w:type="dxa" w:w="2409"/>
             <w:tcBorders>
               <w:top w:val="single" w:color="BFBFBF" w:sz="4"/>
               <w:left w:val="single" w:color="BFBFBF" w:sz="4"/>
@@ -35206,7 +35222,7 @@
         </w:tc>
         <w:tc>
           <w:tcPr>
-            <w:tcW w:type="dxa" w:w="1437"/>
+            <w:tcW w:type="dxa" w:w="1462"/>
             <w:tcBorders>
               <w:top w:val="single" w:color="BFBFBF" w:sz="4"/>
               <w:left w:val="single" w:color="BFBFBF" w:sz="4"/>
@@ -35275,7 +35291,7 @@
         </w:tc>
         <w:tc>
           <w:tcPr>
-            <w:tcW w:type="dxa" w:w="4715"/>
+            <w:tcW w:type="dxa" w:w="4817"/>
             <w:tcBorders>
               <w:top w:val="single" w:color="BFBFBF" w:sz="4"/>
               <w:left w:val="single" w:color="BFBFBF" w:sz="4"/>
@@ -35307,7 +35323,7 @@
         </w:tc>
         <w:tc>
           <w:tcPr>
-            <w:tcW w:type="dxa" w:w="2536"/>
+            <w:tcW w:type="dxa" w:w="2409"/>
             <w:tcBorders>
               <w:top w:val="single" w:color="BFBFBF" w:sz="4"/>
               <w:left w:val="single" w:color="BFBFBF" w:sz="4"/>
@@ -35339,7 +35355,7 @@
         </w:tc>
         <w:tc>
           <w:tcPr>
-            <w:tcW w:type="dxa" w:w="1437"/>
+            <w:tcW w:type="dxa" w:w="1462"/>
             <w:tcBorders>
               <w:top w:val="single" w:color="BFBFBF" w:sz="4"/>
               <w:left w:val="single" w:color="BFBFBF" w:sz="4"/>
@@ -35408,71 +35424,71 @@
         </w:tc>
         <w:tc>
           <w:tcPr>
-            <w:tcW w:type="dxa" w:w="4715"/>
-            <w:tcBorders>
-              <w:top w:val="single" w:color="BFBFBF" w:sz="4"/>
-              <w:left w:val="single" w:color="BFBFBF" w:sz="4"/>
-              <w:bottom w:val="single" w:color="BFBFBF" w:sz="4"/>
-              <w:right w:val="single" w:color="BFBFBF" w:sz="4"/>
-            </w:tcBorders>
-            <w:tcMar>
-              <w:top w:type="dxa" w:w="60"/>
-              <w:left w:type="dxa" w:w="100"/>
-              <w:bottom w:type="dxa" w:w="60"/>
-              <w:right w:type="dxa" w:w="100"/>
-            </w:tcMar>
-          </w:tcPr>
-          <w:p>
-            <w:pPr>
-              <w:bidi/>
-              <w:spacing w:after="0"/>
-            </w:pPr>
-            <w:r>
-              <w:rPr>
-                <w:rFonts w:ascii="Arial" w:cs="Arial" w:eastAsia="Arial" w:hAnsi="Arial"/>
-                <w:sz w:val="19"/>
-                <w:szCs w:val="19"/>
-                <w:rtl/>
-              </w:rPr>
-              <w:t xml:space="preserve">איזה שדה בקייס מזהה את סוג העבודה (תקלה, מעקב, ניטור יזום, התקנה מרחוק)</w:t>
-            </w:r>
-          </w:p>
-        </w:tc>
-        <w:tc>
-          <w:tcPr>
-            <w:tcW w:type="dxa" w:w="2536"/>
-            <w:tcBorders>
-              <w:top w:val="single" w:color="BFBFBF" w:sz="4"/>
-              <w:left w:val="single" w:color="BFBFBF" w:sz="4"/>
-              <w:bottom w:val="single" w:color="BFBFBF" w:sz="4"/>
-              <w:right w:val="single" w:color="BFBFBF" w:sz="4"/>
-            </w:tcBorders>
-            <w:tcMar>
-              <w:top w:type="dxa" w:w="60"/>
-              <w:left w:type="dxa" w:w="100"/>
-              <w:bottom w:type="dxa" w:w="60"/>
-              <w:right w:type="dxa" w:w="100"/>
-            </w:tcMar>
-          </w:tcPr>
-          <w:p>
-            <w:pPr>
-              <w:bidi/>
-              <w:spacing w:after="0"/>
-            </w:pPr>
-            <w:r>
-              <w:rPr>
-                <w:rFonts w:ascii="Arial" w:cs="Arial" w:eastAsia="Arial" w:hAnsi="Arial"/>
-                <w:sz w:val="19"/>
-                <w:szCs w:val="19"/>
-                <w:rtl/>
-              </w:rPr>
-              <w:t xml:space="preserve">Salesforce Admin / מנהל התמיכה</w:t>
-            </w:r>
-          </w:p>
-        </w:tc>
-        <w:tc>
-          <w:tcPr>
-            <w:tcW w:type="dxa" w:w="1437"/>
+            <w:tcW w:type="dxa" w:w="4817"/>
+            <w:tcBorders>
+              <w:top w:val="single" w:color="BFBFBF" w:sz="4"/>
+              <w:left w:val="single" w:color="BFBFBF" w:sz="4"/>
+              <w:bottom w:val="single" w:color="BFBFBF" w:sz="4"/>
+              <w:right w:val="single" w:color="BFBFBF" w:sz="4"/>
+            </w:tcBorders>
+            <w:tcMar>
+              <w:top w:type="dxa" w:w="60"/>
+              <w:left w:type="dxa" w:w="100"/>
+              <w:bottom w:type="dxa" w:w="60"/>
+              <w:right w:type="dxa" w:w="100"/>
+            </w:tcMar>
+          </w:tcPr>
+          <w:p>
+            <w:pPr>
+              <w:bidi/>
+              <w:spacing w:after="0"/>
+            </w:pPr>
+            <w:r>
+              <w:rPr>
+                <w:rFonts w:ascii="Arial" w:cs="Arial" w:eastAsia="Arial" w:hAnsi="Arial"/>
+                <w:sz w:val="19"/>
+                <w:szCs w:val="19"/>
+                <w:rtl/>
+              </w:rPr>
+              <w:t xml:space="preserve">מיפוי ערכי Case Type לארבעת הסוגים (תקלה, מעקב, ניטור יזום, התקנה מרחוק)</w:t>
+            </w:r>
+          </w:p>
+        </w:tc>
+        <w:tc>
+          <w:tcPr>
+            <w:tcW w:type="dxa" w:w="2409"/>
+            <w:tcBorders>
+              <w:top w:val="single" w:color="BFBFBF" w:sz="4"/>
+              <w:left w:val="single" w:color="BFBFBF" w:sz="4"/>
+              <w:bottom w:val="single" w:color="BFBFBF" w:sz="4"/>
+              <w:right w:val="single" w:color="BFBFBF" w:sz="4"/>
+            </w:tcBorders>
+            <w:tcMar>
+              <w:top w:type="dxa" w:w="60"/>
+              <w:left w:type="dxa" w:w="100"/>
+              <w:bottom w:type="dxa" w:w="60"/>
+              <w:right w:type="dxa" w:w="100"/>
+            </w:tcMar>
+          </w:tcPr>
+          <w:p>
+            <w:pPr>
+              <w:bidi/>
+              <w:spacing w:after="0"/>
+            </w:pPr>
+            <w:r>
+              <w:rPr>
+                <w:rFonts w:ascii="Arial" w:cs="Arial" w:eastAsia="Arial" w:hAnsi="Arial"/>
+                <w:sz w:val="19"/>
+                <w:szCs w:val="19"/>
+                <w:rtl/>
+              </w:rPr>
+              <w:t xml:space="preserve">מנהל התמיכה</w:t>
+            </w:r>
+          </w:p>
+        </w:tc>
+        <w:tc>
+          <w:tcPr>
+            <w:tcW w:type="dxa" w:w="1462"/>
             <w:tcBorders>
               <w:top w:val="single" w:color="BFBFBF" w:sz="4"/>
               <w:left w:val="single" w:color="BFBFBF" w:sz="4"/>
@@ -35541,7 +35557,7 @@
         </w:tc>
         <w:tc>
           <w:tcPr>
-            <w:tcW w:type="dxa" w:w="4715"/>
+            <w:tcW w:type="dxa" w:w="4817"/>
             <w:tcBorders>
               <w:top w:val="single" w:color="BFBFBF" w:sz="4"/>
               <w:left w:val="single" w:color="BFBFBF" w:sz="4"/>
@@ -35573,7 +35589,7 @@
         </w:tc>
         <w:tc>
           <w:tcPr>
-            <w:tcW w:type="dxa" w:w="2536"/>
+            <w:tcW w:type="dxa" w:w="2409"/>
             <w:tcBorders>
               <w:top w:val="single" w:color="BFBFBF" w:sz="4"/>
               <w:left w:val="single" w:color="BFBFBF" w:sz="4"/>
@@ -35605,7 +35621,7 @@
         </w:tc>
         <w:tc>
           <w:tcPr>
-            <w:tcW w:type="dxa" w:w="1437"/>
+            <w:tcW w:type="dxa" w:w="1462"/>
             <w:tcBorders>
               <w:top w:val="single" w:color="BFBFBF" w:sz="4"/>
               <w:left w:val="single" w:color="BFBFBF" w:sz="4"/>
@@ -35674,7 +35690,7 @@
         </w:tc>
         <w:tc>
           <w:tcPr>
-            <w:tcW w:type="dxa" w:w="4715"/>
+            <w:tcW w:type="dxa" w:w="4817"/>
             <w:tcBorders>
               <w:top w:val="single" w:color="BFBFBF" w:sz="4"/>
               <w:left w:val="single" w:color="BFBFBF" w:sz="4"/>
@@ -35706,7 +35722,7 @@
         </w:tc>
         <w:tc>
           <w:tcPr>
-            <w:tcW w:type="dxa" w:w="2536"/>
+            <w:tcW w:type="dxa" w:w="2409"/>
             <w:tcBorders>
               <w:top w:val="single" w:color="BFBFBF" w:sz="4"/>
               <w:left w:val="single" w:color="BFBFBF" w:sz="4"/>
@@ -35738,7 +35754,7 @@
         </w:tc>
         <w:tc>
           <w:tcPr>
-            <w:tcW w:type="dxa" w:w="1437"/>
+            <w:tcW w:type="dxa" w:w="1462"/>
             <w:tcBorders>
               <w:top w:val="single" w:color="BFBFBF" w:sz="4"/>
               <w:left w:val="single" w:color="BFBFBF" w:sz="4"/>

</xml_diff>

<commit_message>
Make the Word spec right-to-left throughout; add PDF
- RTL paragraph default, RTL section and Hebrew bidi language in styles
- Hebrew page footer; Hebrew image captions
- Code blocks stay left-to-right and on one page
- Add PDF export for viewers without RTL support

Co-Authored-By: Claude Opus 5.5 <noreply@anthropic.com>
Claude-Session: https://claude.ai/code/session_01YcEMp91cmPuH2YbvGBFx73
</commit_message>
<xml_diff>
--- a/docs/MVP-Support-Control-Tower.docx
+++ b/docs/MVP-Support-Control-Tower.docx
@@ -7649,6 +7649,8 @@
     </w:p>
     <w:p>
       <w:pPr>
+        <w:keepNext/>
+        <w:keepLines/>
         <w:shd w:fill="F4F4F4" w:color="auto" w:val="clear"/>
         <w:bidi w:val="false"/>
         <w:spacing w:after="0" w:line="240"/>
@@ -7665,6 +7667,8 @@
     </w:p>
     <w:p>
       <w:pPr>
+        <w:keepNext/>
+        <w:keepLines/>
         <w:shd w:fill="F4F4F4" w:color="auto" w:val="clear"/>
         <w:bidi w:val="false"/>
         <w:spacing w:after="0" w:line="240"/>
@@ -7681,6 +7685,8 @@
     </w:p>
     <w:p>
       <w:pPr>
+        <w:keepNext/>
+        <w:keepLines/>
         <w:shd w:fill="F4F4F4" w:color="auto" w:val="clear"/>
         <w:bidi w:val="false"/>
         <w:spacing w:after="0" w:line="240"/>
@@ -7697,6 +7703,8 @@
     </w:p>
     <w:p>
       <w:pPr>
+        <w:keepNext/>
+        <w:keepLines/>
         <w:shd w:fill="F4F4F4" w:color="auto" w:val="clear"/>
         <w:bidi w:val="false"/>
         <w:spacing w:after="0" w:line="240"/>
@@ -7713,6 +7721,8 @@
     </w:p>
     <w:p>
       <w:pPr>
+        <w:keepNext/>
+        <w:keepLines/>
         <w:shd w:fill="F4F4F4" w:color="auto" w:val="clear"/>
         <w:bidi w:val="false"/>
         <w:spacing w:after="0" w:line="240"/>
@@ -7729,6 +7739,8 @@
     </w:p>
     <w:p>
       <w:pPr>
+        <w:keepNext/>
+        <w:keepLines/>
         <w:shd w:fill="F4F4F4" w:color="auto" w:val="clear"/>
         <w:bidi w:val="false"/>
         <w:spacing w:after="0" w:line="240"/>
@@ -7745,6 +7757,8 @@
     </w:p>
     <w:p>
       <w:pPr>
+        <w:keepNext/>
+        <w:keepLines/>
         <w:shd w:fill="F4F4F4" w:color="auto" w:val="clear"/>
         <w:bidi w:val="false"/>
         <w:spacing w:after="0" w:line="240"/>
@@ -7761,6 +7775,8 @@
     </w:p>
     <w:p>
       <w:pPr>
+        <w:keepNext/>
+        <w:keepLines/>
         <w:shd w:fill="F4F4F4" w:color="auto" w:val="clear"/>
         <w:bidi w:val="false"/>
         <w:spacing w:after="0" w:line="240"/>
@@ -7777,6 +7793,8 @@
     </w:p>
     <w:p>
       <w:pPr>
+        <w:keepNext/>
+        <w:keepLines/>
         <w:shd w:fill="F4F4F4" w:color="auto" w:val="clear"/>
         <w:bidi w:val="false"/>
         <w:spacing w:after="0" w:line="240"/>
@@ -7793,6 +7811,8 @@
     </w:p>
     <w:p>
       <w:pPr>
+        <w:keepNext/>
+        <w:keepLines/>
         <w:shd w:fill="F4F4F4" w:color="auto" w:val="clear"/>
         <w:bidi w:val="false"/>
         <w:spacing w:after="0" w:line="240"/>
@@ -7809,6 +7829,8 @@
     </w:p>
     <w:p>
       <w:pPr>
+        <w:keepNext/>
+        <w:keepLines/>
         <w:shd w:fill="F4F4F4" w:color="auto" w:val="clear"/>
         <w:bidi w:val="false"/>
         <w:spacing w:after="0" w:line="240"/>
@@ -7825,6 +7847,8 @@
     </w:p>
     <w:p>
       <w:pPr>
+        <w:keepNext/>
+        <w:keepLines/>
         <w:shd w:fill="F4F4F4" w:color="auto" w:val="clear"/>
         <w:bidi w:val="false"/>
         <w:spacing w:after="0" w:line="240"/>
@@ -7841,6 +7865,8 @@
     </w:p>
     <w:p>
       <w:pPr>
+        <w:keepNext/>
+        <w:keepLines/>
         <w:shd w:fill="F4F4F4" w:color="auto" w:val="clear"/>
         <w:bidi w:val="false"/>
         <w:spacing w:after="0" w:line="240"/>
@@ -7857,6 +7883,8 @@
     </w:p>
     <w:p>
       <w:pPr>
+        <w:keepNext/>
+        <w:keepLines/>
         <w:shd w:fill="F4F4F4" w:color="auto" w:val="clear"/>
         <w:bidi w:val="false"/>
         <w:spacing w:after="0" w:line="240"/>
@@ -7873,6 +7901,8 @@
     </w:p>
     <w:p>
       <w:pPr>
+        <w:keepNext/>
+        <w:keepLines/>
         <w:shd w:fill="F4F4F4" w:color="auto" w:val="clear"/>
         <w:bidi w:val="false"/>
         <w:spacing w:after="0" w:line="240"/>
@@ -7889,6 +7919,8 @@
     </w:p>
     <w:p>
       <w:pPr>
+        <w:keepNext w:val="false"/>
+        <w:keepLines/>
         <w:shd w:fill="F4F4F4" w:color="auto" w:val="clear"/>
         <w:bidi w:val="false"/>
         <w:spacing w:after="160" w:line="240"/>
@@ -11907,6 +11939,8 @@
     </w:p>
     <w:p>
       <w:pPr>
+        <w:keepNext/>
+        <w:keepLines/>
         <w:shd w:fill="F4F4F4" w:color="auto" w:val="clear"/>
         <w:bidi w:val="false"/>
         <w:spacing w:after="0" w:line="240"/>
@@ -11923,6 +11957,8 @@
     </w:p>
     <w:p>
       <w:pPr>
+        <w:keepNext/>
+        <w:keepLines/>
         <w:shd w:fill="F4F4F4" w:color="auto" w:val="clear"/>
         <w:bidi w:val="false"/>
         <w:spacing w:after="0" w:line="240"/>
@@ -11939,6 +11975,8 @@
     </w:p>
     <w:p>
       <w:pPr>
+        <w:keepNext/>
+        <w:keepLines/>
         <w:shd w:fill="F4F4F4" w:color="auto" w:val="clear"/>
         <w:bidi w:val="false"/>
         <w:spacing w:after="0" w:line="240"/>
@@ -11955,6 +11993,8 @@
     </w:p>
     <w:p>
       <w:pPr>
+        <w:keepNext/>
+        <w:keepLines/>
         <w:shd w:fill="F4F4F4" w:color="auto" w:val="clear"/>
         <w:bidi w:val="false"/>
         <w:spacing w:after="0" w:line="240"/>
@@ -11971,6 +12011,8 @@
     </w:p>
     <w:p>
       <w:pPr>
+        <w:keepNext/>
+        <w:keepLines/>
         <w:shd w:fill="F4F4F4" w:color="auto" w:val="clear"/>
         <w:bidi w:val="false"/>
         <w:spacing w:after="0" w:line="240"/>
@@ -11987,6 +12029,8 @@
     </w:p>
     <w:p>
       <w:pPr>
+        <w:keepNext/>
+        <w:keepLines/>
         <w:shd w:fill="F4F4F4" w:color="auto" w:val="clear"/>
         <w:bidi w:val="false"/>
         <w:spacing w:after="0" w:line="240"/>
@@ -12003,6 +12047,8 @@
     </w:p>
     <w:p>
       <w:pPr>
+        <w:keepNext/>
+        <w:keepLines/>
         <w:shd w:fill="F4F4F4" w:color="auto" w:val="clear"/>
         <w:bidi w:val="false"/>
         <w:spacing w:after="0" w:line="240"/>
@@ -12019,6 +12065,8 @@
     </w:p>
     <w:p>
       <w:pPr>
+        <w:keepNext/>
+        <w:keepLines/>
         <w:shd w:fill="F4F4F4" w:color="auto" w:val="clear"/>
         <w:bidi w:val="false"/>
         <w:spacing w:after="0" w:line="240"/>
@@ -12035,6 +12083,8 @@
     </w:p>
     <w:p>
       <w:pPr>
+        <w:keepNext w:val="false"/>
+        <w:keepLines/>
         <w:shd w:fill="F4F4F4" w:color="auto" w:val="clear"/>
         <w:bidi w:val="false"/>
         <w:spacing w:after="160" w:line="240"/>
@@ -18983,6 +19033,7 @@
     </w:p>
     <w:p>
       <w:pPr>
+        <w:bidi/>
         <w:spacing w:after="200"/>
         <w:jc w:val="center"/>
       </w:pPr>
@@ -18994,8 +19045,9 @@
           <w:color w:val="808080"/>
           <w:sz w:val="17"/>
           <w:szCs w:val="17"/>
-        </w:rPr>
-        <w:t xml:space="preserve">D-Live (illustration, synthetic data)</w:t>
+          <w:rtl/>
+        </w:rPr>
+        <w:t xml:space="preserve">איור: D-Live (נתונים מומצאים)</w:t>
       </w:r>
     </w:p>
     <w:p>
@@ -19074,6 +19126,7 @@
     </w:p>
     <w:p>
       <w:pPr>
+        <w:bidi/>
         <w:spacing w:after="200"/>
         <w:jc w:val="center"/>
       </w:pPr>
@@ -19085,8 +19138,9 @@
           <w:color w:val="808080"/>
           <w:sz w:val="17"/>
           <w:szCs w:val="17"/>
-        </w:rPr>
-        <w:t xml:space="preserve">D-Load (illustration, synthetic data)</w:t>
+          <w:rtl/>
+        </w:rPr>
+        <w:t xml:space="preserve">איור: D-Load (נתונים מומצאים)</w:t>
       </w:r>
     </w:p>
     <w:p>
@@ -19165,6 +19219,7 @@
     </w:p>
     <w:p>
       <w:pPr>
+        <w:bidi/>
         <w:spacing w:after="200"/>
         <w:jc w:val="center"/>
       </w:pPr>
@@ -19176,8 +19231,9 @@
           <w:color w:val="808080"/>
           <w:sz w:val="17"/>
           <w:szCs w:val="17"/>
-        </w:rPr>
-        <w:t xml:space="preserve">D-Quality (illustration, synthetic data)</w:t>
+          <w:rtl/>
+        </w:rPr>
+        <w:t xml:space="preserve">איור: D-Quality (נתונים מומצאים)</w:t>
       </w:r>
     </w:p>
     <w:p>
@@ -19256,6 +19312,7 @@
     </w:p>
     <w:p>
       <w:pPr>
+        <w:bidi/>
         <w:spacing w:after="200"/>
         <w:jc w:val="center"/>
       </w:pPr>
@@ -19267,8 +19324,9 @@
           <w:color w:val="808080"/>
           <w:sz w:val="17"/>
           <w:szCs w:val="17"/>
-        </w:rPr>
-        <w:t xml:space="preserve">D-R&amp;D (illustration, synthetic data)</w:t>
+          <w:rtl/>
+        </w:rPr>
+        <w:t xml:space="preserve">איור: D-R&amp;D (נתונים מומצאים)</w:t>
       </w:r>
     </w:p>
     <w:p>
@@ -19347,6 +19405,7 @@
     </w:p>
     <w:p>
       <w:pPr>
+        <w:bidi/>
         <w:spacing w:after="200"/>
         <w:jc w:val="center"/>
       </w:pPr>
@@ -19358,8 +19417,9 @@
           <w:color w:val="808080"/>
           <w:sz w:val="17"/>
           <w:szCs w:val="17"/>
-        </w:rPr>
-        <w:t xml:space="preserve">D-Customer (illustration, synthetic data)</w:t>
+          <w:rtl/>
+        </w:rPr>
+        <w:t xml:space="preserve">איור: D-Customer (נתונים מומצאים)</w:t>
       </w:r>
     </w:p>
     <w:p>
@@ -19454,6 +19514,7 @@
     </w:p>
     <w:p>
       <w:pPr>
+        <w:bidi/>
         <w:spacing w:after="200"/>
         <w:jc w:val="center"/>
       </w:pPr>
@@ -19465,8 +19526,9 @@
           <w:color w:val="808080"/>
           <w:sz w:val="17"/>
           <w:szCs w:val="17"/>
-        </w:rPr>
-        <w:t xml:space="preserve">D-Safety (illustration, synthetic data)</w:t>
+          <w:rtl/>
+        </w:rPr>
+        <w:t xml:space="preserve">איור: D-Safety (נתונים מומצאים)</w:t>
       </w:r>
     </w:p>
     <w:p>
@@ -19545,6 +19607,7 @@
     </w:p>
     <w:p>
       <w:pPr>
+        <w:bidi/>
         <w:spacing w:after="200"/>
         <w:jc w:val="center"/>
       </w:pPr>
@@ -19556,8 +19619,9 @@
           <w:color w:val="808080"/>
           <w:sz w:val="17"/>
           <w:szCs w:val="17"/>
-        </w:rPr>
-        <w:t xml:space="preserve">D-MR (illustration, synthetic data)</w:t>
+          <w:rtl/>
+        </w:rPr>
+        <w:t xml:space="preserve">איור: D-MR (נתונים מומצאים)</w:t>
       </w:r>
     </w:p>
     <w:p>
@@ -35904,6 +35968,7 @@
       <w:pgSz w:w="11906" w:h="16838" w:orient="portrait"/>
       <w:pgMar w:top="1134" w:right="1134" w:bottom="1134" w:left="1134" w:header="708" w:footer="708" w:gutter="0"/>
       <w:pgNumType/>
+      <w:bidi/>
       <w:docGrid w:linePitch="360"/>
     </w:sectPr>
   </w:body>
@@ -35962,12 +36027,14 @@
         <w:color w:val="808080"/>
         <w:sz w:val="18"/>
         <w:szCs w:val="18"/>
+        <w:rtl/>
       </w:rPr>
+      <w:t xml:space="preserve">עמוד </w:t>
       <w:fldChar w:fldCharType="begin"/>
       <w:instrText xml:space="preserve">PAGE</w:instrText>
       <w:fldChar w:fldCharType="separate"/>
       <w:fldChar w:fldCharType="end"/>
-      <w:t xml:space="preserve"> / </w:t>
+      <w:t xml:space="preserve"> מתוך </w:t>
       <w:fldChar w:fldCharType="begin"/>
       <w:instrText xml:space="preserve">NUMPAGES</w:instrText>
       <w:fldChar w:fldCharType="separate"/>
@@ -36192,9 +36259,14 @@
         <w:rFonts w:ascii="Arial" w:cs="Arial" w:eastAsia="Arial" w:hAnsi="Arial"/>
         <w:sz w:val="21"/>
         <w:szCs w:val="21"/>
+        <w:lang w:val="en-US" w:bidi="he-IL"/>
       </w:rPr>
     </w:rPrDefault>
-    <w:pPrDefault/>
+    <w:pPrDefault>
+      <w:pPr>
+        <w:bidi/>
+      </w:pPr>
+    </w:pPrDefault>
   </w:docDefaults>
   <w:style w:type="paragraph" w:styleId="Title">
     <w:name w:val="Title"/>

</xml_diff>

<commit_message>
Close Q1-Q10 coverage gaps; mark the consultant order as the one blocker
Decisions note:
- Item 4 now covers what the existing DW contains (Q4), not only the lag
  and the owner's consent.
- Item 7 adds DPIA and HR as an owner (Q10).
- New item 14 for scheduled PDF reports (Q5), in the later-waves table.

Full MVP, chapter 17: the intro said no point blocks the start. It now
says Q7 (the consultant agreement) does, which matches chapter 13 and the
decisions note. Rebuilt the .docx and .pdf.

Co-Authored-By: Claude Opus 5.5 <noreply@anthropic.com>
Claude-Session: https://claude.ai/code/session_019yE3185nTUSCyJBoGaH1r1
</commit_message>
<xml_diff>
--- a/docs/MVP-Support-Control-Tower.docx
+++ b/docs/MVP-Support-Control-Tower.docx
@@ -35,7 +35,7 @@
       </w:tblGrid>
       <w:tr>
         <w:trPr>
-          <w:tblHeader w:val="false"/>
+          <w:tblHeader w:val="off"/>
         </w:trPr>
         <w:tc>
           <w:tcPr>
@@ -107,7 +107,7 @@
       </w:tr>
       <w:tr>
         <w:trPr>
-          <w:tblHeader w:val="false"/>
+          <w:tblHeader w:val="off"/>
         </w:trPr>
         <w:tc>
           <w:tcPr>
@@ -179,7 +179,7 @@
       </w:tr>
       <w:tr>
         <w:trPr>
-          <w:tblHeader w:val="false"/>
+          <w:tblHeader w:val="off"/>
         </w:trPr>
         <w:tc>
           <w:tcPr>
@@ -251,7 +251,7 @@
       </w:tr>
       <w:tr>
         <w:trPr>
-          <w:tblHeader w:val="false"/>
+          <w:tblHeader w:val="off"/>
         </w:trPr>
         <w:tc>
           <w:tcPr>
@@ -323,7 +323,7 @@
       </w:tr>
       <w:tr>
         <w:trPr>
-          <w:tblHeader w:val="false"/>
+          <w:tblHeader w:val="off"/>
         </w:trPr>
         <w:tc>
           <w:tcPr>
@@ -395,7 +395,7 @@
       </w:tr>
       <w:tr>
         <w:trPr>
-          <w:tblHeader w:val="false"/>
+          <w:tblHeader w:val="off"/>
         </w:trPr>
         <w:tc>
           <w:tcPr>
@@ -467,7 +467,7 @@
       </w:tr>
       <w:tr>
         <w:trPr>
-          <w:tblHeader w:val="false"/>
+          <w:tblHeader w:val="off"/>
         </w:trPr>
         <w:tc>
           <w:tcPr>
@@ -539,7 +539,7 @@
       </w:tr>
       <w:tr>
         <w:trPr>
-          <w:tblHeader w:val="false"/>
+          <w:tblHeader w:val="off"/>
         </w:trPr>
         <w:tc>
           <w:tcPr>
@@ -611,7 +611,7 @@
       </w:tr>
       <w:tr>
         <w:trPr>
-          <w:tblHeader w:val="false"/>
+          <w:tblHeader w:val="off"/>
         </w:trPr>
         <w:tc>
           <w:tcPr>
@@ -1890,7 +1890,7 @@
       </w:tr>
       <w:tr>
         <w:trPr>
-          <w:tblHeader w:val="false"/>
+          <w:tblHeader w:val="off"/>
         </w:trPr>
         <w:tc>
           <w:tcPr>
@@ -2055,7 +2055,7 @@
       </w:tr>
       <w:tr>
         <w:trPr>
-          <w:tblHeader w:val="false"/>
+          <w:tblHeader w:val="off"/>
         </w:trPr>
         <w:tc>
           <w:tcPr>
@@ -2220,7 +2220,7 @@
       </w:tr>
       <w:tr>
         <w:trPr>
-          <w:tblHeader w:val="false"/>
+          <w:tblHeader w:val="off"/>
         </w:trPr>
         <w:tc>
           <w:tcPr>
@@ -2385,7 +2385,7 @@
       </w:tr>
       <w:tr>
         <w:trPr>
-          <w:tblHeader w:val="false"/>
+          <w:tblHeader w:val="off"/>
         </w:trPr>
         <w:tc>
           <w:tcPr>
@@ -2550,7 +2550,7 @@
       </w:tr>
       <w:tr>
         <w:trPr>
-          <w:tblHeader w:val="false"/>
+          <w:tblHeader w:val="off"/>
         </w:trPr>
         <w:tc>
           <w:tcPr>
@@ -2715,7 +2715,7 @@
       </w:tr>
       <w:tr>
         <w:trPr>
-          <w:tblHeader w:val="false"/>
+          <w:tblHeader w:val="off"/>
         </w:trPr>
         <w:tc>
           <w:tcPr>
@@ -3064,7 +3064,7 @@
       </w:tr>
       <w:tr>
         <w:trPr>
-          <w:tblHeader w:val="false"/>
+          <w:tblHeader w:val="off"/>
         </w:trPr>
         <w:tc>
           <w:tcPr>
@@ -3197,7 +3197,7 @@
       </w:tr>
       <w:tr>
         <w:trPr>
-          <w:tblHeader w:val="false"/>
+          <w:tblHeader w:val="off"/>
         </w:trPr>
         <w:tc>
           <w:tcPr>
@@ -3330,7 +3330,7 @@
       </w:tr>
       <w:tr>
         <w:trPr>
-          <w:tblHeader w:val="false"/>
+          <w:tblHeader w:val="off"/>
         </w:trPr>
         <w:tc>
           <w:tcPr>
@@ -3463,7 +3463,7 @@
       </w:tr>
       <w:tr>
         <w:trPr>
-          <w:tblHeader w:val="false"/>
+          <w:tblHeader w:val="off"/>
         </w:trPr>
         <w:tc>
           <w:tcPr>
@@ -3596,7 +3596,7 @@
       </w:tr>
       <w:tr>
         <w:trPr>
-          <w:tblHeader w:val="false"/>
+          <w:tblHeader w:val="off"/>
         </w:trPr>
         <w:tc>
           <w:tcPr>
@@ -3729,7 +3729,7 @@
       </w:tr>
       <w:tr>
         <w:trPr>
-          <w:tblHeader w:val="false"/>
+          <w:tblHeader w:val="off"/>
         </w:trPr>
         <w:tc>
           <w:tcPr>
@@ -3862,7 +3862,7 @@
       </w:tr>
       <w:tr>
         <w:trPr>
-          <w:tblHeader w:val="false"/>
+          <w:tblHeader w:val="off"/>
         </w:trPr>
         <w:tc>
           <w:tcPr>
@@ -3995,7 +3995,7 @@
       </w:tr>
       <w:tr>
         <w:trPr>
-          <w:tblHeader w:val="false"/>
+          <w:tblHeader w:val="off"/>
         </w:trPr>
         <w:tc>
           <w:tcPr>
@@ -4463,7 +4463,7 @@
       </w:tr>
       <w:tr>
         <w:trPr>
-          <w:tblHeader w:val="false"/>
+          <w:tblHeader w:val="off"/>
         </w:trPr>
         <w:tc>
           <w:tcPr>
@@ -4564,7 +4564,7 @@
       </w:tr>
       <w:tr>
         <w:trPr>
-          <w:tblHeader w:val="false"/>
+          <w:tblHeader w:val="off"/>
         </w:trPr>
         <w:tc>
           <w:tcPr>
@@ -4665,7 +4665,7 @@
       </w:tr>
       <w:tr>
         <w:trPr>
-          <w:tblHeader w:val="false"/>
+          <w:tblHeader w:val="off"/>
         </w:trPr>
         <w:tc>
           <w:tcPr>
@@ -4766,7 +4766,7 @@
       </w:tr>
       <w:tr>
         <w:trPr>
-          <w:tblHeader w:val="false"/>
+          <w:tblHeader w:val="off"/>
         </w:trPr>
         <w:tc>
           <w:tcPr>
@@ -4867,7 +4867,7 @@
       </w:tr>
       <w:tr>
         <w:trPr>
-          <w:tblHeader w:val="false"/>
+          <w:tblHeader w:val="off"/>
         </w:trPr>
         <w:tc>
           <w:tcPr>
@@ -4968,7 +4968,7 @@
       </w:tr>
       <w:tr>
         <w:trPr>
-          <w:tblHeader w:val="false"/>
+          <w:tblHeader w:val="off"/>
         </w:trPr>
         <w:tc>
           <w:tcPr>
@@ -5069,7 +5069,7 @@
       </w:tr>
       <w:tr>
         <w:trPr>
-          <w:tblHeader w:val="false"/>
+          <w:tblHeader w:val="off"/>
         </w:trPr>
         <w:tc>
           <w:tcPr>
@@ -5170,7 +5170,7 @@
       </w:tr>
       <w:tr>
         <w:trPr>
-          <w:tblHeader w:val="false"/>
+          <w:tblHeader w:val="off"/>
         </w:trPr>
         <w:tc>
           <w:tcPr>
@@ -5433,7 +5433,7 @@
       </w:tr>
       <w:tr>
         <w:trPr>
-          <w:tblHeader w:val="false"/>
+          <w:tblHeader w:val="off"/>
         </w:trPr>
         <w:tc>
           <w:tcPr>
@@ -5534,7 +5534,7 @@
       </w:tr>
       <w:tr>
         <w:trPr>
-          <w:tblHeader w:val="false"/>
+          <w:tblHeader w:val="off"/>
         </w:trPr>
         <w:tc>
           <w:tcPr>
@@ -5677,7 +5677,7 @@
       </w:tr>
       <w:tr>
         <w:trPr>
-          <w:tblHeader w:val="false"/>
+          <w:tblHeader w:val="off"/>
         </w:trPr>
         <w:tc>
           <w:tcPr>
@@ -5814,7 +5814,7 @@
       </w:tr>
       <w:tr>
         <w:trPr>
-          <w:tblHeader w:val="false"/>
+          <w:tblHeader w:val="off"/>
         </w:trPr>
         <w:tc>
           <w:tcPr>
@@ -5915,7 +5915,7 @@
       </w:tr>
       <w:tr>
         <w:trPr>
-          <w:tblHeader w:val="false"/>
+          <w:tblHeader w:val="off"/>
         </w:trPr>
         <w:tc>
           <w:tcPr>
@@ -6025,7 +6025,7 @@
       </w:tr>
       <w:tr>
         <w:trPr>
-          <w:tblHeader w:val="false"/>
+          <w:tblHeader w:val="off"/>
         </w:trPr>
         <w:tc>
           <w:tcPr>
@@ -6126,7 +6126,7 @@
       </w:tr>
       <w:tr>
         <w:trPr>
-          <w:tblHeader w:val="false"/>
+          <w:tblHeader w:val="off"/>
         </w:trPr>
         <w:tc>
           <w:tcPr>
@@ -6227,7 +6227,7 @@
       </w:tr>
       <w:tr>
         <w:trPr>
-          <w:tblHeader w:val="false"/>
+          <w:tblHeader w:val="off"/>
         </w:trPr>
         <w:tc>
           <w:tcPr>
@@ -6346,7 +6346,7 @@
       </w:tr>
       <w:tr>
         <w:trPr>
-          <w:tblHeader w:val="false"/>
+          <w:tblHeader w:val="off"/>
         </w:trPr>
         <w:tc>
           <w:tcPr>
@@ -6818,7 +6818,7 @@
       </w:tr>
       <w:tr>
         <w:trPr>
-          <w:tblHeader w:val="false"/>
+          <w:tblHeader w:val="off"/>
         </w:trPr>
         <w:tc>
           <w:tcPr>
@@ -6941,7 +6941,7 @@
       </w:tr>
       <w:tr>
         <w:trPr>
-          <w:tblHeader w:val="false"/>
+          <w:tblHeader w:val="off"/>
         </w:trPr>
         <w:tc>
           <w:tcPr>
@@ -7010,7 +7010,7 @@
       </w:tr>
       <w:tr>
         <w:trPr>
-          <w:tblHeader w:val="false"/>
+          <w:tblHeader w:val="off"/>
         </w:trPr>
         <w:tc>
           <w:tcPr>
@@ -7097,7 +7097,7 @@
       </w:tr>
       <w:tr>
         <w:trPr>
-          <w:tblHeader w:val="false"/>
+          <w:tblHeader w:val="off"/>
         </w:trPr>
         <w:tc>
           <w:tcPr>
@@ -8266,7 +8266,7 @@
       </w:tr>
       <w:tr>
         <w:trPr>
-          <w:tblHeader w:val="false"/>
+          <w:tblHeader w:val="off"/>
         </w:trPr>
         <w:tc>
           <w:tcPr>
@@ -8399,7 +8399,7 @@
       </w:tr>
       <w:tr>
         <w:trPr>
-          <w:tblHeader w:val="false"/>
+          <w:tblHeader w:val="off"/>
         </w:trPr>
         <w:tc>
           <w:tcPr>
@@ -8532,7 +8532,7 @@
       </w:tr>
       <w:tr>
         <w:trPr>
-          <w:tblHeader w:val="false"/>
+          <w:tblHeader w:val="off"/>
         </w:trPr>
         <w:tc>
           <w:tcPr>
@@ -8665,7 +8665,7 @@
       </w:tr>
       <w:tr>
         <w:trPr>
-          <w:tblHeader w:val="false"/>
+          <w:tblHeader w:val="off"/>
         </w:trPr>
         <w:tc>
           <w:tcPr>
@@ -9157,7 +9157,7 @@
       </w:tr>
       <w:tr>
         <w:trPr>
-          <w:tblHeader w:val="false"/>
+          <w:tblHeader w:val="off"/>
         </w:trPr>
         <w:tc>
           <w:tcPr>
@@ -9258,7 +9258,7 @@
       </w:tr>
       <w:tr>
         <w:trPr>
-          <w:tblHeader w:val="false"/>
+          <w:tblHeader w:val="off"/>
         </w:trPr>
         <w:tc>
           <w:tcPr>
@@ -9359,7 +9359,7 @@
       </w:tr>
       <w:tr>
         <w:trPr>
-          <w:tblHeader w:val="false"/>
+          <w:tblHeader w:val="off"/>
         </w:trPr>
         <w:tc>
           <w:tcPr>
@@ -9460,7 +9460,7 @@
       </w:tr>
       <w:tr>
         <w:trPr>
-          <w:tblHeader w:val="false"/>
+          <w:tblHeader w:val="off"/>
         </w:trPr>
         <w:tc>
           <w:tcPr>
@@ -9561,7 +9561,7 @@
       </w:tr>
       <w:tr>
         <w:trPr>
-          <w:tblHeader w:val="false"/>
+          <w:tblHeader w:val="off"/>
         </w:trPr>
         <w:tc>
           <w:tcPr>
@@ -9662,7 +9662,7 @@
       </w:tr>
       <w:tr>
         <w:trPr>
-          <w:tblHeader w:val="false"/>
+          <w:tblHeader w:val="off"/>
         </w:trPr>
         <w:tc>
           <w:tcPr>
@@ -9763,7 +9763,7 @@
       </w:tr>
       <w:tr>
         <w:trPr>
-          <w:tblHeader w:val="false"/>
+          <w:tblHeader w:val="off"/>
         </w:trPr>
         <w:tc>
           <w:tcPr>
@@ -9864,7 +9864,7 @@
       </w:tr>
       <w:tr>
         <w:trPr>
-          <w:tblHeader w:val="false"/>
+          <w:tblHeader w:val="off"/>
         </w:trPr>
         <w:tc>
           <w:tcPr>
@@ -9965,7 +9965,7 @@
       </w:tr>
       <w:tr>
         <w:trPr>
-          <w:tblHeader w:val="false"/>
+          <w:tblHeader w:val="off"/>
         </w:trPr>
         <w:tc>
           <w:tcPr>
@@ -10452,7 +10452,7 @@
       </w:tr>
       <w:tr>
         <w:trPr>
-          <w:tblHeader w:val="false"/>
+          <w:tblHeader w:val="off"/>
         </w:trPr>
         <w:tc>
           <w:tcPr>
@@ -10521,7 +10521,7 @@
       </w:tr>
       <w:tr>
         <w:trPr>
-          <w:tblHeader w:val="false"/>
+          <w:tblHeader w:val="off"/>
         </w:trPr>
         <w:tc>
           <w:tcPr>
@@ -10612,7 +10612,7 @@
       </w:tr>
       <w:tr>
         <w:trPr>
-          <w:tblHeader w:val="false"/>
+          <w:tblHeader w:val="off"/>
         </w:trPr>
         <w:tc>
           <w:tcPr>
@@ -10681,7 +10681,7 @@
       </w:tr>
       <w:tr>
         <w:trPr>
-          <w:tblHeader w:val="false"/>
+          <w:tblHeader w:val="off"/>
         </w:trPr>
         <w:tc>
           <w:tcPr>
@@ -10750,7 +10750,7 @@
       </w:tr>
       <w:tr>
         <w:trPr>
-          <w:tblHeader w:val="false"/>
+          <w:tblHeader w:val="off"/>
         </w:trPr>
         <w:tc>
           <w:tcPr>
@@ -10819,7 +10819,7 @@
       </w:tr>
       <w:tr>
         <w:trPr>
-          <w:tblHeader w:val="false"/>
+          <w:tblHeader w:val="off"/>
         </w:trPr>
         <w:tc>
           <w:tcPr>
@@ -11000,7 +11000,7 @@
       </w:tr>
       <w:tr>
         <w:trPr>
-          <w:tblHeader w:val="false"/>
+          <w:tblHeader w:val="off"/>
         </w:trPr>
         <w:tc>
           <w:tcPr>
@@ -11069,7 +11069,7 @@
       </w:tr>
       <w:tr>
         <w:trPr>
-          <w:tblHeader w:val="false"/>
+          <w:tblHeader w:val="off"/>
         </w:trPr>
         <w:tc>
           <w:tcPr>
@@ -11138,7 +11138,7 @@
       </w:tr>
       <w:tr>
         <w:trPr>
-          <w:tblHeader w:val="false"/>
+          <w:tblHeader w:val="off"/>
         </w:trPr>
         <w:tc>
           <w:tcPr>
@@ -11207,7 +11207,7 @@
       </w:tr>
       <w:tr>
         <w:trPr>
-          <w:tblHeader w:val="false"/>
+          <w:tblHeader w:val="off"/>
         </w:trPr>
         <w:tc>
           <w:tcPr>
@@ -11276,7 +11276,7 @@
       </w:tr>
       <w:tr>
         <w:trPr>
-          <w:tblHeader w:val="false"/>
+          <w:tblHeader w:val="off"/>
         </w:trPr>
         <w:tc>
           <w:tcPr>
@@ -11345,7 +11345,7 @@
       </w:tr>
       <w:tr>
         <w:trPr>
-          <w:tblHeader w:val="false"/>
+          <w:tblHeader w:val="off"/>
         </w:trPr>
         <w:tc>
           <w:tcPr>
@@ -11414,7 +11414,7 @@
       </w:tr>
       <w:tr>
         <w:trPr>
-          <w:tblHeader w:val="false"/>
+          <w:tblHeader w:val="off"/>
         </w:trPr>
         <w:tc>
           <w:tcPr>
@@ -11483,7 +11483,7 @@
       </w:tr>
       <w:tr>
         <w:trPr>
-          <w:tblHeader w:val="false"/>
+          <w:tblHeader w:val="off"/>
         </w:trPr>
         <w:tc>
           <w:tcPr>
@@ -11552,7 +11552,7 @@
       </w:tr>
       <w:tr>
         <w:trPr>
-          <w:tblHeader w:val="false"/>
+          <w:tblHeader w:val="off"/>
         </w:trPr>
         <w:tc>
           <w:tcPr>
@@ -11641,7 +11641,7 @@
       </w:tr>
       <w:tr>
         <w:trPr>
-          <w:tblHeader w:val="false"/>
+          <w:tblHeader w:val="off"/>
         </w:trPr>
         <w:tc>
           <w:tcPr>
@@ -11710,7 +11710,7 @@
       </w:tr>
       <w:tr>
         <w:trPr>
-          <w:tblHeader w:val="false"/>
+          <w:tblHeader w:val="off"/>
         </w:trPr>
         <w:tc>
           <w:tcPr>
@@ -11779,7 +11779,7 @@
       </w:tr>
       <w:tr>
         <w:trPr>
-          <w:tblHeader w:val="false"/>
+          <w:tblHeader w:val="off"/>
         </w:trPr>
         <w:tc>
           <w:tcPr>
@@ -11868,7 +11868,7 @@
       </w:tr>
       <w:tr>
         <w:trPr>
-          <w:tblHeader w:val="false"/>
+          <w:tblHeader w:val="off"/>
         </w:trPr>
         <w:tc>
           <w:tcPr>
@@ -11937,7 +11937,7 @@
       </w:tr>
       <w:tr>
         <w:trPr>
-          <w:tblHeader w:val="false"/>
+          <w:tblHeader w:val="off"/>
         </w:trPr>
         <w:tc>
           <w:tcPr>
@@ -12374,7 +12374,7 @@
       </w:tr>
       <w:tr>
         <w:trPr>
-          <w:tblHeader w:val="false"/>
+          <w:tblHeader w:val="off"/>
         </w:trPr>
         <w:tc>
           <w:tcPr>
@@ -12476,7 +12476,7 @@
       </w:tr>
       <w:tr>
         <w:trPr>
-          <w:tblHeader w:val="false"/>
+          <w:tblHeader w:val="off"/>
         </w:trPr>
         <w:tc>
           <w:tcPr>
@@ -12547,7 +12547,7 @@
       </w:tr>
       <w:tr>
         <w:trPr>
-          <w:tblHeader w:val="false"/>
+          <w:tblHeader w:val="off"/>
         </w:trPr>
         <w:tc>
           <w:tcPr>
@@ -12616,7 +12616,7 @@
       </w:tr>
       <w:tr>
         <w:trPr>
-          <w:tblHeader w:val="false"/>
+          <w:tblHeader w:val="off"/>
         </w:trPr>
         <w:tc>
           <w:tcPr>
@@ -12685,7 +12685,7 @@
       </w:tr>
       <w:tr>
         <w:trPr>
-          <w:tblHeader w:val="false"/>
+          <w:tblHeader w:val="off"/>
         </w:trPr>
         <w:tc>
           <w:tcPr>
@@ -12754,7 +12754,7 @@
       </w:tr>
       <w:tr>
         <w:trPr>
-          <w:tblHeader w:val="false"/>
+          <w:tblHeader w:val="off"/>
         </w:trPr>
         <w:tc>
           <w:tcPr>
@@ -12823,7 +12823,7 @@
       </w:tr>
       <w:tr>
         <w:trPr>
-          <w:tblHeader w:val="false"/>
+          <w:tblHeader w:val="off"/>
         </w:trPr>
         <w:tc>
           <w:tcPr>
@@ -12892,7 +12892,7 @@
       </w:tr>
       <w:tr>
         <w:trPr>
-          <w:tblHeader w:val="false"/>
+          <w:tblHeader w:val="off"/>
         </w:trPr>
         <w:tc>
           <w:tcPr>
@@ -12983,7 +12983,7 @@
       </w:tr>
       <w:tr>
         <w:trPr>
-          <w:tblHeader w:val="false"/>
+          <w:tblHeader w:val="off"/>
         </w:trPr>
         <w:tc>
           <w:tcPr>
@@ -13282,7 +13282,7 @@
       </w:tr>
       <w:tr>
         <w:trPr>
-          <w:tblHeader w:val="false"/>
+          <w:tblHeader w:val="off"/>
         </w:trPr>
         <w:tc>
           <w:tcPr>
@@ -13371,7 +13371,7 @@
       </w:tr>
       <w:tr>
         <w:trPr>
-          <w:tblHeader w:val="false"/>
+          <w:tblHeader w:val="off"/>
         </w:trPr>
         <w:tc>
           <w:tcPr>
@@ -13440,7 +13440,7 @@
       </w:tr>
       <w:tr>
         <w:trPr>
-          <w:tblHeader w:val="false"/>
+          <w:tblHeader w:val="off"/>
         </w:trPr>
         <w:tc>
           <w:tcPr>
@@ -13509,7 +13509,7 @@
       </w:tr>
       <w:tr>
         <w:trPr>
-          <w:tblHeader w:val="false"/>
+          <w:tblHeader w:val="off"/>
         </w:trPr>
         <w:tc>
           <w:tcPr>
@@ -13722,7 +13722,7 @@
       </w:tr>
       <w:tr>
         <w:trPr>
-          <w:tblHeader w:val="false"/>
+          <w:tblHeader w:val="off"/>
         </w:trPr>
         <w:tc>
           <w:tcPr>
@@ -13791,7 +13791,7 @@
       </w:tr>
       <w:tr>
         <w:trPr>
-          <w:tblHeader w:val="false"/>
+          <w:tblHeader w:val="off"/>
         </w:trPr>
         <w:tc>
           <w:tcPr>
@@ -13860,7 +13860,7 @@
       </w:tr>
       <w:tr>
         <w:trPr>
-          <w:tblHeader w:val="false"/>
+          <w:tblHeader w:val="off"/>
         </w:trPr>
         <w:tc>
           <w:tcPr>
@@ -13929,7 +13929,7 @@
       </w:tr>
       <w:tr>
         <w:trPr>
-          <w:tblHeader w:val="false"/>
+          <w:tblHeader w:val="off"/>
         </w:trPr>
         <w:tc>
           <w:tcPr>
@@ -14007,7 +14007,7 @@
       </w:tr>
       <w:tr>
         <w:trPr>
-          <w:tblHeader w:val="false"/>
+          <w:tblHeader w:val="off"/>
         </w:trPr>
         <w:tc>
           <w:tcPr>
@@ -14263,7 +14263,7 @@
       </w:tr>
       <w:tr>
         <w:trPr>
-          <w:tblHeader w:val="false"/>
+          <w:tblHeader w:val="off"/>
         </w:trPr>
         <w:tc>
           <w:tcPr>
@@ -14332,7 +14332,7 @@
       </w:tr>
       <w:tr>
         <w:trPr>
-          <w:tblHeader w:val="false"/>
+          <w:tblHeader w:val="off"/>
         </w:trPr>
         <w:tc>
           <w:tcPr>
@@ -14401,7 +14401,7 @@
       </w:tr>
       <w:tr>
         <w:trPr>
-          <w:tblHeader w:val="false"/>
+          <w:tblHeader w:val="off"/>
         </w:trPr>
         <w:tc>
           <w:tcPr>
@@ -14470,7 +14470,7 @@
       </w:tr>
       <w:tr>
         <w:trPr>
-          <w:tblHeader w:val="false"/>
+          <w:tblHeader w:val="off"/>
         </w:trPr>
         <w:tc>
           <w:tcPr>
@@ -14651,7 +14651,7 @@
       </w:tr>
       <w:tr>
         <w:trPr>
-          <w:tblHeader w:val="false"/>
+          <w:tblHeader w:val="off"/>
         </w:trPr>
         <w:tc>
           <w:tcPr>
@@ -14720,7 +14720,7 @@
       </w:tr>
       <w:tr>
         <w:trPr>
-          <w:tblHeader w:val="false"/>
+          <w:tblHeader w:val="off"/>
         </w:trPr>
         <w:tc>
           <w:tcPr>
@@ -14789,7 +14789,7 @@
       </w:tr>
       <w:tr>
         <w:trPr>
-          <w:tblHeader w:val="false"/>
+          <w:tblHeader w:val="off"/>
         </w:trPr>
         <w:tc>
           <w:tcPr>
@@ -14858,7 +14858,7 @@
       </w:tr>
       <w:tr>
         <w:trPr>
-          <w:tblHeader w:val="false"/>
+          <w:tblHeader w:val="off"/>
         </w:trPr>
         <w:tc>
           <w:tcPr>
@@ -15225,7 +15225,7 @@
       </w:tr>
       <w:tr>
         <w:trPr>
-          <w:tblHeader w:val="false"/>
+          <w:tblHeader w:val="off"/>
         </w:trPr>
         <w:tc>
           <w:tcPr>
@@ -15358,7 +15358,7 @@
       </w:tr>
       <w:tr>
         <w:trPr>
-          <w:tblHeader w:val="false"/>
+          <w:tblHeader w:val="off"/>
         </w:trPr>
         <w:tc>
           <w:tcPr>
@@ -15491,7 +15491,7 @@
       </w:tr>
       <w:tr>
         <w:trPr>
-          <w:tblHeader w:val="false"/>
+          <w:tblHeader w:val="off"/>
         </w:trPr>
         <w:tc>
           <w:tcPr>
@@ -15624,7 +15624,7 @@
       </w:tr>
       <w:tr>
         <w:trPr>
-          <w:tblHeader w:val="false"/>
+          <w:tblHeader w:val="off"/>
         </w:trPr>
         <w:tc>
           <w:tcPr>
@@ -15757,7 +15757,7 @@
       </w:tr>
       <w:tr>
         <w:trPr>
-          <w:tblHeader w:val="false"/>
+          <w:tblHeader w:val="off"/>
         </w:trPr>
         <w:tc>
           <w:tcPr>
@@ -15890,7 +15890,7 @@
       </w:tr>
       <w:tr>
         <w:trPr>
-          <w:tblHeader w:val="false"/>
+          <w:tblHeader w:val="off"/>
         </w:trPr>
         <w:tc>
           <w:tcPr>
@@ -16023,7 +16023,7 @@
       </w:tr>
       <w:tr>
         <w:trPr>
-          <w:tblHeader w:val="false"/>
+          <w:tblHeader w:val="off"/>
         </w:trPr>
         <w:tc>
           <w:tcPr>
@@ -16156,7 +16156,7 @@
       </w:tr>
       <w:tr>
         <w:trPr>
-          <w:tblHeader w:val="false"/>
+          <w:tblHeader w:val="off"/>
         </w:trPr>
         <w:tc>
           <w:tcPr>
@@ -16289,7 +16289,7 @@
       </w:tr>
       <w:tr>
         <w:trPr>
-          <w:tblHeader w:val="false"/>
+          <w:tblHeader w:val="off"/>
         </w:trPr>
         <w:tc>
           <w:tcPr>
@@ -16422,7 +16422,7 @@
       </w:tr>
       <w:tr>
         <w:trPr>
-          <w:tblHeader w:val="false"/>
+          <w:tblHeader w:val="off"/>
         </w:trPr>
         <w:tc>
           <w:tcPr>
@@ -16555,7 +16555,7 @@
       </w:tr>
       <w:tr>
         <w:trPr>
-          <w:tblHeader w:val="false"/>
+          <w:tblHeader w:val="off"/>
         </w:trPr>
         <w:tc>
           <w:tcPr>
@@ -16670,7 +16670,7 @@
       </w:tr>
       <w:tr>
         <w:trPr>
-          <w:tblHeader w:val="false"/>
+          <w:tblHeader w:val="off"/>
         </w:trPr>
         <w:tc>
           <w:tcPr>
@@ -16983,7 +16983,7 @@
       </w:tr>
       <w:tr>
         <w:trPr>
-          <w:tblHeader w:val="false"/>
+          <w:tblHeader w:val="off"/>
         </w:trPr>
         <w:tc>
           <w:tcPr>
@@ -17116,7 +17116,7 @@
       </w:tr>
       <w:tr>
         <w:trPr>
-          <w:tblHeader w:val="false"/>
+          <w:tblHeader w:val="off"/>
         </w:trPr>
         <w:tc>
           <w:tcPr>
@@ -17249,7 +17249,7 @@
       </w:tr>
       <w:tr>
         <w:trPr>
-          <w:tblHeader w:val="false"/>
+          <w:tblHeader w:val="off"/>
         </w:trPr>
         <w:tc>
           <w:tcPr>
@@ -17382,7 +17382,7 @@
       </w:tr>
       <w:tr>
         <w:trPr>
-          <w:tblHeader w:val="false"/>
+          <w:tblHeader w:val="off"/>
         </w:trPr>
         <w:tc>
           <w:tcPr>
@@ -17506,7 +17506,7 @@
       </w:tr>
       <w:tr>
         <w:trPr>
-          <w:tblHeader w:val="false"/>
+          <w:tblHeader w:val="off"/>
         </w:trPr>
         <w:tc>
           <w:tcPr>
@@ -17641,7 +17641,7 @@
       </w:tr>
       <w:tr>
         <w:trPr>
-          <w:tblHeader w:val="false"/>
+          <w:tblHeader w:val="off"/>
         </w:trPr>
         <w:tc>
           <w:tcPr>
@@ -18060,7 +18060,7 @@
       </w:tr>
       <w:tr>
         <w:trPr>
-          <w:tblHeader w:val="false"/>
+          <w:tblHeader w:val="off"/>
         </w:trPr>
         <w:tc>
           <w:tcPr>
@@ -18257,7 +18257,7 @@
       </w:tr>
       <w:tr>
         <w:trPr>
-          <w:tblHeader w:val="false"/>
+          <w:tblHeader w:val="off"/>
         </w:trPr>
         <w:tc>
           <w:tcPr>
@@ -18454,7 +18454,7 @@
       </w:tr>
       <w:tr>
         <w:trPr>
-          <w:tblHeader w:val="false"/>
+          <w:tblHeader w:val="off"/>
         </w:trPr>
         <w:tc>
           <w:tcPr>
@@ -18662,7 +18662,7 @@
       </w:tr>
       <w:tr>
         <w:trPr>
-          <w:tblHeader w:val="false"/>
+          <w:tblHeader w:val="off"/>
         </w:trPr>
         <w:tc>
           <w:tcPr>
@@ -19208,7 +19208,7 @@
           <wp:inline distT="0" distB="0" distL="0" distR="0">
             <wp:extent cx="6124575" cy="4886325"/>
             <wp:effectExtent t="0" r="0" b="0" l="0"/>
-            <wp:docPr id="1" name="D-Load" descr="D-Load" title="D-Load"/>
+            <wp:docPr id="2" name="D-Load" descr="D-Load" title="D-Load"/>
             <wp:cNvGraphicFramePr>
               <a:graphicFrameLocks xmlns:a="http://schemas.openxmlformats.org/drawingml/2006/main" noChangeAspect="1"/>
             </wp:cNvGraphicFramePr>
@@ -19301,7 +19301,7 @@
           <wp:inline distT="0" distB="0" distL="0" distR="0">
             <wp:extent cx="6124575" cy="4171950"/>
             <wp:effectExtent t="0" r="0" b="0" l="0"/>
-            <wp:docPr id="1" name="D-Quality" descr="D-Quality" title="D-Quality"/>
+            <wp:docPr id="3" name="D-Quality" descr="D-Quality" title="D-Quality"/>
             <wp:cNvGraphicFramePr>
               <a:graphicFrameLocks xmlns:a="http://schemas.openxmlformats.org/drawingml/2006/main" noChangeAspect="1"/>
             </wp:cNvGraphicFramePr>
@@ -19394,7 +19394,7 @@
           <wp:inline distT="0" distB="0" distL="0" distR="0">
             <wp:extent cx="6124575" cy="4171950"/>
             <wp:effectExtent t="0" r="0" b="0" l="0"/>
-            <wp:docPr id="1" name="D-R&amp;D" descr="D-R&amp;D" title="D-R&amp;D"/>
+            <wp:docPr id="4" name="D-R&amp;D" descr="D-R&amp;D" title="D-R&amp;D"/>
             <wp:cNvGraphicFramePr>
               <a:graphicFrameLocks xmlns:a="http://schemas.openxmlformats.org/drawingml/2006/main" noChangeAspect="1"/>
             </wp:cNvGraphicFramePr>
@@ -19487,7 +19487,7 @@
           <wp:inline distT="0" distB="0" distL="0" distR="0">
             <wp:extent cx="6124575" cy="4171950"/>
             <wp:effectExtent t="0" r="0" b="0" l="0"/>
-            <wp:docPr id="1" name="D-Customer" descr="D-Customer" title="D-Customer"/>
+            <wp:docPr id="5" name="D-Customer" descr="D-Customer" title="D-Customer"/>
             <wp:cNvGraphicFramePr>
               <a:graphicFrameLocks xmlns:a="http://schemas.openxmlformats.org/drawingml/2006/main" noChangeAspect="1"/>
             </wp:cNvGraphicFramePr>
@@ -19596,7 +19596,7 @@
           <wp:inline distT="0" distB="0" distL="0" distR="0">
             <wp:extent cx="6124575" cy="4171950"/>
             <wp:effectExtent t="0" r="0" b="0" l="0"/>
-            <wp:docPr id="1" name="D-Safety" descr="D-Safety" title="D-Safety"/>
+            <wp:docPr id="6" name="D-Safety" descr="D-Safety" title="D-Safety"/>
             <wp:cNvGraphicFramePr>
               <a:graphicFrameLocks xmlns:a="http://schemas.openxmlformats.org/drawingml/2006/main" noChangeAspect="1"/>
             </wp:cNvGraphicFramePr>
@@ -19689,7 +19689,7 @@
           <wp:inline distT="0" distB="0" distL="0" distR="0">
             <wp:extent cx="6124575" cy="4171950"/>
             <wp:effectExtent t="0" r="0" b="0" l="0"/>
-            <wp:docPr id="1" name="D-MR" descr="D-MR" title="D-MR"/>
+            <wp:docPr id="7" name="D-MR" descr="D-MR" title="D-MR"/>
             <wp:cNvGraphicFramePr>
               <a:graphicFrameLocks xmlns:a="http://schemas.openxmlformats.org/drawingml/2006/main" noChangeAspect="1"/>
             </wp:cNvGraphicFramePr>
@@ -19928,7 +19928,7 @@
       </w:tr>
       <w:tr>
         <w:trPr>
-          <w:tblHeader w:val="false"/>
+          <w:tblHeader w:val="off"/>
         </w:trPr>
         <w:tc>
           <w:tcPr>
@@ -20029,7 +20029,7 @@
       </w:tr>
       <w:tr>
         <w:trPr>
-          <w:tblHeader w:val="false"/>
+          <w:tblHeader w:val="off"/>
         </w:trPr>
         <w:tc>
           <w:tcPr>
@@ -20130,7 +20130,7 @@
       </w:tr>
       <w:tr>
         <w:trPr>
-          <w:tblHeader w:val="false"/>
+          <w:tblHeader w:val="off"/>
         </w:trPr>
         <w:tc>
           <w:tcPr>
@@ -20231,7 +20231,7 @@
       </w:tr>
       <w:tr>
         <w:trPr>
-          <w:tblHeader w:val="false"/>
+          <w:tblHeader w:val="off"/>
         </w:trPr>
         <w:tc>
           <w:tcPr>
@@ -20552,7 +20552,7 @@
       </w:tr>
       <w:tr>
         <w:trPr>
-          <w:tblHeader w:val="false"/>
+          <w:tblHeader w:val="off"/>
         </w:trPr>
         <w:tc>
           <w:tcPr>
@@ -20719,7 +20719,7 @@
       </w:tr>
       <w:tr>
         <w:trPr>
-          <w:tblHeader w:val="false"/>
+          <w:tblHeader w:val="off"/>
         </w:trPr>
         <w:tc>
           <w:tcPr>
@@ -20884,7 +20884,7 @@
       </w:tr>
       <w:tr>
         <w:trPr>
-          <w:tblHeader w:val="false"/>
+          <w:tblHeader w:val="off"/>
         </w:trPr>
         <w:tc>
           <w:tcPr>
@@ -21049,7 +21049,7 @@
       </w:tr>
       <w:tr>
         <w:trPr>
-          <w:tblHeader w:val="false"/>
+          <w:tblHeader w:val="off"/>
         </w:trPr>
         <w:tc>
           <w:tcPr>
@@ -21680,7 +21680,7 @@
       </w:tr>
       <w:tr>
         <w:trPr>
-          <w:tblHeader w:val="false"/>
+          <w:tblHeader w:val="off"/>
         </w:trPr>
         <w:tc>
           <w:tcPr>
@@ -21749,7 +21749,7 @@
       </w:tr>
       <w:tr>
         <w:trPr>
-          <w:tblHeader w:val="false"/>
+          <w:tblHeader w:val="off"/>
         </w:trPr>
         <w:tc>
           <w:tcPr>
@@ -21818,7 +21818,7 @@
       </w:tr>
       <w:tr>
         <w:trPr>
-          <w:tblHeader w:val="false"/>
+          <w:tblHeader w:val="off"/>
         </w:trPr>
         <w:tc>
           <w:tcPr>
@@ -21887,7 +21887,7 @@
       </w:tr>
       <w:tr>
         <w:trPr>
-          <w:tblHeader w:val="false"/>
+          <w:tblHeader w:val="off"/>
         </w:trPr>
         <w:tc>
           <w:tcPr>
@@ -21956,7 +21956,7 @@
       </w:tr>
       <w:tr>
         <w:trPr>
-          <w:tblHeader w:val="false"/>
+          <w:tblHeader w:val="off"/>
         </w:trPr>
         <w:tc>
           <w:tcPr>
@@ -22027,7 +22027,7 @@
       </w:tr>
       <w:tr>
         <w:trPr>
-          <w:tblHeader w:val="false"/>
+          <w:tblHeader w:val="off"/>
         </w:trPr>
         <w:tc>
           <w:tcPr>
@@ -22096,7 +22096,7 @@
       </w:tr>
       <w:tr>
         <w:trPr>
-          <w:tblHeader w:val="false"/>
+          <w:tblHeader w:val="off"/>
         </w:trPr>
         <w:tc>
           <w:tcPr>
@@ -22422,7 +22422,7 @@
       </w:tr>
       <w:tr>
         <w:trPr>
-          <w:tblHeader w:val="false"/>
+          <w:tblHeader w:val="off"/>
         </w:trPr>
         <w:tc>
           <w:tcPr>
@@ -22587,7 +22587,7 @@
       </w:tr>
       <w:tr>
         <w:trPr>
-          <w:tblHeader w:val="false"/>
+          <w:tblHeader w:val="off"/>
         </w:trPr>
         <w:tc>
           <w:tcPr>
@@ -22752,7 +22752,7 @@
       </w:tr>
       <w:tr>
         <w:trPr>
-          <w:tblHeader w:val="false"/>
+          <w:tblHeader w:val="off"/>
         </w:trPr>
         <w:tc>
           <w:tcPr>
@@ -22917,7 +22917,7 @@
       </w:tr>
       <w:tr>
         <w:trPr>
-          <w:tblHeader w:val="false"/>
+          <w:tblHeader w:val="off"/>
         </w:trPr>
         <w:tc>
           <w:tcPr>
@@ -23082,7 +23082,7 @@
       </w:tr>
       <w:tr>
         <w:trPr>
-          <w:tblHeader w:val="false"/>
+          <w:tblHeader w:val="off"/>
         </w:trPr>
         <w:tc>
           <w:tcPr>
@@ -23247,7 +23247,7 @@
       </w:tr>
       <w:tr>
         <w:trPr>
-          <w:tblHeader w:val="false"/>
+          <w:tblHeader w:val="off"/>
         </w:trPr>
         <w:tc>
           <w:tcPr>
@@ -23412,7 +23412,7 @@
       </w:tr>
       <w:tr>
         <w:trPr>
-          <w:tblHeader w:val="false"/>
+          <w:tblHeader w:val="off"/>
         </w:trPr>
         <w:tc>
           <w:tcPr>
@@ -23797,7 +23797,7 @@
       </w:tr>
       <w:tr>
         <w:trPr>
-          <w:tblHeader w:val="false"/>
+          <w:tblHeader w:val="off"/>
         </w:trPr>
         <w:tc>
           <w:tcPr>
@@ -23973,7 +23973,7 @@
       </w:tr>
       <w:tr>
         <w:trPr>
-          <w:tblHeader w:val="false"/>
+          <w:tblHeader w:val="off"/>
         </w:trPr>
         <w:tc>
           <w:tcPr>
@@ -24138,7 +24138,7 @@
       </w:tr>
       <w:tr>
         <w:trPr>
-          <w:tblHeader w:val="false"/>
+          <w:tblHeader w:val="off"/>
         </w:trPr>
         <w:tc>
           <w:tcPr>
@@ -24303,7 +24303,7 @@
       </w:tr>
       <w:tr>
         <w:trPr>
-          <w:tblHeader w:val="false"/>
+          <w:tblHeader w:val="off"/>
         </w:trPr>
         <w:tc>
           <w:tcPr>
@@ -24468,7 +24468,7 @@
       </w:tr>
       <w:tr>
         <w:trPr>
-          <w:tblHeader w:val="false"/>
+          <w:tblHeader w:val="off"/>
         </w:trPr>
         <w:tc>
           <w:tcPr>
@@ -24642,7 +24642,7 @@
       </w:tr>
       <w:tr>
         <w:trPr>
-          <w:tblHeader w:val="false"/>
+          <w:tblHeader w:val="off"/>
         </w:trPr>
         <w:tc>
           <w:tcPr>
@@ -24807,7 +24807,7 @@
       </w:tr>
       <w:tr>
         <w:trPr>
-          <w:tblHeader w:val="false"/>
+          <w:tblHeader w:val="off"/>
         </w:trPr>
         <w:tc>
           <w:tcPr>
@@ -24972,7 +24972,7 @@
       </w:tr>
       <w:tr>
         <w:trPr>
-          <w:tblHeader w:val="false"/>
+          <w:tblHeader w:val="off"/>
         </w:trPr>
         <w:tc>
           <w:tcPr>
@@ -25357,7 +25357,7 @@
       </w:tr>
       <w:tr>
         <w:trPr>
-          <w:tblHeader w:val="false"/>
+          <w:tblHeader w:val="off"/>
         </w:trPr>
         <w:tc>
           <w:tcPr>
@@ -25522,7 +25522,7 @@
       </w:tr>
       <w:tr>
         <w:trPr>
-          <w:tblHeader w:val="false"/>
+          <w:tblHeader w:val="off"/>
         </w:trPr>
         <w:tc>
           <w:tcPr>
@@ -25687,7 +25687,7 @@
       </w:tr>
       <w:tr>
         <w:trPr>
-          <w:tblHeader w:val="false"/>
+          <w:tblHeader w:val="off"/>
         </w:trPr>
         <w:tc>
           <w:tcPr>
@@ -25879,7 +25879,7 @@
       </w:tr>
       <w:tr>
         <w:trPr>
-          <w:tblHeader w:val="false"/>
+          <w:tblHeader w:val="off"/>
         </w:trPr>
         <w:tc>
           <w:tcPr>
@@ -26044,7 +26044,7 @@
       </w:tr>
       <w:tr>
         <w:trPr>
-          <w:tblHeader w:val="false"/>
+          <w:tblHeader w:val="off"/>
         </w:trPr>
         <w:tc>
           <w:tcPr>
@@ -26209,7 +26209,7 @@
       </w:tr>
       <w:tr>
         <w:trPr>
-          <w:tblHeader w:val="false"/>
+          <w:tblHeader w:val="off"/>
         </w:trPr>
         <w:tc>
           <w:tcPr>
@@ -26374,7 +26374,7 @@
       </w:tr>
       <w:tr>
         <w:trPr>
-          <w:tblHeader w:val="false"/>
+          <w:tblHeader w:val="off"/>
         </w:trPr>
         <w:tc>
           <w:tcPr>
@@ -26795,7 +26795,7 @@
       </w:tr>
       <w:tr>
         <w:trPr>
-          <w:tblHeader w:val="false"/>
+          <w:tblHeader w:val="off"/>
         </w:trPr>
         <w:tc>
           <w:tcPr>
@@ -26992,7 +26992,7 @@
       </w:tr>
       <w:tr>
         <w:trPr>
-          <w:tblHeader w:val="false"/>
+          <w:tblHeader w:val="off"/>
         </w:trPr>
         <w:tc>
           <w:tcPr>
@@ -27189,7 +27189,7 @@
       </w:tr>
       <w:tr>
         <w:trPr>
-          <w:tblHeader w:val="false"/>
+          <w:tblHeader w:val="off"/>
         </w:trPr>
         <w:tc>
           <w:tcPr>
@@ -27386,7 +27386,7 @@
       </w:tr>
       <w:tr>
         <w:trPr>
-          <w:tblHeader w:val="false"/>
+          <w:tblHeader w:val="off"/>
         </w:trPr>
         <w:tc>
           <w:tcPr>
@@ -27583,7 +27583,7 @@
       </w:tr>
       <w:tr>
         <w:trPr>
-          <w:tblHeader w:val="false"/>
+          <w:tblHeader w:val="off"/>
         </w:trPr>
         <w:tc>
           <w:tcPr>
@@ -27780,7 +27780,7 @@
       </w:tr>
       <w:tr>
         <w:trPr>
-          <w:tblHeader w:val="false"/>
+          <w:tblHeader w:val="off"/>
         </w:trPr>
         <w:tc>
           <w:tcPr>
@@ -27977,7 +27977,7 @@
       </w:tr>
       <w:tr>
         <w:trPr>
-          <w:tblHeader w:val="false"/>
+          <w:tblHeader w:val="off"/>
         </w:trPr>
         <w:tc>
           <w:tcPr>
@@ -28497,7 +28497,7 @@
       </w:tr>
       <w:tr>
         <w:trPr>
-          <w:tblHeader w:val="false"/>
+          <w:tblHeader w:val="off"/>
         </w:trPr>
         <w:tc>
           <w:tcPr>
@@ -28662,7 +28662,7 @@
       </w:tr>
       <w:tr>
         <w:trPr>
-          <w:tblHeader w:val="false"/>
+          <w:tblHeader w:val="off"/>
         </w:trPr>
         <w:tc>
           <w:tcPr>
@@ -28827,7 +28827,7 @@
       </w:tr>
       <w:tr>
         <w:trPr>
-          <w:tblHeader w:val="false"/>
+          <w:tblHeader w:val="off"/>
         </w:trPr>
         <w:tc>
           <w:tcPr>
@@ -28992,7 +28992,7 @@
       </w:tr>
       <w:tr>
         <w:trPr>
-          <w:tblHeader w:val="false"/>
+          <w:tblHeader w:val="off"/>
         </w:trPr>
         <w:tc>
           <w:tcPr>
@@ -29388,7 +29388,7 @@
       </w:tr>
       <w:tr>
         <w:trPr>
-          <w:tblHeader w:val="false"/>
+          <w:tblHeader w:val="off"/>
         </w:trPr>
         <w:tc>
           <w:tcPr>
@@ -29553,7 +29553,7 @@
       </w:tr>
       <w:tr>
         <w:trPr>
-          <w:tblHeader w:val="false"/>
+          <w:tblHeader w:val="off"/>
         </w:trPr>
         <w:tc>
           <w:tcPr>
@@ -29727,7 +29727,7 @@
       </w:tr>
       <w:tr>
         <w:trPr>
-          <w:tblHeader w:val="false"/>
+          <w:tblHeader w:val="off"/>
         </w:trPr>
         <w:tc>
           <w:tcPr>
@@ -29892,7 +29892,7 @@
       </w:tr>
       <w:tr>
         <w:trPr>
-          <w:tblHeader w:val="false"/>
+          <w:tblHeader w:val="off"/>
         </w:trPr>
         <w:tc>
           <w:tcPr>
@@ -30241,7 +30241,7 @@
       </w:tr>
       <w:tr>
         <w:trPr>
-          <w:tblHeader w:val="false"/>
+          <w:tblHeader w:val="off"/>
         </w:trPr>
         <w:tc>
           <w:tcPr>
@@ -30374,7 +30374,7 @@
       </w:tr>
       <w:tr>
         <w:trPr>
-          <w:tblHeader w:val="false"/>
+          <w:tblHeader w:val="off"/>
         </w:trPr>
         <w:tc>
           <w:tcPr>
@@ -30507,7 +30507,7 @@
       </w:tr>
       <w:tr>
         <w:trPr>
-          <w:tblHeader w:val="false"/>
+          <w:tblHeader w:val="off"/>
         </w:trPr>
         <w:tc>
           <w:tcPr>
@@ -30824,7 +30824,7 @@
       </w:tr>
       <w:tr>
         <w:trPr>
-          <w:tblHeader w:val="false"/>
+          <w:tblHeader w:val="off"/>
         </w:trPr>
         <w:tc>
           <w:tcPr>
@@ -30959,7 +30959,7 @@
       </w:tr>
       <w:tr>
         <w:trPr>
-          <w:tblHeader w:val="false"/>
+          <w:tblHeader w:val="off"/>
         </w:trPr>
         <w:tc>
           <w:tcPr>
@@ -31094,7 +31094,7 @@
       </w:tr>
       <w:tr>
         <w:trPr>
-          <w:tblHeader w:val="false"/>
+          <w:tblHeader w:val="off"/>
         </w:trPr>
         <w:tc>
           <w:tcPr>
@@ -31229,7 +31229,7 @@
       </w:tr>
       <w:tr>
         <w:trPr>
-          <w:tblHeader w:val="false"/>
+          <w:tblHeader w:val="off"/>
         </w:trPr>
         <w:tc>
           <w:tcPr>
@@ -31364,7 +31364,7 @@
       </w:tr>
       <w:tr>
         <w:trPr>
-          <w:tblHeader w:val="false"/>
+          <w:tblHeader w:val="off"/>
         </w:trPr>
         <w:tc>
           <w:tcPr>
@@ -31499,7 +31499,7 @@
       </w:tr>
       <w:tr>
         <w:trPr>
-          <w:tblHeader w:val="false"/>
+          <w:tblHeader w:val="off"/>
         </w:trPr>
         <w:tc>
           <w:tcPr>
@@ -31634,7 +31634,7 @@
       </w:tr>
       <w:tr>
         <w:trPr>
-          <w:tblHeader w:val="false"/>
+          <w:tblHeader w:val="off"/>
         </w:trPr>
         <w:tc>
           <w:tcPr>
@@ -31769,7 +31769,7 @@
       </w:tr>
       <w:tr>
         <w:trPr>
-          <w:tblHeader w:val="false"/>
+          <w:tblHeader w:val="off"/>
         </w:trPr>
         <w:tc>
           <w:tcPr>
@@ -31904,7 +31904,7 @@
       </w:tr>
       <w:tr>
         <w:trPr>
-          <w:tblHeader w:val="false"/>
+          <w:tblHeader w:val="off"/>
         </w:trPr>
         <w:tc>
           <w:tcPr>
@@ -32039,7 +32039,7 @@
       </w:tr>
       <w:tr>
         <w:trPr>
-          <w:tblHeader w:val="false"/>
+          <w:tblHeader w:val="off"/>
         </w:trPr>
         <w:tc>
           <w:tcPr>
@@ -32559,7 +32559,7 @@
       </w:tr>
       <w:tr>
         <w:trPr>
-          <w:tblHeader w:val="false"/>
+          <w:tblHeader w:val="off"/>
         </w:trPr>
         <w:tc>
           <w:tcPr>
@@ -32692,7 +32692,7 @@
       </w:tr>
       <w:tr>
         <w:trPr>
-          <w:tblHeader w:val="false"/>
+          <w:tblHeader w:val="off"/>
         </w:trPr>
         <w:tc>
           <w:tcPr>
@@ -32825,7 +32825,7 @@
       </w:tr>
       <w:tr>
         <w:trPr>
-          <w:tblHeader w:val="false"/>
+          <w:tblHeader w:val="off"/>
         </w:trPr>
         <w:tc>
           <w:tcPr>
@@ -32958,7 +32958,7 @@
       </w:tr>
       <w:tr>
         <w:trPr>
-          <w:tblHeader w:val="false"/>
+          <w:tblHeader w:val="off"/>
         </w:trPr>
         <w:tc>
           <w:tcPr>
@@ -33091,7 +33091,7 @@
       </w:tr>
       <w:tr>
         <w:trPr>
-          <w:tblHeader w:val="false"/>
+          <w:tblHeader w:val="off"/>
         </w:trPr>
         <w:tc>
           <w:tcPr>
@@ -33224,7 +33224,7 @@
       </w:tr>
       <w:tr>
         <w:trPr>
-          <w:tblHeader w:val="false"/>
+          <w:tblHeader w:val="off"/>
         </w:trPr>
         <w:tc>
           <w:tcPr>
@@ -33357,7 +33357,7 @@
       </w:tr>
       <w:tr>
         <w:trPr>
-          <w:tblHeader w:val="false"/>
+          <w:tblHeader w:val="off"/>
         </w:trPr>
         <w:tc>
           <w:tcPr>
@@ -33490,7 +33490,7 @@
       </w:tr>
       <w:tr>
         <w:trPr>
-          <w:tblHeader w:val="false"/>
+          <w:tblHeader w:val="off"/>
         </w:trPr>
         <w:tc>
           <w:tcPr>
@@ -33623,7 +33623,7 @@
       </w:tr>
       <w:tr>
         <w:trPr>
-          <w:tblHeader w:val="false"/>
+          <w:tblHeader w:val="off"/>
         </w:trPr>
         <w:tc>
           <w:tcPr>
@@ -33756,7 +33756,7 @@
       </w:tr>
       <w:tr>
         <w:trPr>
-          <w:tblHeader w:val="false"/>
+          <w:tblHeader w:val="off"/>
         </w:trPr>
         <w:tc>
           <w:tcPr>
@@ -33889,7 +33889,7 @@
       </w:tr>
       <w:tr>
         <w:trPr>
-          <w:tblHeader w:val="false"/>
+          <w:tblHeader w:val="off"/>
         </w:trPr>
         <w:tc>
           <w:tcPr>
@@ -34022,7 +34022,7 @@
       </w:tr>
       <w:tr>
         <w:trPr>
-          <w:tblHeader w:val="false"/>
+          <w:tblHeader w:val="off"/>
         </w:trPr>
         <w:tc>
           <w:tcPr>
@@ -34155,7 +34155,7 @@
       </w:tr>
       <w:tr>
         <w:trPr>
-          <w:tblHeader w:val="false"/>
+          <w:tblHeader w:val="off"/>
         </w:trPr>
         <w:tc>
           <w:tcPr>
@@ -34288,7 +34288,7 @@
       </w:tr>
       <w:tr>
         <w:trPr>
-          <w:tblHeader w:val="false"/>
+          <w:tblHeader w:val="off"/>
         </w:trPr>
         <w:tc>
           <w:tcPr>
@@ -34449,7 +34449,7 @@
           <w:rFonts w:ascii="Arial" w:cs="Arial" w:eastAsia="Arial" w:hAnsi="Arial"/>
           <w:rtl/>
         </w:rPr>
-        <w:t xml:space="preserve">אף אחת מהנקודות האלה לא חוסמת את תחילת העבודה. כל אחת משויכת למשימה בפרק 13.</w:t>
+        <w:t xml:space="preserve">רק Q7, ההסכם עם היועץ, חוסמת את תחילת העבודה: בלי הזמנת עבודה חתומה היועץ לא מתחיל. שאר הנקודות לא חוסמות. כל אחת משויכת למשימה בפרק 13.</w:t>
       </w:r>
     </w:p>
     <w:tbl>
@@ -34619,7 +34619,7 @@
       </w:tr>
       <w:tr>
         <w:trPr>
-          <w:tblHeader w:val="false"/>
+          <w:tblHeader w:val="off"/>
         </w:trPr>
         <w:tc>
           <w:tcPr>
@@ -34752,7 +34752,7 @@
       </w:tr>
       <w:tr>
         <w:trPr>
-          <w:tblHeader w:val="false"/>
+          <w:tblHeader w:val="off"/>
         </w:trPr>
         <w:tc>
           <w:tcPr>
@@ -34885,7 +34885,7 @@
       </w:tr>
       <w:tr>
         <w:trPr>
-          <w:tblHeader w:val="false"/>
+          <w:tblHeader w:val="off"/>
         </w:trPr>
         <w:tc>
           <w:tcPr>
@@ -35018,7 +35018,7 @@
       </w:tr>
       <w:tr>
         <w:trPr>
-          <w:tblHeader w:val="false"/>
+          <w:tblHeader w:val="off"/>
         </w:trPr>
         <w:tc>
           <w:tcPr>
@@ -35151,7 +35151,7 @@
       </w:tr>
       <w:tr>
         <w:trPr>
-          <w:tblHeader w:val="false"/>
+          <w:tblHeader w:val="off"/>
         </w:trPr>
         <w:tc>
           <w:tcPr>
@@ -35284,7 +35284,7 @@
       </w:tr>
       <w:tr>
         <w:trPr>
-          <w:tblHeader w:val="false"/>
+          <w:tblHeader w:val="off"/>
         </w:trPr>
         <w:tc>
           <w:tcPr>
@@ -35417,7 +35417,7 @@
       </w:tr>
       <w:tr>
         <w:trPr>
-          <w:tblHeader w:val="false"/>
+          <w:tblHeader w:val="off"/>
         </w:trPr>
         <w:tc>
           <w:tcPr>
@@ -35550,7 +35550,7 @@
       </w:tr>
       <w:tr>
         <w:trPr>
-          <w:tblHeader w:val="false"/>
+          <w:tblHeader w:val="off"/>
         </w:trPr>
         <w:tc>
           <w:tcPr>
@@ -35683,7 +35683,7 @@
       </w:tr>
       <w:tr>
         <w:trPr>
-          <w:tblHeader w:val="false"/>
+          <w:tblHeader w:val="off"/>
         </w:trPr>
         <w:tc>
           <w:tcPr>
@@ -35816,7 +35816,7 @@
       </w:tr>
       <w:tr>
         <w:trPr>
-          <w:tblHeader w:val="false"/>
+          <w:tblHeader w:val="off"/>
         </w:trPr>
         <w:tc>
           <w:tcPr>
@@ -36062,7 +36062,7 @@
       </w:r>
     </w:p>
     <w:sectPr>
-      <w:footerReference w:type="default" r:id="rId7"/>
+      <w:footerReference w:type="default" r:id="rId6"/>
       <w:pgSz w:w="11906" w:h="16838" w:orient="portrait"/>
       <w:pgMar w:top="1134" w:right="1134" w:bottom="1134" w:left="1134" w:header="708" w:footer="708" w:gutter="0"/>
       <w:pgNumType/>
@@ -36071,10 +36071,6 @@
     </w:sectPr>
   </w:body>
 </w:document>
-</file>
-
-<file path=word/comments.xml><?xml version="1.0" encoding="utf-8"?>
-<w:comments xmlns:cx="http://schemas.microsoft.com/office/drawing/2014/chartex" xmlns:cx1="http://schemas.microsoft.com/office/drawing/2015/9/8/chartex" xmlns:cx2="http://schemas.microsoft.com/office/drawing/2015/10/21/chartex" xmlns:cx3="http://schemas.microsoft.com/office/drawing/2016/5/9/chartex" xmlns:cx4="http://schemas.microsoft.com/office/drawing/2016/5/10/chartex" xmlns:cx5="http://schemas.microsoft.com/office/drawing/2016/5/11/chartex" xmlns:cx6="http://schemas.microsoft.com/office/drawing/2016/5/12/chartex" xmlns:cx7="http://schemas.microsoft.com/office/drawing/2016/5/13/chartex" xmlns:cx8="http://schemas.microsoft.com/office/drawing/2016/5/14/chartex" xmlns:mc="http://schemas.openxmlformats.org/markup-compatibility/2006" xmlns:aink="http://schemas.microsoft.com/office/drawing/2016/ink" xmlns:am3d="http://schemas.microsoft.com/office/drawing/2017/model3d" xmlns:o="urn:schemas-microsoft-com:office:office" xmlns:r="http://schemas.openxmlformats.org/officeDocument/2006/relationships" xmlns:m="http://schemas.openxmlformats.org/officeDocument/2006/math" xmlns:v="urn:schemas-microsoft-com:vml" xmlns:wp14="http://schemas.microsoft.com/office/word/2010/wordprocessingDrawing" xmlns:wp="http://schemas.openxmlformats.org/drawingml/2006/wordprocessingDrawing" xmlns:w10="urn:schemas-microsoft-com:office:word" xmlns:w="http://schemas.openxmlformats.org/wordprocessingml/2006/main" xmlns:w14="http://schemas.microsoft.com/office/word/2010/wordml" xmlns:w15="http://schemas.microsoft.com/office/word/2012/wordml" xmlns:w16cex="http://schemas.microsoft.com/office/word/2018/wordml/cex" xmlns:w16cid="http://schemas.microsoft.com/office/word/2016/wordml/cid" xmlns:w16="http://schemas.microsoft.com/office/word/2018/wordml" xmlns:w16sdtdh="http://schemas.microsoft.com/office/word/2020/wordml/sdtdatahash" xmlns:w16se="http://schemas.microsoft.com/office/word/2015/wordml/symex" xmlns:wpg="http://schemas.microsoft.com/office/word/2010/wordprocessingGroup" xmlns:wpi="http://schemas.microsoft.com/office/word/2010/wordprocessingInk" xmlns:wne="http://schemas.microsoft.com/office/word/2006/wordml" xmlns:wps="http://schemas.microsoft.com/office/word/2010/wordprocessingShape"/>
 </file>
 
 <file path=word/endnotes.xml><?xml version="1.0" encoding="utf-8"?>
@@ -36128,14 +36124,86 @@
         <w:rtl/>
       </w:rPr>
       <w:t xml:space="preserve">עמוד </w:t>
+    </w:r>
+    <w:r>
+      <w:rPr>
+        <w:color w:val="808080"/>
+        <w:sz w:val="18"/>
+        <w:szCs w:val="18"/>
+        <w:rtl/>
+      </w:rPr>
       <w:fldChar w:fldCharType="begin"/>
+    </w:r>
+    <w:r>
+      <w:rPr>
+        <w:color w:val="808080"/>
+        <w:sz w:val="18"/>
+        <w:szCs w:val="18"/>
+        <w:rtl/>
+      </w:rPr>
       <w:instrText xml:space="preserve">PAGE</w:instrText>
+    </w:r>
+    <w:r>
+      <w:rPr>
+        <w:color w:val="808080"/>
+        <w:sz w:val="18"/>
+        <w:szCs w:val="18"/>
+        <w:rtl/>
+      </w:rPr>
       <w:fldChar w:fldCharType="separate"/>
+    </w:r>
+    <w:r>
+      <w:rPr>
+        <w:color w:val="808080"/>
+        <w:sz w:val="18"/>
+        <w:szCs w:val="18"/>
+        <w:rtl/>
+      </w:rPr>
       <w:fldChar w:fldCharType="end"/>
+    </w:r>
+    <w:r>
+      <w:rPr>
+        <w:color w:val="808080"/>
+        <w:sz w:val="18"/>
+        <w:szCs w:val="18"/>
+        <w:rtl/>
+      </w:rPr>
       <w:t xml:space="preserve"> מתוך </w:t>
+    </w:r>
+    <w:r>
+      <w:rPr>
+        <w:color w:val="808080"/>
+        <w:sz w:val="18"/>
+        <w:szCs w:val="18"/>
+        <w:rtl/>
+      </w:rPr>
       <w:fldChar w:fldCharType="begin"/>
+    </w:r>
+    <w:r>
+      <w:rPr>
+        <w:color w:val="808080"/>
+        <w:sz w:val="18"/>
+        <w:szCs w:val="18"/>
+        <w:rtl/>
+      </w:rPr>
       <w:instrText xml:space="preserve">NUMPAGES</w:instrText>
+    </w:r>
+    <w:r>
+      <w:rPr>
+        <w:color w:val="808080"/>
+        <w:sz w:val="18"/>
+        <w:szCs w:val="18"/>
+        <w:rtl/>
+      </w:rPr>
       <w:fldChar w:fldCharType="separate"/>
+    </w:r>
+    <w:r>
+      <w:rPr>
+        <w:color w:val="808080"/>
+        <w:sz w:val="18"/>
+        <w:szCs w:val="18"/>
+        <w:rtl/>
+      </w:rPr>
       <w:fldChar w:fldCharType="end"/>
     </w:r>
   </w:p>
@@ -36183,7 +36251,7 @@
 <w:numbering xmlns:wpc="http://schemas.microsoft.com/office/word/2010/wordprocessingCanvas" xmlns:mc="http://schemas.openxmlformats.org/markup-compatibility/2006" xmlns:o="urn:schemas-microsoft-com:office:office" xmlns:r="http://schemas.openxmlformats.org/officeDocument/2006/relationships" xmlns:m="http://schemas.openxmlformats.org/officeDocument/2006/math" xmlns:v="urn:schemas-microsoft-com:vml" xmlns:wp14="http://schemas.microsoft.com/office/word/2010/wordprocessingDrawing" xmlns:wp="http://schemas.openxmlformats.org/drawingml/2006/wordprocessingDrawing" xmlns:w10="urn:schemas-microsoft-com:office:word" xmlns:w="http://schemas.openxmlformats.org/wordprocessingml/2006/main" xmlns:w14="http://schemas.microsoft.com/office/word/2010/wordml" xmlns:w15="http://schemas.microsoft.com/office/word/2012/wordml" xmlns:wpg="http://schemas.microsoft.com/office/word/2010/wordprocessingGroup" xmlns:wpi="http://schemas.microsoft.com/office/word/2010/wordprocessingInk" xmlns:wne="http://schemas.microsoft.com/office/word/2006/wordml" xmlns:wps="http://schemas.microsoft.com/office/word/2010/wordprocessingShape" mc:Ignorable="w14 w15 wp14">
   <w:abstractNum w:abstractNumId="1" w15:restartNumberingAfterBreak="0">
     <w:multiLevelType w:val="hybridMultilevel"/>
-    <w:lvl w:ilvl="0" w15:tentative="1">
+    <w:lvl w:ilvl="0" w:tentative="1">
       <w:start w:val="1"/>
       <w:numFmt w:val="bullet"/>
       <w:lvlText w:val="●"/>
@@ -36192,7 +36260,7 @@
         <w:ind w:left="720" w:hanging="360"/>
       </w:pPr>
     </w:lvl>
-    <w:lvl w:ilvl="1" w15:tentative="1">
+    <w:lvl w:ilvl="1" w:tentative="1">
       <w:start w:val="1"/>
       <w:numFmt w:val="bullet"/>
       <w:lvlText w:val="○"/>
@@ -36201,7 +36269,7 @@
         <w:ind w:left="1440" w:hanging="360"/>
       </w:pPr>
     </w:lvl>
-    <w:lvl w:ilvl="2" w15:tentative="1">
+    <w:lvl w:ilvl="2" w:tentative="1">
       <w:start w:val="1"/>
       <w:numFmt w:val="bullet"/>
       <w:lvlText w:val="■"/>
@@ -36210,7 +36278,7 @@
         <w:ind w:left="2160" w:hanging="360"/>
       </w:pPr>
     </w:lvl>
-    <w:lvl w:ilvl="3" w15:tentative="1">
+    <w:lvl w:ilvl="3" w:tentative="1">
       <w:start w:val="1"/>
       <w:numFmt w:val="bullet"/>
       <w:lvlText w:val="●"/>
@@ -36219,7 +36287,7 @@
         <w:ind w:left="2880" w:hanging="360"/>
       </w:pPr>
     </w:lvl>
-    <w:lvl w:ilvl="4" w15:tentative="1">
+    <w:lvl w:ilvl="4" w:tentative="1">
       <w:start w:val="1"/>
       <w:numFmt w:val="bullet"/>
       <w:lvlText w:val="○"/>
@@ -36228,7 +36296,7 @@
         <w:ind w:left="3600" w:hanging="360"/>
       </w:pPr>
     </w:lvl>
-    <w:lvl w:ilvl="5" w15:tentative="1">
+    <w:lvl w:ilvl="5" w:tentative="1">
       <w:start w:val="1"/>
       <w:numFmt w:val="bullet"/>
       <w:lvlText w:val="■"/>
@@ -36237,7 +36305,7 @@
         <w:ind w:left="4320" w:hanging="360"/>
       </w:pPr>
     </w:lvl>
-    <w:lvl w:ilvl="6" w15:tentative="1">
+    <w:lvl w:ilvl="6" w:tentative="1">
       <w:start w:val="1"/>
       <w:numFmt w:val="bullet"/>
       <w:lvlText w:val="●"/>
@@ -36246,7 +36314,7 @@
         <w:ind w:left="5040" w:hanging="360"/>
       </w:pPr>
     </w:lvl>
-    <w:lvl w:ilvl="7" w15:tentative="1">
+    <w:lvl w:ilvl="7" w:tentative="1">
       <w:start w:val="1"/>
       <w:numFmt w:val="bullet"/>
       <w:lvlText w:val="●"/>
@@ -36255,7 +36323,7 @@
         <w:ind w:left="5760" w:hanging="360"/>
       </w:pPr>
     </w:lvl>
-    <w:lvl w:ilvl="8" w15:tentative="1">
+    <w:lvl w:ilvl="8" w:tentative="1">
       <w:start w:val="1"/>
       <w:numFmt w:val="bullet"/>
       <w:lvlText w:val="●"/>
@@ -36267,20 +36335,20 @@
   </w:abstractNum>
   <w:abstractNum w:abstractNumId="2" w15:restartNumberingAfterBreak="0">
     <w:multiLevelType w:val="hybridMultilevel"/>
-    <w:lvl w:ilvl="0" w15:tentative="1">
+    <w:lvl w:ilvl="0" w:tentative="1">
       <w:start w:val="1"/>
       <w:numFmt w:val="bullet"/>
       <w:lvlText w:val="•"/>
-      <w:lvlJc w:val="start"/>
+      <w:lvlJc w:val="left"/>
       <w:pPr>
         <w:ind w:start="540" w:hanging="270"/>
       </w:pPr>
     </w:lvl>
-    <w:lvl w:ilvl="1" w15:tentative="1">
+    <w:lvl w:ilvl="1" w:tentative="1">
       <w:start w:val="1"/>
       <w:numFmt w:val="bullet"/>
       <w:lvlText w:val="◦"/>
-      <w:lvlJc w:val="start"/>
+      <w:lvlJc w:val="left"/>
       <w:pPr>
         <w:ind w:start="1080" w:hanging="270"/>
       </w:pPr>
@@ -36288,11 +36356,11 @@
   </w:abstractNum>
   <w:abstractNum w:abstractNumId="3" w15:restartNumberingAfterBreak="0">
     <w:multiLevelType w:val="hybridMultilevel"/>
-    <w:lvl w:ilvl="0" w15:tentative="1">
+    <w:lvl w:ilvl="0" w:tentative="1">
       <w:start w:val="1"/>
       <w:numFmt w:val="decimal"/>
       <w:lvlText w:val="%1."/>
-      <w:lvlJc w:val="start"/>
+      <w:lvlJc w:val="left"/>
       <w:pPr>
         <w:ind w:start="540" w:hanging="360"/>
       </w:pPr>
@@ -36325,6 +36393,9 @@
   <w:num w:numId="5">
     <w:abstractNumId w:val="2"/>
     <w:lvlOverride w:ilvl="0">
+      <w:startOverride w:val="1"/>
+    </w:lvlOverride>
+    <w:lvlOverride w:ilvl="1">
       <w:startOverride w:val="1"/>
     </w:lvlOverride>
   </w:num>
@@ -36366,37 +36437,24 @@
       </w:pPr>
     </w:pPrDefault>
   </w:docDefaults>
-  <w:style w:type="paragraph" w:styleId="Title">
-    <w:name w:val="Title"/>
-    <w:basedOn w:val="Normal"/>
-    <w:next w:val="Normal"/>
+  <w:style w:type="paragraph" w:styleId="Normal" w:default="1">
+    <w:name w:val="Normal"/>
     <w:qFormat/>
-    <w:rPr>
-      <w:sz w:val="56"/>
-      <w:szCs w:val="56"/>
-    </w:rPr>
   </w:style>
-  <w:style w:type="paragraph" w:styleId="Heading1">
-    <w:name w:val="Heading 1"/>
-    <w:basedOn w:val="Normal"/>
-    <w:next w:val="Normal"/>
-    <w:qFormat/>
-    <w:rPr>
-      <w:color w:val="2E74B5"/>
-      <w:sz w:val="32"/>
-      <w:szCs w:val="32"/>
-    </w:rPr>
-  </w:style>
-  <w:style w:type="paragraph" w:styleId="Heading2">
-    <w:name w:val="Heading 2"/>
-    <w:basedOn w:val="Normal"/>
-    <w:next w:val="Normal"/>
-    <w:qFormat/>
-    <w:rPr>
-      <w:color w:val="2E74B5"/>
-      <w:sz w:val="26"/>
-      <w:szCs w:val="26"/>
-    </w:rPr>
+  <w:style w:type="table" w:styleId="TableNormal" w:default="true">
+    <w:name w:val="Normal Table"/>
+    <w:uiPriority w:val="99"/>
+    <w:semiHidden/>
+    <w:unhideWhenUsed/>
+    <w:tblPr>
+      <w:tblInd w:type="dxa" w:w="0"/>
+      <w:tblCellMar>
+        <w:top w:type="dxa" w:w="0"/>
+        <w:left w:type="dxa" w:w="108"/>
+        <w:bottom w:type="dxa" w:w="0"/>
+        <w:right w:type="dxa" w:w="108"/>
+      </w:tblCellMar>
+    </w:tblPr>
   </w:style>
   <w:style w:type="paragraph" w:styleId="Heading3">
     <w:name w:val="Heading 3"/>
@@ -36452,6 +36510,139 @@
     <w:name w:val="List Paragraph"/>
     <w:basedOn w:val="Normal"/>
     <w:qFormat/>
+  </w:style>
+  <w:style w:type="paragraph" w:styleId="Caption">
+    <w:name w:val="caption"/>
+    <w:basedOn w:val="Normal"/>
+    <w:next w:val="Normal"/>
+    <w:uiPriority w:val="35"/>
+    <w:semiHidden/>
+    <w:unhideWhenUsed/>
+    <w:qFormat/>
+    <w:pPr>
+      <w:spacing w:after="200"/>
+    </w:pPr>
+    <w:rPr>
+      <w:i/>
+      <w:iCs/>
+      <w:color w:val="44546A" w:themeColor="dark2"/>
+      <w:sz w:val="18"/>
+      <w:szCs w:val="18"/>
+    </w:rPr>
+  </w:style>
+  <w:style w:type="paragraph" w:styleId="Bibliography">
+    <w:name w:val="Bibliography"/>
+    <w:basedOn w:val="Normal"/>
+    <w:next w:val="Normal"/>
+    <w:uiPriority w:val="37"/>
+    <w:unhideWhenUsed/>
+  </w:style>
+  <w:style w:type="paragraph" w:styleId="TOC1">
+    <w:name w:val="toc 1"/>
+    <w:basedOn w:val="Normal"/>
+    <w:next w:val="Normal"/>
+    <w:uiPriority w:val="39"/>
+    <w:semiHidden/>
+    <w:unhideWhenUsed/>
+    <w:pPr>
+      <w:spacing w:after="100"/>
+    </w:pPr>
+  </w:style>
+  <w:style w:type="paragraph" w:styleId="TOC2">
+    <w:name w:val="toc 2"/>
+    <w:basedOn w:val="Normal"/>
+    <w:next w:val="Normal"/>
+    <w:uiPriority w:val="39"/>
+    <w:semiHidden/>
+    <w:unhideWhenUsed/>
+    <w:pPr>
+      <w:spacing w:after="100"/>
+      <w:ind w:left="210"/>
+    </w:pPr>
+  </w:style>
+  <w:style w:type="paragraph" w:styleId="TOC3">
+    <w:name w:val="toc 3"/>
+    <w:basedOn w:val="Normal"/>
+    <w:next w:val="Normal"/>
+    <w:uiPriority w:val="39"/>
+    <w:semiHidden/>
+    <w:unhideWhenUsed/>
+    <w:pPr>
+      <w:spacing w:after="100"/>
+      <w:ind w:left="420"/>
+    </w:pPr>
+  </w:style>
+  <w:style w:type="paragraph" w:styleId="TOC4">
+    <w:name w:val="toc 4"/>
+    <w:basedOn w:val="Normal"/>
+    <w:next w:val="Normal"/>
+    <w:uiPriority w:val="39"/>
+    <w:semiHidden/>
+    <w:unhideWhenUsed/>
+    <w:pPr>
+      <w:spacing w:after="100"/>
+      <w:ind w:left="630"/>
+    </w:pPr>
+  </w:style>
+  <w:style w:type="paragraph" w:styleId="TOC5">
+    <w:name w:val="toc 5"/>
+    <w:basedOn w:val="Normal"/>
+    <w:next w:val="Normal"/>
+    <w:uiPriority w:val="39"/>
+    <w:semiHidden/>
+    <w:unhideWhenUsed/>
+    <w:pPr>
+      <w:spacing w:after="100"/>
+      <w:ind w:left="840"/>
+    </w:pPr>
+  </w:style>
+  <w:style w:type="paragraph" w:styleId="TOC6">
+    <w:name w:val="toc 6"/>
+    <w:basedOn w:val="Normal"/>
+    <w:next w:val="Normal"/>
+    <w:uiPriority w:val="39"/>
+    <w:semiHidden/>
+    <w:unhideWhenUsed/>
+    <w:pPr>
+      <w:spacing w:after="100"/>
+      <w:ind w:left="1050"/>
+    </w:pPr>
+  </w:style>
+  <w:style w:type="paragraph" w:styleId="TOC7">
+    <w:name w:val="toc 7"/>
+    <w:basedOn w:val="Normal"/>
+    <w:next w:val="Normal"/>
+    <w:uiPriority w:val="39"/>
+    <w:semiHidden/>
+    <w:unhideWhenUsed/>
+    <w:pPr>
+      <w:spacing w:after="100"/>
+      <w:ind w:left="1260"/>
+    </w:pPr>
+  </w:style>
+  <w:style w:type="paragraph" w:styleId="TOC8">
+    <w:name w:val="toc 8"/>
+    <w:basedOn w:val="Normal"/>
+    <w:next w:val="Normal"/>
+    <w:uiPriority w:val="39"/>
+    <w:semiHidden/>
+    <w:unhideWhenUsed/>
+    <w:pPr>
+      <w:spacing w:after="100"/>
+      <w:ind w:left="1470"/>
+    </w:pPr>
+  </w:style>
+  <w:style w:type="paragraph" w:styleId="TOC9">
+    <w:name w:val="toc 9"/>
+    <w:basedOn w:val="Normal"/>
+    <w:next w:val="Normal"/>
+    <w:uiPriority w:val="39"/>
+    <w:semiHidden/>
+    <w:unhideWhenUsed/>
+    <w:pPr>
+      <w:spacing w:after="100"/>
+      <w:ind w:left="1680"/>
+    </w:pPr>
   </w:style>
   <w:style w:type="character" w:styleId="Hyperlink">
     <w:name w:val="Hyperlink"/>
@@ -36537,6 +36728,13 @@
       <w:szCs w:val="20"/>
     </w:rPr>
   </w:style>
+  <w:style w:type="character" w:styleId="LineNumber">
+    <w:name w:val="line number"/>
+    <w:basedOn w:val="DefaultParagraphFont"/>
+    <w:uiPriority w:val="99"/>
+    <w:semiHidden/>
+    <w:unhideWhenUsed/>
+  </w:style>
   <w:style w:type="paragraph" w:styleId="Title">
     <w:name w:val="Title"/>
     <w:basedOn w:val="Normal"/>
@@ -36593,4 +36791,294 @@
     </w:rPr>
   </w:style>
 </w:styles>
+</file>
+
+<file path=word/theme/theme1.xml><?xml version="1.0" encoding="utf-8"?>
+<a:theme xmlns:a="http://schemas.openxmlformats.org/drawingml/2006/main" name="Office Theme">
+  <a:themeElements>
+    <a:clrScheme name="Office">
+      <a:dk1>
+        <a:sysClr val="windowText" lastClr="000000"/>
+      </a:dk1>
+      <a:lt1>
+        <a:sysClr val="window" lastClr="FFFFFF"/>
+      </a:lt1>
+      <a:dk2>
+        <a:srgbClr val="44546A"/>
+      </a:dk2>
+      <a:lt2>
+        <a:srgbClr val="E7E6E6"/>
+      </a:lt2>
+      <a:accent1>
+        <a:srgbClr val="4472C4"/>
+      </a:accent1>
+      <a:accent2>
+        <a:srgbClr val="ED7D31"/>
+      </a:accent2>
+      <a:accent3>
+        <a:srgbClr val="A5A5A5"/>
+      </a:accent3>
+      <a:accent4>
+        <a:srgbClr val="FFC000"/>
+      </a:accent4>
+      <a:accent5>
+        <a:srgbClr val="5B9BD5"/>
+      </a:accent5>
+      <a:accent6>
+        <a:srgbClr val="70AD47"/>
+      </a:accent6>
+      <a:hlink>
+        <a:srgbClr val="0563C1"/>
+      </a:hlink>
+      <a:folHlink>
+        <a:srgbClr val="954F72"/>
+      </a:folHlink>
+    </a:clrScheme>
+    <a:fontScheme name="Office">
+      <a:majorFont>
+        <a:latin typeface="Calibri Light" panose="020F0302020204030204"/>
+        <a:ea typeface=""/>
+        <a:cs typeface=""/>
+        <a:font script="Jpan" typeface="游ゴシック Light"/>
+        <a:font script="Hang" typeface="맑은 고딕"/>
+        <a:font script="Hans" typeface="等线 Light"/>
+        <a:font script="Hant" typeface="新細明體"/>
+        <a:font script="Arab" typeface="Times New Roman"/>
+        <a:font script="Hebr" typeface="Times New Roman"/>
+        <a:font script="Thai" typeface="Angsana New"/>
+        <a:font script="Ethi" typeface="Nyala"/>
+        <a:font script="Beng" typeface="Vrinda"/>
+        <a:font script="Gujr" typeface="Shruti"/>
+        <a:font script="Khmr" typeface="MoolBoran"/>
+        <a:font script="Knda" typeface="Tunga"/>
+        <a:font script="Guru" typeface="Raavi"/>
+        <a:font script="Cans" typeface="Euphemia"/>
+        <a:font script="Cher" typeface="Plantagenet Cherokee"/>
+        <a:font script="Yiii" typeface="Microsoft Yi Baiti"/>
+        <a:font script="Tibt" typeface="Microsoft Himalaya"/>
+        <a:font script="Thaa" typeface="MV Boli"/>
+        <a:font script="Deva" typeface="Mangal"/>
+        <a:font script="Telu" typeface="Gautami"/>
+        <a:font script="Taml" typeface="Latha"/>
+        <a:font script="Syrc" typeface="Estrangelo Edessa"/>
+        <a:font script="Orya" typeface="Kalinga"/>
+        <a:font script="Mlym" typeface="Kartika"/>
+        <a:font script="Laoo" typeface="DokChampa"/>
+        <a:font script="Sinh" typeface="Iskoola Pota"/>
+        <a:font script="Mong" typeface="Mongolian Baiti"/>
+        <a:font script="Viet" typeface="Times New Roman"/>
+        <a:font script="Uigh" typeface="Microsoft Uighur"/>
+        <a:font script="Geor" typeface="Sylfaen"/>
+        <a:font script="Armn" typeface="Arial"/>
+        <a:font script="Bugi" typeface="Leelawadee UI"/>
+        <a:font script="Bopo" typeface="Microsoft JhengHei"/>
+        <a:font script="Java" typeface="Javanese Text"/>
+        <a:font script="Lisu" typeface="Segoe UI"/>
+        <a:font script="Mymr" typeface="Myanmar Text"/>
+        <a:font script="Nkoo" typeface="Ebrima"/>
+        <a:font script="Olck" typeface="Nirmala UI"/>
+        <a:font script="Osma" typeface="Ebrima"/>
+        <a:font script="Phag" typeface="Phagspa"/>
+        <a:font script="Syrn" typeface="Estrangelo Edessa"/>
+        <a:font script="Syrj" typeface="Estrangelo Edessa"/>
+        <a:font script="Syre" typeface="Estrangelo Edessa"/>
+        <a:font script="Sora" typeface="Nirmala UI"/>
+        <a:font script="Tale" typeface="Microsoft Tai Le"/>
+        <a:font script="Talu" typeface="Microsoft New Tai Lue"/>
+        <a:font script="Tfng" typeface="Ebrima"/>
+      </a:majorFont>
+      <a:minorFont>
+        <a:latin typeface="Calibri" panose="020F0502020204030204"/>
+        <a:ea typeface=""/>
+        <a:cs typeface=""/>
+        <a:font script="Jpan" typeface="游明朝"/>
+        <a:font script="Hang" typeface="맑은 고딕"/>
+        <a:font script="Hans" typeface="等线"/>
+        <a:font script="Hant" typeface="新細明體"/>
+        <a:font script="Arab" typeface="Arial"/>
+        <a:font script="Hebr" typeface="Arial"/>
+        <a:font script="Thai" typeface="Cordia New"/>
+        <a:font script="Ethi" typeface="Nyala"/>
+        <a:font script="Beng" typeface="Vrinda"/>
+        <a:font script="Gujr" typeface="Shruti"/>
+        <a:font script="Khmr" typeface="DaunPenh"/>
+        <a:font script="Knda" typeface="Tunga"/>
+        <a:font script="Guru" typeface="Raavi"/>
+        <a:font script="Cans" typeface="Euphemia"/>
+        <a:font script="Cher" typeface="Plantagenet Cherokee"/>
+        <a:font script="Yiii" typeface="Microsoft Yi Baiti"/>
+        <a:font script="Tibt" typeface="Microsoft Himalaya"/>
+        <a:font script="Thaa" typeface="MV Boli"/>
+        <a:font script="Deva" typeface="Mangal"/>
+        <a:font script="Telu" typeface="Gautami"/>
+        <a:font script="Taml" typeface="Latha"/>
+        <a:font script="Syrc" typeface="Estrangelo Edessa"/>
+        <a:font script="Orya" typeface="Kalinga"/>
+        <a:font script="Mlym" typeface="Kartika"/>
+        <a:font script="Laoo" typeface="DokChampa"/>
+        <a:font script="Sinh" typeface="Iskoola Pota"/>
+        <a:font script="Mong" typeface="Mongolian Baiti"/>
+        <a:font script="Viet" typeface="Arial"/>
+        <a:font script="Uigh" typeface="Microsoft Uighur"/>
+        <a:font script="Geor" typeface="Sylfaen"/>
+        <a:font script="Armn" typeface="Arial"/>
+        <a:font script="Bugi" typeface="Leelawadee UI"/>
+        <a:font script="Bopo" typeface="Microsoft JhengHei"/>
+        <a:font script="Java" typeface="Javanese Text"/>
+        <a:font script="Lisu" typeface="Segoe UI"/>
+        <a:font script="Mymr" typeface="Myanmar Text"/>
+        <a:font script="Nkoo" typeface="Ebrima"/>
+        <a:font script="Olck" typeface="Nirmala UI"/>
+        <a:font script="Osma" typeface="Ebrima"/>
+        <a:font script="Phag" typeface="Phagspa"/>
+        <a:font script="Syrn" typeface="Estrangelo Edessa"/>
+        <a:font script="Syrj" typeface="Estrangelo Edessa"/>
+        <a:font script="Syre" typeface="Estrangelo Edessa"/>
+        <a:font script="Sora" typeface="Nirmala UI"/>
+        <a:font script="Tale" typeface="Microsoft Tai Le"/>
+        <a:font script="Talu" typeface="Microsoft New Tai Lue"/>
+        <a:font script="Tfng" typeface="Ebrima"/>
+      </a:minorFont>
+    </a:fontScheme>
+    <a:fmtScheme name="Office">
+      <a:fillStyleLst>
+        <a:solidFill>
+          <a:schemeClr val="phClr"/>
+        </a:solidFill>
+        <a:gradFill rotWithShape="true">
+          <a:gsLst>
+            <a:gs pos="0">
+              <a:schemeClr val="phClr">
+                <a:lumMod val="110000"/>
+                <a:satMod val="105000"/>
+                <a:tint val="67000"/>
+              </a:schemeClr>
+            </a:gs>
+            <a:gs pos="50000">
+              <a:schemeClr val="phClr">
+                <a:lumMod val="105000"/>
+                <a:satMod val="103000"/>
+                <a:tint val="73000"/>
+              </a:schemeClr>
+            </a:gs>
+            <a:gs pos="100000">
+              <a:schemeClr val="phClr">
+                <a:lumMod val="105000"/>
+                <a:satMod val="109000"/>
+                <a:tint val="81000"/>
+              </a:schemeClr>
+            </a:gs>
+          </a:gsLst>
+          <a:lin ang="5400000" scaled="false"/>
+        </a:gradFill>
+        <a:gradFill rotWithShape="true">
+          <a:gsLst>
+            <a:gs pos="0">
+              <a:schemeClr val="phClr">
+                <a:satMod val="103000"/>
+                <a:lumMod val="102000"/>
+                <a:tint val="94000"/>
+              </a:schemeClr>
+            </a:gs>
+            <a:gs pos="50000">
+              <a:schemeClr val="phClr">
+                <a:satMod val="110000"/>
+                <a:lumMod val="100000"/>
+                <a:shade val="100000"/>
+              </a:schemeClr>
+            </a:gs>
+            <a:gs pos="100000">
+              <a:schemeClr val="phClr">
+                <a:lumMod val="99000"/>
+                <a:satMod val="120000"/>
+                <a:shade val="78000"/>
+              </a:schemeClr>
+            </a:gs>
+          </a:gsLst>
+          <a:lin ang="5400000" scaled="false"/>
+        </a:gradFill>
+      </a:fillStyleLst>
+      <a:lnStyleLst>
+        <a:ln w="6350" cap="flat" cmpd="sng" algn="ctr">
+          <a:solidFill>
+            <a:schemeClr val="phClr"/>
+          </a:solidFill>
+          <a:prstDash val="solid"/>
+          <a:miter lim="800000"/>
+        </a:ln>
+        <a:ln w="12700" cap="flat" cmpd="sng" algn="ctr">
+          <a:solidFill>
+            <a:schemeClr val="phClr"/>
+          </a:solidFill>
+          <a:prstDash val="solid"/>
+          <a:miter lim="800000"/>
+        </a:ln>
+        <a:ln w="19050" cap="flat" cmpd="sng" algn="ctr">
+          <a:solidFill>
+            <a:schemeClr val="phClr"/>
+          </a:solidFill>
+          <a:prstDash val="solid"/>
+          <a:miter lim="800000"/>
+        </a:ln>
+      </a:lnStyleLst>
+      <a:effectStyleLst>
+        <a:effectStyle>
+          <a:effectLst/>
+        </a:effectStyle>
+        <a:effectStyle>
+          <a:effectLst/>
+        </a:effectStyle>
+        <a:effectStyle>
+          <a:effectLst>
+            <a:outerShdw blurRad="57150" dist="19050" dir="5400000" algn="ctr" rotWithShape="false">
+              <a:srgbClr val="000000">
+                <a:alpha val="63000"/>
+              </a:srgbClr>
+            </a:outerShdw>
+          </a:effectLst>
+        </a:effectStyle>
+      </a:effectStyleLst>
+      <a:bgFillStyleLst>
+        <a:solidFill>
+          <a:schemeClr val="phClr"/>
+        </a:solidFill>
+        <a:solidFill>
+          <a:schemeClr val="phClr">
+            <a:tint val="95000"/>
+            <a:satMod val="170000"/>
+          </a:schemeClr>
+        </a:solidFill>
+        <a:gradFill rotWithShape="true">
+          <a:gsLst>
+            <a:gs pos="0">
+              <a:schemeClr val="phClr">
+                <a:tint val="93000"/>
+                <a:satMod val="150000"/>
+                <a:shade val="98000"/>
+                <a:lumMod val="102000"/>
+              </a:schemeClr>
+            </a:gs>
+            <a:gs pos="50000">
+              <a:schemeClr val="phClr">
+                <a:tint val="98000"/>
+                <a:satMod val="130000"/>
+                <a:shade val="90000"/>
+                <a:lumMod val="103000"/>
+              </a:schemeClr>
+            </a:gs>
+            <a:gs pos="100000">
+              <a:schemeClr val="phClr">
+                <a:shade val="63000"/>
+                <a:satMod val="120000"/>
+              </a:schemeClr>
+            </a:gs>
+          </a:gsLst>
+          <a:lin ang="5400000" scaled="false"/>
+        </a:gradFill>
+      </a:bgFillStyleLst>
+    </a:fmtScheme>
+  </a:themeElements>
+  <a:objectDefaults/>
+  <a:extraClrSchemeLst/>
+</a:theme>
 </file>
</xml_diff>

<commit_message>
Mark Q7 closed: consultant agreement signed, data access in place
The consultant work order was the only item blocking the start. It was
signed on 2026-10-25 and the consultant has data access, so nothing
blocks the start now.

- Decisions note: item 1 marked closed and listed under closed items;
  item 7 no longer tied to item 1.
- Hub note: the blocker line now says the agreement is signed.
- Full MVP: chapter 17 intro and the Q7 row, the chapter 14 "immediate"
  row, and the first "do now" item in the summary. Rebuilt .docx and .pdf.

Co-Authored-By: Claude Opus 5.5 <noreply@anthropic.com>
Claude-Session: https://claude.ai/code/session_019yE3185nTUSCyJBoGaH1r1
</commit_message>
<xml_diff>
--- a/docs/MVP-Support-Control-Tower.docx
+++ b/docs/MVP-Support-Control-Tower.docx
@@ -1108,7 +1108,7 @@
           <w:rFonts w:ascii="Arial" w:cs="Arial" w:eastAsia="Arial" w:hAnsi="Arial"/>
           <w:rtl/>
         </w:rPr>
-        <w:t xml:space="preserve"> הוא יעבוד עם נתונים שמקורם ב-Salesforce, ולכן צריך הסכם גישה (BAA/NDA) או פיתוח על נתונים מוסווים. בהזמנת העבודה צריך לכתוב דרישות העברה ל-IT (13.4), אחרת IT יקבל מערכת שהוא לא יודע לתחזק.</w:t>
+        <w:t xml:space="preserve"> (נחתמה ב-2026-10-25, ויש ליועץ גישה לנתונים.) הוא יעבוד עם נתונים שמקורם ב-Salesforce, ולכן צריך הסכם גישה (BAA/NDA) או פיתוח על נתונים מוסווים. בהזמנת העבודה צריך לכתוב דרישות העברה ל-IT (13.4), אחרת IT יקבל מערכת שהוא לא יודע לתחזק.</w:t>
       </w:r>
     </w:p>
     <w:p>
@@ -30888,7 +30888,7 @@
                 <w:szCs w:val="19"/>
                 <w:rtl/>
               </w:rPr>
-              <w:t xml:space="preserve">הזמנת עבודה ליועץ שנבחר</w:t>
+              <w:t xml:space="preserve">הזמנת עבודה ליועץ שנבחר (נחתמה ב-2026-10-25)</w:t>
             </w:r>
           </w:p>
         </w:tc>
@@ -34449,7 +34449,7 @@
           <w:rFonts w:ascii="Arial" w:cs="Arial" w:eastAsia="Arial" w:hAnsi="Arial"/>
           <w:rtl/>
         </w:rPr>
-        <w:t xml:space="preserve">רק Q7, ההסכם עם היועץ, חוסמת את תחילת העבודה: בלי הזמנת עבודה חתומה היועץ לא מתחיל. שאר הנקודות לא חוסמות. כל אחת משויכת למשימה בפרק 13.</w:t>
+        <w:t xml:space="preserve">Q7, ההסכם עם היועץ, הייתה הנקודה היחידה שחסמה את תחילת העבודה. היא נסגרה ב-2026-10-25: ההסכם נחתם, ויש ליועץ גישה לנתונים. שאר הנקודות לא חוסמות. כל אחת משויכת למשימה בפרק 13.</w:t>
       </w:r>
     </w:p>
     <w:tbl>
@@ -35479,7 +35479,18 @@
                 <w:szCs w:val="19"/>
                 <w:rtl/>
               </w:rPr>
-              <w:t xml:space="preserve">ההסכם עם היועץ (גישה לנתונים, העברה ל-IT)</w:t>
+              <w:t xml:space="preserve">ההסכם עם היועץ (גישה לנתונים, העברה ל-IT). </w:t>
+            </w:r>
+            <w:r>
+              <w:rPr>
+                <w:rFonts w:ascii="Arial" w:cs="Arial" w:eastAsia="Arial" w:hAnsi="Arial"/>
+                <w:b/>
+                <w:bCs/>
+                <w:sz w:val="19"/>
+                <w:szCs w:val="19"/>
+                <w:rtl/>
+              </w:rPr>
+              <w:t xml:space="preserve">נסגר 2026-10-25</w:t>
             </w:r>
           </w:p>
         </w:tc>

</xml_diff>